<commit_message>
agrega afiliación y profesor bajo los autores del informe
</commit_message>
<xml_diff>
--- a/report/Informe_Taller1_IEEE.docx
+++ b/report/Informe_Taller1_IEEE.docx
@@ -33,9 +33,26 @@
       <w:pPr>
         <w:pStyle w:val="Authors"/>
         <w:framePr w:wrap="notBeside"/>
+        <w:spacing w:after="0"/>
       </w:pPr>
       <w:r>
         <w:t>Daniel Sebastian Velasco Munar y Andrea Barraza</w:t>
+      </w:r>
+    </w:p>
+    <w:p>
+      <w:pPr>
+        <w:pStyle w:val="Authors"/>
+        <w:framePr w:wrap="notBeside"/>
+        <w:spacing w:after="100"/>
+      </w:pPr>
+      <w:r>
+        <w:rPr>
+          <w:i/>
+          <w:iCs/>
+          <w:sz w:val="18"/>
+          <w:szCs w:val="18"/>
+        </w:rPr>
+        <w:t>Maestría en Inteligencia Artificial, Pontificia Universidad Javeriana · Aprendizaje Profundo · Profesor: Andrés Moreno</w:t>
       </w:r>
     </w:p>
     <w:p>
@@ -9820,7 +9837,7 @@
         <w:t>T</w:t>
       </w:r>
       <w:r>
-        <w:t>rabajo presentado el 26 de septiembre de 2026 como entrega del Taller 1 del curso Aprendizaje Profundo (periodo 202630) de la Maestría en Inteligencia Artificial de la Pontificia Universidad Javeriana. Profesor: Andrés Moreno Barbosa.</w:t>
+        <w:t>rabajo presentado el 26 de septiembre de 2026 como entrega del Taller 1 del curso Aprendizaje Profundo (periodo 202630) de la Maestría en Inteligencia Artificial de la Pontificia Universidad Javeriana. Profesor: Andrés Moreno.</w:t>
       </w:r>
     </w:p>
     <w:p>

</xml_diff>

<commit_message>
agrega el bono con EfficientNetV2-B0 al informe
</commit_message>
<xml_diff>
--- a/report/Informe_Taller1_IEEE.docx
+++ b/report/Informe_Taller1_IEEE.docx
@@ -62,15 +62,11 @@
       <w:r>
         <w:rPr>
           <w:i/>
-          <w:iCs/>
-        </w:rPr>
-        <w:t>Resumen</w:t>
-      </w:r>
-      <w:r>
-        <w:rPr>
-          <w:iCs/>
-        </w:rPr>
-        <w:t>—Este trabajo aborda dos problemas de aprendizaje profundo con un mismo principio metodológico: seleccionar todo con un conjunto de validación, usar el conjunto de prueba una sola vez y leer cada resultado frente a una referencia sencilla. En el primero se pronostican las siguientes 24 horas de temperatura en la estación 62548002 de MeteoNet, en la costa norte de Francia, a partir de las 168 horas previas de doce variables meteorológicas y de calendario. Una búsqueda por etapas de 18 configuraciones mostró que una red recurrente simple de 32 unidades y 2 232 parámetros supera a las celdas GRU y LSTM, que sobreajustan en pocas épocas. Sobre el 30 % final de la serie el modelo obtiene un error absoluto medio de 1.60 °C, 24.7 % menos que la mejor línea base, que repite la temperatura del día anterior, y le gana en los 24 horizontes. En el segundo se clasifican las diez clases de Fashion-MNIST con tres aproximaciones entrenadas bajo la misma partición, semilla, lotes y criterios de parada: una red convolucional diseñada desde cero, VGG16 con filtros de ImageNet y MobileNetV2 con aprendizaje por transferencia. VGG16 alcanza una exactitud de 93.19 %, MobileNetV2 de 92.43 % y la red propia de 89.04 %. Los intervalos de confianza de las dos redes preentrenadas se solapan, y MobileNetV2 entrena ocho veces más rápido con 6.5 veces menos parámetros, por lo que resulta la opción más equilibrada. En ambos problemas la capacidad adicional no se tradujo en mejor generalización, y el error remanente se explica más por la información disponible que por la arquitectura.</w:t>
+        </w:rPr>
+        <w:t xml:space="preserve">Resumen</w:t>
+      </w:r>
+      <w:r>
+        <w:t xml:space="preserve">—Este trabajo aborda dos problemas de aprendizaje profundo con un mismo principio metodológico: seleccionar todo con un conjunto de validación, usar el conjunto de prueba una sola vez y leer cada resultado frente a una referencia sencilla. En el primero se pronostican las siguientes 24 horas de temperatura en la estación 62548002 de MeteoNet, en la costa norte de Francia, a partir de las 168 horas previas de doce variables meteorológicas y de calendario. Una búsqueda por etapas de 18 configuraciones mostró que una red recurrente simple de 32 unidades y 2 232 parámetros supera a las celdas GRU y LSTM, que sobreajustan en pocas épocas. Sobre el 30 % final de la serie el modelo obtiene un error absoluto medio de 1.60 °C, 24.7 % menos que la mejor línea base, que repite la temperatura del día anterior, y le gana en los 24 horizontes. En el segundo se clasifican las diez clases de Fashion-MNIST con tres aproximaciones entrenadas bajo la misma partición, semilla, lotes y criterios de parada: una red convolucional diseñada desde cero, VGG16 con filtros de ImageNet y MobileNetV2 con aprendizaje por transferencia. VGG16 alcanza una exactitud de 93.19 %, MobileNetV2 de 92.43 % y la red propia de 89.04 %. Una prueba pareada muestra que la ventaja de VGG16 sobre MobileNetV2 es real pero pequeña, a cambio de ocho veces más tiempo de entrenamiento. Como extensión, EfficientNetV2-B0 alcanza 92.73 % y es la única red que no se distingue estadísticamente de VGG16, con 4.5 veces menos tiempo, por lo que resulta la opción más equilibrada. En ambos problemas la capacidad adicional no se tradujo en mejor generalización, y el error remanente se explica más por la información disponible que por la arquitectura.</w:t>
       </w:r>
     </w:p>
     <w:p/>
@@ -89,7 +85,7 @@
         <w:rPr>
           <w:iCs/>
         </w:rPr>
-        <w:t>—Los pronósticos locales de temperatura a un día sirven para planear el riego, la demanda de energía y las alertas tempranas, y la clasificación automática de imágenes de productos es una tarea cotidiana del comercio electrónico. Este trabajo muestra que en ambos casos un modelo pequeño y bien evaluado puede ser suficiente: una red recurrente de algo más de dos mil parámetros reduce en una cuarta parte el error de la mejor regla empírica, y una red móvil preentrenada queda estadísticamente empatada con otra ocho veces más costosa de entrenar. Documentar la partición de los datos, las líneas base y la incertidumbre de las métricas permite tomar decisiones de despliegue que consideran el costo y no solo la exactitud.</w:t>
+        <w:t>—Los pronósticos locales de temperatura a un día sirven para planear el riego, la demanda de energía y las alertas tempranas, y la clasificación automática de imágenes de productos es una tarea cotidiana del comercio electrónico. Este trabajo muestra que en ambos casos un modelo pequeño y bien evaluado puede ser suficiente: una red recurrente de algo más de dos mil parámetros reduce en una cuarta parte el error de la mejor regla empírica, y una red preentrenada moderna y compacta queda estadísticamente empatada con otra cuatro veces y media más costosa de entrenar. Documentar la partición de los datos, las líneas base y la incertidumbre de las métricas permite tomar decisiones de despliegue que consideran el costo y no solo la exactitud.</w:t>
       </w:r>
     </w:p>
     <w:p/>
@@ -110,7 +106,7 @@
         <w:rPr>
           <w:iCs/>
         </w:rPr>
-        <w:t>—Aprendizaje por transferencia, Fashion-MNIST, MeteoNet, MobileNetV2, pronóstico de series de tiempo, redes neuronales convolucionales, redes neuronales recurrentes, VGG16.</w:t>
+        <w:t>—Aprendizaje por transferencia, EfficientNetV2, Fashion-MNIST, MeteoNet, MobileNetV2, pronóstico de series de tiempo, redes neuronales convolucionales, redes neuronales recurrentes, VGG16.</w:t>
       </w:r>
     </w:p>
     <w:p/>
@@ -168,7 +164,7 @@
         <w:pStyle w:val="Text"/>
       </w:pPr>
       <w:r>
-        <w:t>El Punto 1 construye un modelo recurrente para pronosticar la temperatura de una estación meteorológica de MeteoNet, el conjunto de datos abierto de Météo-France [5]. El Punto 2 compara tres formas de resolver la clasificación de Fashion-MNIST [6]: una CNN diseñada desde cero, una red que reutiliza los filtros de VGG16 [7] entrenados en ImageNet [8] y una adaptación de MobileNetV2 [9] por aprendizaje por transferencia.</w:t>
+        <w:t>El Punto 1 construye un modelo recurrente para pronosticar la temperatura de una estación meteorológica de MeteoNet, el conjunto de datos abierto de Météo-France [5]. El Punto 2 compara tres formas de resolver la clasificación de Fashion-MNIST [6]: una CNN diseñada desde cero, una red que reutiliza los filtros de VGG16 [7] entrenados en ImageNet [8] y una adaptación de MobileNetV2 [9] por aprendizaje por transferencia; como extensión, repite la comparación con EfficientNetV2-B0 [33], una red moderna de la misma línea que MobileNetV2.</w:t>
       </w:r>
     </w:p>
     <w:p>
@@ -185,7 +181,7 @@
         <w:t>test</w:t>
       </w:r>
       <w:r>
-        <w:t>) se usa una sola vez, al final. Segundo, cada resultado se lee frente a una referencia: líneas base sin aprendizaje en el Punto 1 y un protocolo común para las tres redes en el Punto 2, que es lo que permite una comparación justa. Tercero, la incertidumbre se hace explícita cuando las diferencias son pequeñas. Las contribuciones son: 1) una formulación documentada y sin fuga de información de la tarea de pronóstico a 24 h; 2) una búsqueda de hiperparámetros por etapas que muestra por qué la celda recurrente más simple es la adecuada para este problema; 3) una comparación controlada de tres aproximaciones convolucionales en exactitud, costo e incertidumbre, y 4) un análisis de errores que separa las limitaciones del modelo de las de los datos.</w:t>
+        <w:t>) se usa una sola vez, al final. Segundo, cada resultado se lee frente a una referencia: líneas base sin aprendizaje en el Punto 1 y un protocolo común para las tres redes en el Punto 2, que es lo que permite una comparación justa. Tercero, la incertidumbre se hace explícita cuando las diferencias son pequeñas. Las contribuciones son: 1) una formulación documentada y sin fuga de información de la tarea de pronóstico a 24 h; 2) una búsqueda de hiperparámetros por etapas que muestra por qué la celda recurrente más simple es la adecuada para este problema; 3) una comparación controlada de tres aproximaciones convolucionales, extendida a una red moderna, en exactitud, costo e incertidumbre, con pruebas pareadas sobre el mismo conjunto de prueba, y 4) un análisis de errores que separa las limitaciones del modelo de las de los datos.</w:t>
       </w:r>
     </w:p>
     <w:p>
@@ -7263,7 +7259,7 @@
         <w:rPr>
           <w:i/>
         </w:rPr>
-        <w:t>log-loss</w:t>
+        <w:t xml:space="preserve">log-loss</w:t>
       </w:r>
       <w:r>
         <w:t xml:space="preserve">. Los intervalos de confianza del 95 %, calculados con 1 000 remuestreos </w:t>
@@ -7272,10 +7268,12 @@
         <w:rPr>
           <w:i/>
         </w:rPr>
-        <w:t>bootstrap</w:t>
-      </w:r>
-      <w:r>
-        <w:t xml:space="preserve"> del conjunto de prueba [30], separan con claridad a la CNN de las dos preentrenadas, pero los de VGG16 [92.69, 93.67] y MobileNetV2 [91.90, 92.95] se solapan: con este tamaño de prueba, la diferencia de 0.76 puntos no es concluyente. Una prueba pareada como la de McNemar [31] sería el paso siguiente para cuantificarla. La Fig. 11 pone esa diferencia en contexto: VGG16 tiene 6.5 veces más parámetros, casi seis veces más parámetros entrenables durante el ajuste fino y usó ocho veces más tiempo de GPU (2 687 s frente a 340 s).</w:t>
+        <w:t xml:space="preserve">bootstrap</w:t>
+      </w:r>
+      <w:r>
+        <w:t xml:space="preserve"> del conjunto de prueba [30], separan con claridad a la CNN de las dos preentrenadas, pero los de VGG16 [92.69, 93.67] y MobileNetV2 [91.90, 92.95] se solapan. Esa lectura es conservadora, porque ignora que las dos redes se evalúan sobre las mismas imágenes: la comparación pareada de la Sección IV</w:t>
+        <w:noBreakHyphen/>
+        <w:t xml:space="preserve">F muestra que la diferencia de 0.76 puntos sí es significativa, aunque pequeña. La Fig. 11 pone esa diferencia en contexto: VGG16 tiene 6.5 veces más parámetros, casi seis veces más parámetros entrenables durante el ajuste fino y usó ocho veces más tiempo de GPU (2 687 s frente a 340 s).</w:t>
       </w:r>
     </w:p>
     <w:p>
@@ -8580,6 +8578,89 @@
         <w:rPr>
           <w:i w:val="0"/>
         </w:rPr>
+        <w:t>Extensión a una red moderna: EfficientNetV2-B0</w:t>
+      </w:r>
+    </w:p>
+    <w:p>
+      <w:pPr>
+        <w:pStyle w:val="Text"/>
+      </w:pPr>
+      <w:r>
+        <w:t xml:space="preserve">Como bono se extendió la comparación a EfficientNetV2-B0 [33], la continuación de la línea de MobileNetV2: combina bloques MBConv y Fused-MBConv, escala de forma conjunta la profundidad, el ancho y la resolución, y tiene 5.9 millones de parámetros. Se repitió exactamente el protocolo de las otras tres redes —misma partición, semilla, lotes, </w:t>
+      </w:r>
+      <w:r>
+        <w:rPr>
+          <w:i/>
+        </w:rPr>
+        <w:t xml:space="preserve">callbacks</w:t>
+      </w:r>
+      <w:r>
+        <w:t xml:space="preserve"> y rejilla de búsqueda, ajuste fino de las últimas 20 capas con la tasa dividida por diez, float32 y la misma GPU T4—. La única diferencia es que Keras incluye el preprocesamiento de ImageNet dentro del modelo, así que la red recibe la imagen en el rango de 0 a 255 replicada en tres canales. La búsqueda repitió el patrón de la Tabla IV: ganó dropout 0.2 sin aumentación y tasa de 10</w:t>
+      </w:r>
+      <w:r>
+        <w:rPr>
+          <w:vertAlign w:val="superscript"/>
+        </w:rPr>
+        <w:t xml:space="preserve">−3</w:t>
+      </w:r>
+      <w:r>
+        <w:t xml:space="preserve"> (90.77 % en validación), la aumentación bajó a 87.48 % y la tasa de 10</w:t>
+      </w:r>
+      <w:r>
+        <w:rPr>
+          <w:vertAlign w:val="superscript"/>
+        </w:rPr>
+        <w:t xml:space="preserve">−4</w:t>
+      </w:r>
+      <w:r>
+        <w:t xml:space="preserve"> quedó subentrenada (84.80 %).</w:t>
+      </w:r>
+    </w:p>
+    <w:p>
+      <w:pPr>
+        <w:pStyle w:val="Text"/>
+      </w:pPr>
+      <w:r>
+        <w:t xml:space="preserve">El extractor congelado se estancó cerca del 91 % de exactitud en validación y el ajuste fino la llevó al 93.8 %; las 15 épocas de esa fase corrieron completas sin que se activara la parada temprana, así que con más presupuesto probablemente ganaría algo más. En prueba obtuvo 92.73 % de exactitud (IC 95 % [92.18, 93.24]), F1 macro de 0.9275 y </w:t>
+      </w:r>
+      <w:r>
+        <w:rPr>
+          <w:i/>
+        </w:rPr>
+        <w:t xml:space="preserve">log-loss</w:t>
+      </w:r>
+      <w:r>
+        <w:t xml:space="preserve"> de 0.2158, con 603 s de entrenamiento y 0.82 millones de parámetros entrenables en la fase final. Queda entre VGG16 y MobileNetV2 tanto en exactitud como en costo (Fig. 15).</w:t>
+      </w:r>
+    </w:p>
+    <w:p>
+      <w:pPr>
+        <w:pStyle w:val="Text"/>
+      </w:pPr>
+      <w:r>
+        <w:t xml:space="preserve">Como los intervalos por separado son conservadores, las redes se compararon además de forma pareada sobre las mismas 10 000 imágenes: con el intervalo </w:t>
+      </w:r>
+      <w:r>
+        <w:rPr>
+          <w:i/>
+        </w:rPr>
+        <w:t xml:space="preserve">bootstrap</w:t>
+      </w:r>
+      <w:r>
+        <w:t xml:space="preserve"> de la diferencia de exactitud y con la prueba exacta de McNemar [31], que solo cuenta las imágenes en que un modelo acierta y el otro no. La Tabla VI resume el resultado contra VGG16, la mejor red. EfficientNetV2-B0 queda a 0.46 puntos, con un intervalo que incluye el cero y p = 0.058: es la única red que no se distingue de VGG16, y lo logra con 4.5 veces menos tiempo. En cambio, la diferencia de 0.76 puntos entre VGG16 y MobileNetV2, que los intervalos separados no permitían afirmar, sí es significativa (p = 0.0015). Entre EfficientNetV2-B0 y MobileNetV2 la diferencia, de 0.30 puntos, no lo es (p = 0.23). Por clase, EfficientNetV2-B0 repite el patrón de las otras redes: camisa sigue siendo la clase más difícil (F1 de 0.79) y obtiene el mejor F1 de las cuatro en botín (0.97) y bolso (0.99).</w:t>
+      </w:r>
+    </w:p>
+    <w:p>
+      <w:pPr>
+        <w:pStyle w:val="Heading2"/>
+        <w:rPr>
+          <w:i w:val="0"/>
+        </w:rPr>
+      </w:pPr>
+      <w:r>
+        <w:rPr>
+          <w:i w:val="0"/>
+        </w:rPr>
         <w:t>Ventajas y desventajas de cada aproximación</w:t>
       </w:r>
     </w:p>
@@ -8588,7 +8669,7 @@
         <w:pStyle w:val="Text"/>
       </w:pPr>
       <w:r>
-        <w:t>La Tabla VI contrasta las tres aproximaciones con los resultados obtenidos. Con un criterio de «mejor» que combine exactitud, incertidumbre y costo, MobileNetV2 es la opción más equilibrada; VGG16 solo se justifica si cada décima de exactitud importa más que el cómputo, y la CNN propia es la elección cuando el presupuesto de memoria o de energía es muy bajo.</w:t>
+        <w:t xml:space="preserve">La Tabla VII contrasta las cuatro aproximaciones con los resultados obtenidos. Con un criterio de «mejor» que combine exactitud, incertidumbre y costo, EfficientNetV2-B0 es la opción más equilibrada; MobileNetV2 es la más barata de las preentrenadas, a cambio de 0.76 puntos frente a VGG16; VGG16 solo se justifica si cada décima de exactitud importa más que el cómputo, y la CNN propia es la elección cuando el presupuesto de memoria o de energía es muy bajo.</w:t>
       </w:r>
     </w:p>
     <w:p>
@@ -8625,12 +8706,1214 @@
     </w:p>
     <w:p>
       <w:pPr>
+        <w:keepNext/>
+        <w:spacing w:before="120"/>
+        <w:jc w:val="center"/>
+      </w:pPr>
+      <w:r>
+        <w:rPr>
+          <w:noProof/>
+        </w:rPr>
+        <w:drawing>
+          <wp:inline distT="0" distB="0" distL="0" distR="0" wp14:anchorId="23F6E7D0" wp14:editId="70DB74A4">
+            <wp:extent cx="4740250" cy="3096477"/>
+            <wp:effectExtent l="0" t="0" r="3810" b="0"/>
+            <wp:docPr id="339373299" name="Picture 15"/>
+            <wp:cNvGraphicFramePr>
+              <a:graphicFrameLocks xmlns:a="http://schemas.openxmlformats.org/drawingml/2006/main" noChangeAspect="1"/>
+            </wp:cNvGraphicFramePr>
+            <a:graphic xmlns:a="http://schemas.openxmlformats.org/drawingml/2006/main">
+              <a:graphicData uri="http://schemas.openxmlformats.org/drawingml/2006/picture">
+                <pic:pic xmlns:pic="http://schemas.openxmlformats.org/drawingml/2006/picture">
+                  <pic:nvPicPr>
+                    <pic:cNvPr id="339373299" name=""/>
+                    <pic:cNvPicPr/>
+                  </pic:nvPicPr>
+                  <pic:blipFill>
+                    <a:blip r:embed="rId30"/>
+                    <a:stretch>
+                      <a:fillRect/>
+                    </a:stretch>
+                  </pic:blipFill>
+                  <pic:spPr>
+                    <a:xfrm>
+                      <a:off x="0" y="0"/>
+                      <a:ext cx="4740250" cy="3096477"/>
+                    </a:xfrm>
+                    <a:prstGeom prst="rect">
+                      <a:avLst/>
+                    </a:prstGeom>
+                  </pic:spPr>
+                </pic:pic>
+              </a:graphicData>
+            </a:graphic>
+          </wp:inline>
+        </w:drawing>
+      </w:r>
+    </w:p>
+    <w:p>
+      <w:pPr>
+        <w:pStyle w:val="FigureCaption"/>
+        <w:spacing w:before="60" w:after="160"/>
+      </w:pPr>
+      <w:r>
+        <w:t xml:space="preserve">Fig. 15. Extensión a EfficientNetV2-B0. Exactitud en prueba con su intervalo de confianza del 95 % frente a (a) los parámetros entrenables, en escala logarítmica, y (b) el tiempo de entrenamiento en GPU; (c) diferencia pareada de exactitud de VGG16 frente a cada red, con su intervalo </w:t>
+      </w:r>
+      <w:r>
+        <w:rPr>
+          <w:i/>
+        </w:rPr>
+        <w:t xml:space="preserve">bootstrap</w:t>
+      </w:r>
+      <w:r>
+        <w:t xml:space="preserve"> del 95 % y el valor p de la prueba de McNemar. Un intervalo que cruza el cero indica una diferencia no concluyente.</w:t>
+      </w:r>
+    </w:p>
+    <w:p>
+      <w:pPr>
         <w:pStyle w:val="TableTitle"/>
         <w:keepNext/>
         <w:spacing w:before="160"/>
       </w:pPr>
       <w:r>
         <w:t>Tabla VI</w:t>
+      </w:r>
+    </w:p>
+    <w:p>
+      <w:pPr>
+        <w:pStyle w:val="TableTitle"/>
+        <w:keepNext/>
+        <w:spacing w:after="60"/>
+      </w:pPr>
+      <w:r>
+        <w:t>Comparación pareada contra VGG16 en el conjunto de prueba</w:t>
+      </w:r>
+    </w:p>
+    <w:tbl>
+      <w:tblPr>
+        <w:tblW w:w="10367" w:type="dxa"/>
+        <w:tblLayout w:type="fixed"/>
+        <w:tblCellMar>
+          <w:top w:w="16" w:type="dxa"/>
+          <w:left w:w="50" w:type="dxa"/>
+          <w:bottom w:w="16" w:type="dxa"/>
+          <w:right w:w="50" w:type="dxa"/>
+        </w:tblCellMar>
+        <w:tblLook w:val="0000" w:firstRow="0" w:lastRow="0" w:firstColumn="0" w:lastColumn="0" w:noHBand="0" w:noVBand="0"/>
+      </w:tblPr>
+      <w:tblGrid>
+        <w:gridCol w:w="1500"/>
+        <w:gridCol w:w="900"/>
+        <w:gridCol w:w="850"/>
+        <w:gridCol w:w="1100"/>
+        <w:gridCol w:w="1150"/>
+        <w:gridCol w:w="1400"/>
+        <w:gridCol w:w="1100"/>
+        <w:gridCol w:w="1167"/>
+        <w:gridCol w:w="1200"/>
+      </w:tblGrid>
+      <w:tr>
+        <w:trPr>
+          <w:cantSplit/>
+          <w:tblHeader/>
+        </w:trPr>
+        <w:tc>
+          <w:tcPr>
+            <w:tcW w:w="1500" w:type="dxa"/>
+            <w:tcBorders>
+              <w:top w:val="single" w:sz="4" w:space="0" w:color="auto"/>
+              <w:bottom w:val="single" w:sz="4" w:space="0" w:color="auto"/>
+            </w:tcBorders>
+            <w:vAlign w:val="center"/>
+          </w:tcPr>
+          <w:p>
+            <w:pPr>
+              <w:keepNext/>
+              <w:rPr>
+                <w:sz w:val="15"/>
+              </w:rPr>
+            </w:pPr>
+            <w:r>
+              <w:rPr>
+                <w:b/>
+                <w:sz w:val="15"/>
+              </w:rPr>
+              <w:t xml:space="preserve">Modelo</w:t>
+            </w:r>
+          </w:p>
+        </w:tc>
+        <w:tc>
+          <w:tcPr>
+            <w:tcW w:w="900" w:type="dxa"/>
+            <w:tcBorders>
+              <w:top w:val="single" w:sz="4" w:space="0" w:color="auto"/>
+              <w:bottom w:val="single" w:sz="4" w:space="0" w:color="auto"/>
+            </w:tcBorders>
+            <w:vAlign w:val="center"/>
+          </w:tcPr>
+          <w:p>
+            <w:pPr>
+              <w:keepNext/>
+              <w:jc w:val="center"/>
+              <w:rPr>
+                <w:sz w:val="15"/>
+              </w:rPr>
+            </w:pPr>
+            <w:r>
+              <w:rPr>
+                <w:b/>
+                <w:sz w:val="15"/>
+              </w:rPr>
+              <w:t xml:space="preserve">Exactitud (%)</w:t>
+            </w:r>
+          </w:p>
+        </w:tc>
+        <w:tc>
+          <w:tcPr>
+            <w:tcW w:w="850" w:type="dxa"/>
+            <w:tcBorders>
+              <w:top w:val="single" w:sz="4" w:space="0" w:color="auto"/>
+              <w:bottom w:val="single" w:sz="4" w:space="0" w:color="auto"/>
+            </w:tcBorders>
+            <w:vAlign w:val="center"/>
+          </w:tcPr>
+          <w:p>
+            <w:pPr>
+              <w:keepNext/>
+              <w:jc w:val="center"/>
+              <w:rPr>
+                <w:sz w:val="15"/>
+              </w:rPr>
+            </w:pPr>
+            <w:r>
+              <w:rPr>
+                <w:b/>
+                <w:sz w:val="15"/>
+              </w:rPr>
+              <w:t xml:space="preserve">Tiempo (s)</w:t>
+            </w:r>
+          </w:p>
+        </w:tc>
+        <w:tc>
+          <w:tcPr>
+            <w:tcW w:w="1100" w:type="dxa"/>
+            <w:tcBorders>
+              <w:top w:val="single" w:sz="4" w:space="0" w:color="auto"/>
+              <w:bottom w:val="single" w:sz="4" w:space="0" w:color="auto"/>
+            </w:tcBorders>
+            <w:vAlign w:val="center"/>
+          </w:tcPr>
+          <w:p>
+            <w:pPr>
+              <w:keepNext/>
+              <w:jc w:val="center"/>
+              <w:rPr>
+                <w:sz w:val="15"/>
+              </w:rPr>
+            </w:pPr>
+            <w:r>
+              <w:rPr>
+                <w:b/>
+                <w:sz w:val="15"/>
+              </w:rPr>
+              <w:t xml:space="preserve">Entrenables</w:t>
+            </w:r>
+          </w:p>
+        </w:tc>
+        <w:tc>
+          <w:tcPr>
+            <w:tcW w:w="1150" w:type="dxa"/>
+            <w:tcBorders>
+              <w:top w:val="single" w:sz="4" w:space="0" w:color="auto"/>
+              <w:bottom w:val="single" w:sz="4" w:space="0" w:color="auto"/>
+            </w:tcBorders>
+            <w:vAlign w:val="center"/>
+          </w:tcPr>
+          <w:p>
+            <w:pPr>
+              <w:keepNext/>
+              <w:jc w:val="center"/>
+              <w:rPr>
+                <w:sz w:val="15"/>
+              </w:rPr>
+            </w:pPr>
+            <w:r>
+              <w:rPr>
+                <w:b/>
+                <w:sz w:val="15"/>
+              </w:rPr>
+              <w:t xml:space="preserve">Diferencia con VGG16 (puntos)</w:t>
+            </w:r>
+          </w:p>
+        </w:tc>
+        <w:tc>
+          <w:tcPr>
+            <w:tcW w:w="1400" w:type="dxa"/>
+            <w:tcBorders>
+              <w:top w:val="single" w:sz="4" w:space="0" w:color="auto"/>
+              <w:bottom w:val="single" w:sz="4" w:space="0" w:color="auto"/>
+            </w:tcBorders>
+            <w:vAlign w:val="center"/>
+          </w:tcPr>
+          <w:p>
+            <w:pPr>
+              <w:keepNext/>
+              <w:jc w:val="center"/>
+              <w:rPr>
+                <w:sz w:val="15"/>
+              </w:rPr>
+            </w:pPr>
+            <w:r>
+              <w:rPr>
+                <w:b/>
+                <w:sz w:val="15"/>
+              </w:rPr>
+              <w:t xml:space="preserve">IC 95 % de la diferencia</w:t>
+            </w:r>
+          </w:p>
+        </w:tc>
+        <w:tc>
+          <w:tcPr>
+            <w:tcW w:w="1100" w:type="dxa"/>
+            <w:tcBorders>
+              <w:top w:val="single" w:sz="4" w:space="0" w:color="auto"/>
+              <w:bottom w:val="single" w:sz="4" w:space="0" w:color="auto"/>
+            </w:tcBorders>
+            <w:vAlign w:val="center"/>
+          </w:tcPr>
+          <w:p>
+            <w:pPr>
+              <w:keepNext/>
+              <w:jc w:val="center"/>
+              <w:rPr>
+                <w:sz w:val="15"/>
+              </w:rPr>
+            </w:pPr>
+            <w:r>
+              <w:rPr>
+                <w:b/>
+                <w:sz w:val="15"/>
+              </w:rPr>
+              <w:t xml:space="preserve">Solo acierta VGG16</w:t>
+            </w:r>
+          </w:p>
+        </w:tc>
+        <w:tc>
+          <w:tcPr>
+            <w:tcW w:w="1167" w:type="dxa"/>
+            <w:tcBorders>
+              <w:top w:val="single" w:sz="4" w:space="0" w:color="auto"/>
+              <w:bottom w:val="single" w:sz="4" w:space="0" w:color="auto"/>
+            </w:tcBorders>
+            <w:vAlign w:val="center"/>
+          </w:tcPr>
+          <w:p>
+            <w:pPr>
+              <w:keepNext/>
+              <w:jc w:val="center"/>
+              <w:rPr>
+                <w:sz w:val="15"/>
+              </w:rPr>
+            </w:pPr>
+            <w:r>
+              <w:rPr>
+                <w:b/>
+                <w:sz w:val="15"/>
+              </w:rPr>
+              <w:t xml:space="preserve">Solo acierta el modelo</w:t>
+            </w:r>
+          </w:p>
+        </w:tc>
+        <w:tc>
+          <w:tcPr>
+            <w:tcW w:w="1200" w:type="dxa"/>
+            <w:tcBorders>
+              <w:top w:val="single" w:sz="4" w:space="0" w:color="auto"/>
+              <w:bottom w:val="single" w:sz="4" w:space="0" w:color="auto"/>
+            </w:tcBorders>
+            <w:vAlign w:val="center"/>
+          </w:tcPr>
+          <w:p>
+            <w:pPr>
+              <w:keepNext/>
+              <w:jc w:val="center"/>
+              <w:rPr>
+                <w:sz w:val="15"/>
+              </w:rPr>
+            </w:pPr>
+            <w:r>
+              <w:rPr>
+                <w:b/>
+                <w:sz w:val="15"/>
+              </w:rPr>
+              <w:t xml:space="preserve">p (McNemar)</w:t>
+            </w:r>
+          </w:p>
+        </w:tc>
+      </w:tr>
+      <w:tr>
+        <w:trPr>
+          <w:cantSplit/>
+        </w:trPr>
+        <w:tc>
+          <w:tcPr>
+            <w:tcW w:w="1500" w:type="dxa"/>
+            <w:tcBorders>
+              <w:top w:val="single" w:sz="4" w:space="0" w:color="auto"/>
+            </w:tcBorders>
+            <w:vAlign w:val="center"/>
+          </w:tcPr>
+          <w:p>
+            <w:pPr>
+              <w:keepNext/>
+              <w:rPr>
+                <w:sz w:val="15"/>
+              </w:rPr>
+            </w:pPr>
+            <w:r>
+              <w:rPr>
+                <w:sz w:val="15"/>
+              </w:rPr>
+              <w:t xml:space="preserve">VGG16</w:t>
+            </w:r>
+          </w:p>
+        </w:tc>
+        <w:tc>
+          <w:tcPr>
+            <w:tcW w:w="900" w:type="dxa"/>
+            <w:tcBorders>
+              <w:top w:val="single" w:sz="4" w:space="0" w:color="auto"/>
+            </w:tcBorders>
+            <w:vAlign w:val="center"/>
+          </w:tcPr>
+          <w:p>
+            <w:pPr>
+              <w:keepNext/>
+              <w:jc w:val="center"/>
+              <w:rPr>
+                <w:sz w:val="15"/>
+              </w:rPr>
+            </w:pPr>
+            <w:r>
+              <w:rPr>
+                <w:sz w:val="15"/>
+              </w:rPr>
+              <w:t xml:space="preserve">93.19</w:t>
+            </w:r>
+          </w:p>
+        </w:tc>
+        <w:tc>
+          <w:tcPr>
+            <w:tcW w:w="850" w:type="dxa"/>
+            <w:tcBorders>
+              <w:top w:val="single" w:sz="4" w:space="0" w:color="auto"/>
+            </w:tcBorders>
+            <w:vAlign w:val="center"/>
+          </w:tcPr>
+          <w:p>
+            <w:pPr>
+              <w:keepNext/>
+              <w:jc w:val="center"/>
+              <w:rPr>
+                <w:sz w:val="15"/>
+              </w:rPr>
+            </w:pPr>
+            <w:r>
+              <w:rPr>
+                <w:sz w:val="15"/>
+              </w:rPr>
+              <w:t xml:space="preserve">2 687</w:t>
+            </w:r>
+          </w:p>
+        </w:tc>
+        <w:tc>
+          <w:tcPr>
+            <w:tcW w:w="1100" w:type="dxa"/>
+            <w:tcBorders>
+              <w:top w:val="single" w:sz="4" w:space="0" w:color="auto"/>
+            </w:tcBorders>
+            <w:vAlign w:val="center"/>
+          </w:tcPr>
+          <w:p>
+            <w:pPr>
+              <w:keepNext/>
+              <w:jc w:val="center"/>
+              <w:rPr>
+                <w:sz w:val="15"/>
+              </w:rPr>
+            </w:pPr>
+            <w:r>
+              <w:rPr>
+                <w:sz w:val="15"/>
+              </w:rPr>
+              <w:t xml:space="preserve">7 084 554</w:t>
+            </w:r>
+          </w:p>
+        </w:tc>
+        <w:tc>
+          <w:tcPr>
+            <w:tcW w:w="1150" w:type="dxa"/>
+            <w:tcBorders>
+              <w:top w:val="single" w:sz="4" w:space="0" w:color="auto"/>
+            </w:tcBorders>
+            <w:vAlign w:val="center"/>
+          </w:tcPr>
+          <w:p>
+            <w:pPr>
+              <w:keepNext/>
+              <w:jc w:val="center"/>
+              <w:rPr>
+                <w:sz w:val="15"/>
+              </w:rPr>
+            </w:pPr>
+            <w:r>
+              <w:rPr>
+                <w:sz w:val="15"/>
+              </w:rPr>
+              <w:t xml:space="preserve">—</w:t>
+            </w:r>
+          </w:p>
+        </w:tc>
+        <w:tc>
+          <w:tcPr>
+            <w:tcW w:w="1400" w:type="dxa"/>
+            <w:tcBorders>
+              <w:top w:val="single" w:sz="4" w:space="0" w:color="auto"/>
+            </w:tcBorders>
+            <w:vAlign w:val="center"/>
+          </w:tcPr>
+          <w:p>
+            <w:pPr>
+              <w:keepNext/>
+              <w:jc w:val="center"/>
+              <w:rPr>
+                <w:sz w:val="15"/>
+              </w:rPr>
+            </w:pPr>
+            <w:r>
+              <w:rPr>
+                <w:sz w:val="15"/>
+              </w:rPr>
+              <w:t xml:space="preserve">—</w:t>
+            </w:r>
+          </w:p>
+        </w:tc>
+        <w:tc>
+          <w:tcPr>
+            <w:tcW w:w="1100" w:type="dxa"/>
+            <w:tcBorders>
+              <w:top w:val="single" w:sz="4" w:space="0" w:color="auto"/>
+            </w:tcBorders>
+            <w:vAlign w:val="center"/>
+          </w:tcPr>
+          <w:p>
+            <w:pPr>
+              <w:keepNext/>
+              <w:jc w:val="center"/>
+              <w:rPr>
+                <w:sz w:val="15"/>
+              </w:rPr>
+            </w:pPr>
+            <w:r>
+              <w:rPr>
+                <w:sz w:val="15"/>
+              </w:rPr>
+              <w:t xml:space="preserve">—</w:t>
+            </w:r>
+          </w:p>
+        </w:tc>
+        <w:tc>
+          <w:tcPr>
+            <w:tcW w:w="1167" w:type="dxa"/>
+            <w:tcBorders>
+              <w:top w:val="single" w:sz="4" w:space="0" w:color="auto"/>
+            </w:tcBorders>
+            <w:vAlign w:val="center"/>
+          </w:tcPr>
+          <w:p>
+            <w:pPr>
+              <w:keepNext/>
+              <w:jc w:val="center"/>
+              <w:rPr>
+                <w:sz w:val="15"/>
+              </w:rPr>
+            </w:pPr>
+            <w:r>
+              <w:rPr>
+                <w:sz w:val="15"/>
+              </w:rPr>
+              <w:t xml:space="preserve">—</w:t>
+            </w:r>
+          </w:p>
+        </w:tc>
+        <w:tc>
+          <w:tcPr>
+            <w:tcW w:w="1200" w:type="dxa"/>
+            <w:tcBorders>
+              <w:top w:val="single" w:sz="4" w:space="0" w:color="auto"/>
+            </w:tcBorders>
+            <w:vAlign w:val="center"/>
+          </w:tcPr>
+          <w:p>
+            <w:pPr>
+              <w:keepNext/>
+              <w:jc w:val="center"/>
+              <w:rPr>
+                <w:sz w:val="15"/>
+              </w:rPr>
+            </w:pPr>
+            <w:r>
+              <w:rPr>
+                <w:sz w:val="15"/>
+              </w:rPr>
+              <w:t xml:space="preserve">—</w:t>
+            </w:r>
+          </w:p>
+        </w:tc>
+      </w:tr>
+      <w:tr>
+        <w:trPr>
+          <w:cantSplit/>
+        </w:trPr>
+        <w:tc>
+          <w:tcPr>
+            <w:tcW w:w="1500" w:type="dxa"/>
+            <w:vAlign w:val="center"/>
+          </w:tcPr>
+          <w:p>
+            <w:pPr>
+              <w:keepNext/>
+              <w:rPr>
+                <w:sz w:val="15"/>
+              </w:rPr>
+            </w:pPr>
+            <w:r>
+              <w:rPr>
+                <w:sz w:val="15"/>
+              </w:rPr>
+              <w:t xml:space="preserve">EfficientNetV2-B0</w:t>
+            </w:r>
+          </w:p>
+        </w:tc>
+        <w:tc>
+          <w:tcPr>
+            <w:tcW w:w="900" w:type="dxa"/>
+            <w:vAlign w:val="center"/>
+          </w:tcPr>
+          <w:p>
+            <w:pPr>
+              <w:keepNext/>
+              <w:jc w:val="center"/>
+              <w:rPr>
+                <w:sz w:val="15"/>
+              </w:rPr>
+            </w:pPr>
+            <w:r>
+              <w:rPr>
+                <w:sz w:val="15"/>
+              </w:rPr>
+              <w:t xml:space="preserve">92.73</w:t>
+            </w:r>
+          </w:p>
+        </w:tc>
+        <w:tc>
+          <w:tcPr>
+            <w:tcW w:w="850" w:type="dxa"/>
+            <w:vAlign w:val="center"/>
+          </w:tcPr>
+          <w:p>
+            <w:pPr>
+              <w:keepNext/>
+              <w:jc w:val="center"/>
+              <w:rPr>
+                <w:sz w:val="15"/>
+              </w:rPr>
+            </w:pPr>
+            <w:r>
+              <w:rPr>
+                <w:sz w:val="15"/>
+              </w:rPr>
+              <w:t xml:space="preserve">603</w:t>
+            </w:r>
+          </w:p>
+        </w:tc>
+        <w:tc>
+          <w:tcPr>
+            <w:tcW w:w="1100" w:type="dxa"/>
+            <w:vAlign w:val="center"/>
+          </w:tcPr>
+          <w:p>
+            <w:pPr>
+              <w:keepNext/>
+              <w:jc w:val="center"/>
+              <w:rPr>
+                <w:sz w:val="15"/>
+              </w:rPr>
+            </w:pPr>
+            <w:r>
+              <w:rPr>
+                <w:sz w:val="15"/>
+              </w:rPr>
+              <w:t xml:space="preserve">823 098</w:t>
+            </w:r>
+          </w:p>
+        </w:tc>
+        <w:tc>
+          <w:tcPr>
+            <w:tcW w:w="1150" w:type="dxa"/>
+            <w:vAlign w:val="center"/>
+          </w:tcPr>
+          <w:p>
+            <w:pPr>
+              <w:keepNext/>
+              <w:jc w:val="center"/>
+              <w:rPr>
+                <w:sz w:val="15"/>
+              </w:rPr>
+            </w:pPr>
+            <w:r>
+              <w:rPr>
+                <w:sz w:val="15"/>
+              </w:rPr>
+              <w:t xml:space="preserve">0.46</w:t>
+            </w:r>
+          </w:p>
+        </w:tc>
+        <w:tc>
+          <w:tcPr>
+            <w:tcW w:w="1400" w:type="dxa"/>
+            <w:vAlign w:val="center"/>
+          </w:tcPr>
+          <w:p>
+            <w:pPr>
+              <w:keepNext/>
+              <w:jc w:val="center"/>
+              <w:rPr>
+                <w:sz w:val="15"/>
+              </w:rPr>
+            </w:pPr>
+            <w:r>
+              <w:rPr>
+                <w:sz w:val="15"/>
+              </w:rPr>
+              <w:t xml:space="preserve">[−0.02, 0.94]</w:t>
+            </w:r>
+          </w:p>
+        </w:tc>
+        <w:tc>
+          <w:tcPr>
+            <w:tcW w:w="1100" w:type="dxa"/>
+            <w:vAlign w:val="center"/>
+          </w:tcPr>
+          <w:p>
+            <w:pPr>
+              <w:keepNext/>
+              <w:jc w:val="center"/>
+              <w:rPr>
+                <w:sz w:val="15"/>
+              </w:rPr>
+            </w:pPr>
+            <w:r>
+              <w:rPr>
+                <w:sz w:val="15"/>
+              </w:rPr>
+              <w:t xml:space="preserve">305</w:t>
+            </w:r>
+          </w:p>
+        </w:tc>
+        <w:tc>
+          <w:tcPr>
+            <w:tcW w:w="1167" w:type="dxa"/>
+            <w:vAlign w:val="center"/>
+          </w:tcPr>
+          <w:p>
+            <w:pPr>
+              <w:keepNext/>
+              <w:jc w:val="center"/>
+              <w:rPr>
+                <w:sz w:val="15"/>
+              </w:rPr>
+            </w:pPr>
+            <w:r>
+              <w:rPr>
+                <w:sz w:val="15"/>
+              </w:rPr>
+              <w:t xml:space="preserve">259</w:t>
+            </w:r>
+          </w:p>
+        </w:tc>
+        <w:tc>
+          <w:tcPr>
+            <w:tcW w:w="1200" w:type="dxa"/>
+            <w:vAlign w:val="center"/>
+          </w:tcPr>
+          <w:p>
+            <w:pPr>
+              <w:keepNext/>
+              <w:jc w:val="center"/>
+              <w:rPr>
+                <w:sz w:val="15"/>
+              </w:rPr>
+            </w:pPr>
+            <w:r>
+              <w:rPr>
+                <w:sz w:val="15"/>
+              </w:rPr>
+              <w:t xml:space="preserve">0.058</w:t>
+            </w:r>
+          </w:p>
+        </w:tc>
+      </w:tr>
+      <w:tr>
+        <w:trPr>
+          <w:cantSplit/>
+        </w:trPr>
+        <w:tc>
+          <w:tcPr>
+            <w:tcW w:w="1500" w:type="dxa"/>
+            <w:vAlign w:val="center"/>
+          </w:tcPr>
+          <w:p>
+            <w:pPr>
+              <w:keepNext/>
+              <w:rPr>
+                <w:sz w:val="15"/>
+              </w:rPr>
+            </w:pPr>
+            <w:r>
+              <w:rPr>
+                <w:sz w:val="15"/>
+              </w:rPr>
+              <w:t xml:space="preserve">MobileNetV2</w:t>
+            </w:r>
+          </w:p>
+        </w:tc>
+        <w:tc>
+          <w:tcPr>
+            <w:tcW w:w="900" w:type="dxa"/>
+            <w:vAlign w:val="center"/>
+          </w:tcPr>
+          <w:p>
+            <w:pPr>
+              <w:keepNext/>
+              <w:jc w:val="center"/>
+              <w:rPr>
+                <w:sz w:val="15"/>
+              </w:rPr>
+            </w:pPr>
+            <w:r>
+              <w:rPr>
+                <w:sz w:val="15"/>
+              </w:rPr>
+              <w:t xml:space="preserve">92.43</w:t>
+            </w:r>
+          </w:p>
+        </w:tc>
+        <w:tc>
+          <w:tcPr>
+            <w:tcW w:w="850" w:type="dxa"/>
+            <w:vAlign w:val="center"/>
+          </w:tcPr>
+          <w:p>
+            <w:pPr>
+              <w:keepNext/>
+              <w:jc w:val="center"/>
+              <w:rPr>
+                <w:sz w:val="15"/>
+              </w:rPr>
+            </w:pPr>
+            <w:r>
+              <w:rPr>
+                <w:sz w:val="15"/>
+              </w:rPr>
+              <w:t xml:space="preserve">340</w:t>
+            </w:r>
+          </w:p>
+        </w:tc>
+        <w:tc>
+          <w:tcPr>
+            <w:tcW w:w="1100" w:type="dxa"/>
+            <w:vAlign w:val="center"/>
+          </w:tcPr>
+          <w:p>
+            <w:pPr>
+              <w:keepNext/>
+              <w:jc w:val="center"/>
+              <w:rPr>
+                <w:sz w:val="15"/>
+              </w:rPr>
+            </w:pPr>
+            <w:r>
+              <w:rPr>
+                <w:sz w:val="15"/>
+              </w:rPr>
+              <w:t xml:space="preserve">1 207 690</w:t>
+            </w:r>
+          </w:p>
+        </w:tc>
+        <w:tc>
+          <w:tcPr>
+            <w:tcW w:w="1150" w:type="dxa"/>
+            <w:vAlign w:val="center"/>
+          </w:tcPr>
+          <w:p>
+            <w:pPr>
+              <w:keepNext/>
+              <w:jc w:val="center"/>
+              <w:rPr>
+                <w:sz w:val="15"/>
+              </w:rPr>
+            </w:pPr>
+            <w:r>
+              <w:rPr>
+                <w:sz w:val="15"/>
+              </w:rPr>
+              <w:t xml:space="preserve">0.76</w:t>
+            </w:r>
+          </w:p>
+        </w:tc>
+        <w:tc>
+          <w:tcPr>
+            <w:tcW w:w="1400" w:type="dxa"/>
+            <w:vAlign w:val="center"/>
+          </w:tcPr>
+          <w:p>
+            <w:pPr>
+              <w:keepNext/>
+              <w:jc w:val="center"/>
+              <w:rPr>
+                <w:sz w:val="15"/>
+              </w:rPr>
+            </w:pPr>
+            <w:r>
+              <w:rPr>
+                <w:sz w:val="15"/>
+              </w:rPr>
+              <w:t xml:space="preserve">[0.28, 1.22]</w:t>
+            </w:r>
+          </w:p>
+        </w:tc>
+        <w:tc>
+          <w:tcPr>
+            <w:tcW w:w="1100" w:type="dxa"/>
+            <w:vAlign w:val="center"/>
+          </w:tcPr>
+          <w:p>
+            <w:pPr>
+              <w:keepNext/>
+              <w:jc w:val="center"/>
+              <w:rPr>
+                <w:sz w:val="15"/>
+              </w:rPr>
+            </w:pPr>
+            <w:r>
+              <w:rPr>
+                <w:sz w:val="15"/>
+              </w:rPr>
+              <w:t xml:space="preserve">317</w:t>
+            </w:r>
+          </w:p>
+        </w:tc>
+        <w:tc>
+          <w:tcPr>
+            <w:tcW w:w="1167" w:type="dxa"/>
+            <w:vAlign w:val="center"/>
+          </w:tcPr>
+          <w:p>
+            <w:pPr>
+              <w:keepNext/>
+              <w:jc w:val="center"/>
+              <w:rPr>
+                <w:sz w:val="15"/>
+              </w:rPr>
+            </w:pPr>
+            <w:r>
+              <w:rPr>
+                <w:sz w:val="15"/>
+              </w:rPr>
+              <w:t xml:space="preserve">241</w:t>
+            </w:r>
+          </w:p>
+        </w:tc>
+        <w:tc>
+          <w:tcPr>
+            <w:tcW w:w="1200" w:type="dxa"/>
+            <w:vAlign w:val="center"/>
+          </w:tcPr>
+          <w:p>
+            <w:pPr>
+              <w:keepNext/>
+              <w:jc w:val="center"/>
+              <w:rPr>
+                <w:sz w:val="15"/>
+              </w:rPr>
+            </w:pPr>
+            <w:r>
+              <w:rPr>
+                <w:sz w:val="15"/>
+              </w:rPr>
+              <w:t xml:space="preserve">0.0015</w:t>
+            </w:r>
+          </w:p>
+        </w:tc>
+      </w:tr>
+      <w:tr>
+        <w:trPr>
+          <w:cantSplit/>
+        </w:trPr>
+        <w:tc>
+          <w:tcPr>
+            <w:tcW w:w="1500" w:type="dxa"/>
+            <w:tcBorders>
+              <w:bottom w:val="single" w:sz="4" w:space="0" w:color="auto"/>
+            </w:tcBorders>
+            <w:vAlign w:val="center"/>
+          </w:tcPr>
+          <w:p>
+            <w:pPr>
+              <w:keepNext/>
+              <w:rPr>
+                <w:sz w:val="15"/>
+              </w:rPr>
+            </w:pPr>
+            <w:r>
+              <w:rPr>
+                <w:sz w:val="15"/>
+              </w:rPr>
+              <w:t xml:space="preserve">CNN desde cero</w:t>
+            </w:r>
+          </w:p>
+        </w:tc>
+        <w:tc>
+          <w:tcPr>
+            <w:tcW w:w="900" w:type="dxa"/>
+            <w:tcBorders>
+              <w:bottom w:val="single" w:sz="4" w:space="0" w:color="auto"/>
+            </w:tcBorders>
+            <w:vAlign w:val="center"/>
+          </w:tcPr>
+          <w:p>
+            <w:pPr>
+              <w:keepNext/>
+              <w:jc w:val="center"/>
+              <w:rPr>
+                <w:sz w:val="15"/>
+              </w:rPr>
+            </w:pPr>
+            <w:r>
+              <w:rPr>
+                <w:sz w:val="15"/>
+              </w:rPr>
+              <w:t xml:space="preserve">89.04</w:t>
+            </w:r>
+          </w:p>
+        </w:tc>
+        <w:tc>
+          <w:tcPr>
+            <w:tcW w:w="850" w:type="dxa"/>
+            <w:tcBorders>
+              <w:bottom w:val="single" w:sz="4" w:space="0" w:color="auto"/>
+            </w:tcBorders>
+            <w:vAlign w:val="center"/>
+          </w:tcPr>
+          <w:p>
+            <w:pPr>
+              <w:keepNext/>
+              <w:jc w:val="center"/>
+              <w:rPr>
+                <w:sz w:val="15"/>
+              </w:rPr>
+            </w:pPr>
+            <w:r>
+              <w:rPr>
+                <w:sz w:val="15"/>
+              </w:rPr>
+              <w:t xml:space="preserve">79</w:t>
+            </w:r>
+          </w:p>
+        </w:tc>
+        <w:tc>
+          <w:tcPr>
+            <w:tcW w:w="1100" w:type="dxa"/>
+            <w:tcBorders>
+              <w:bottom w:val="single" w:sz="4" w:space="0" w:color="auto"/>
+            </w:tcBorders>
+            <w:vAlign w:val="center"/>
+          </w:tcPr>
+          <w:p>
+            <w:pPr>
+              <w:keepNext/>
+              <w:jc w:val="center"/>
+              <w:rPr>
+                <w:sz w:val="15"/>
+              </w:rPr>
+            </w:pPr>
+            <w:r>
+              <w:rPr>
+                <w:sz w:val="15"/>
+              </w:rPr>
+              <w:t xml:space="preserve">28 522</w:t>
+            </w:r>
+          </w:p>
+        </w:tc>
+        <w:tc>
+          <w:tcPr>
+            <w:tcW w:w="1150" w:type="dxa"/>
+            <w:tcBorders>
+              <w:bottom w:val="single" w:sz="4" w:space="0" w:color="auto"/>
+            </w:tcBorders>
+            <w:vAlign w:val="center"/>
+          </w:tcPr>
+          <w:p>
+            <w:pPr>
+              <w:keepNext/>
+              <w:jc w:val="center"/>
+              <w:rPr>
+                <w:sz w:val="15"/>
+              </w:rPr>
+            </w:pPr>
+            <w:r>
+              <w:rPr>
+                <w:sz w:val="15"/>
+              </w:rPr>
+              <w:t xml:space="preserve">4.15</w:t>
+            </w:r>
+          </w:p>
+        </w:tc>
+        <w:tc>
+          <w:tcPr>
+            <w:tcW w:w="1400" w:type="dxa"/>
+            <w:tcBorders>
+              <w:bottom w:val="single" w:sz="4" w:space="0" w:color="auto"/>
+            </w:tcBorders>
+            <w:vAlign w:val="center"/>
+          </w:tcPr>
+          <w:p>
+            <w:pPr>
+              <w:keepNext/>
+              <w:jc w:val="center"/>
+              <w:rPr>
+                <w:sz w:val="15"/>
+              </w:rPr>
+            </w:pPr>
+            <w:r>
+              <w:rPr>
+                <w:sz w:val="15"/>
+              </w:rPr>
+              <w:t xml:space="preserve">[3.60, 4.67]</w:t>
+            </w:r>
+          </w:p>
+        </w:tc>
+        <w:tc>
+          <w:tcPr>
+            <w:tcW w:w="1100" w:type="dxa"/>
+            <w:tcBorders>
+              <w:bottom w:val="single" w:sz="4" w:space="0" w:color="auto"/>
+            </w:tcBorders>
+            <w:vAlign w:val="center"/>
+          </w:tcPr>
+          <w:p>
+            <w:pPr>
+              <w:keepNext/>
+              <w:jc w:val="center"/>
+              <w:rPr>
+                <w:sz w:val="15"/>
+              </w:rPr>
+            </w:pPr>
+            <w:r>
+              <w:rPr>
+                <w:sz w:val="15"/>
+              </w:rPr>
+              <w:t xml:space="preserve">630</w:t>
+            </w:r>
+          </w:p>
+        </w:tc>
+        <w:tc>
+          <w:tcPr>
+            <w:tcW w:w="1167" w:type="dxa"/>
+            <w:tcBorders>
+              <w:bottom w:val="single" w:sz="4" w:space="0" w:color="auto"/>
+            </w:tcBorders>
+            <w:vAlign w:val="center"/>
+          </w:tcPr>
+          <w:p>
+            <w:pPr>
+              <w:keepNext/>
+              <w:jc w:val="center"/>
+              <w:rPr>
+                <w:sz w:val="15"/>
+              </w:rPr>
+            </w:pPr>
+            <w:r>
+              <w:rPr>
+                <w:sz w:val="15"/>
+              </w:rPr>
+              <w:t xml:space="preserve">215</w:t>
+            </w:r>
+          </w:p>
+        </w:tc>
+        <w:tc>
+          <w:tcPr>
+            <w:tcW w:w="1200" w:type="dxa"/>
+            <w:tcBorders>
+              <w:bottom w:val="single" w:sz="4" w:space="0" w:color="auto"/>
+            </w:tcBorders>
+            <w:vAlign w:val="center"/>
+          </w:tcPr>
+          <w:p>
+            <w:pPr>
+              <w:keepNext/>
+              <w:jc w:val="center"/>
+              <w:rPr>
+                <w:sz w:val="15"/>
+              </w:rPr>
+            </w:pPr>
+            <w:r>
+              <w:rPr>
+                <w:sz w:val="15"/>
+              </w:rPr>
+              <w:t xml:space="preserve">&lt; 0.001</w:t>
+            </w:r>
+          </w:p>
+        </w:tc>
+      </w:tr>
+    </w:tbl>
+    <w:p>
+      <w:pPr>
+        <w:pStyle w:val="FigureCaption"/>
+        <w:spacing w:before="40" w:after="160"/>
+        <w:rPr>
+          <w:sz w:val="14"/>
+        </w:rPr>
+      </w:pPr>
+      <w:r>
+        <w:rPr>
+          <w:sz w:val="14"/>
+        </w:rPr>
+        <w:t xml:space="preserve">Diferencia: exactitud de VGG16 menos la del modelo, con intervalo </w:t>
+      </w:r>
+      <w:r>
+        <w:rPr>
+          <w:sz w:val="14"/>
+          <w:i/>
+        </w:rPr>
+        <w:t xml:space="preserve">bootstrap</w:t>
+      </w:r>
+      <w:r>
+        <w:rPr>
+          <w:sz w:val="14"/>
+        </w:rPr>
+        <w:t xml:space="preserve"> pareado (1 000 remuestreos). p: prueba exacta de McNemar sobre las imágenes en que solo uno de los dos modelos acierta. Tiempo y entrenables como en la Tabla V.</w:t>
+      </w:r>
+    </w:p>
+    <w:p>
+      <w:pPr>
+        <w:pStyle w:val="TableTitle"/>
+        <w:keepNext/>
+        <w:spacing w:before="160"/>
+      </w:pPr>
+      <w:r>
+        <w:t>Tabla VII</w:t>
       </w:r>
     </w:p>
     <w:p>
@@ -8877,7 +10160,7 @@
               <w:rPr>
                 <w:sz w:val="16"/>
               </w:rPr>
-              <w:t>14.7 millones de parámetros y 45 minutos de GPU; exige redimensionar y replicar canales; congelada rinde menos que la CNN propia; su ventaja sobre MobileNetV2 no es significativa.</w:t>
+              <w:t>14.7 millones de parámetros y 45 minutos de GPU; exige redimensionar y replicar canales; congelada rinde menos que la CNN propia; su ventaja sobre MobileNetV2 es de solo 0.76 puntos y sobre EfficientNetV2-B0 no es significativa.</w:t>
             </w:r>
           </w:p>
         </w:tc>
@@ -8889,6 +10172,68 @@
         <w:tc>
           <w:tcPr>
             <w:tcW w:w="1601" w:type="dxa"/>
+            <w:vAlign w:val="center"/>
+          </w:tcPr>
+          <w:p>
+            <w:pPr>
+              <w:rPr>
+                <w:sz w:val="16"/>
+              </w:rPr>
+            </w:pPr>
+            <w:r>
+              <w:rPr>
+                <w:sz w:val="16"/>
+              </w:rPr>
+              <w:t>MobileNetV2 (transferencia)</w:t>
+            </w:r>
+          </w:p>
+        </w:tc>
+        <w:tc>
+          <w:tcPr>
+            <w:tcW w:w="4383" w:type="dxa"/>
+            <w:vAlign w:val="center"/>
+          </w:tcPr>
+          <w:p>
+            <w:pPr>
+              <w:rPr>
+                <w:sz w:val="16"/>
+              </w:rPr>
+            </w:pPr>
+            <w:r>
+              <w:rPr>
+                <w:sz w:val="16"/>
+              </w:rPr>
+              <w:t>Solo 0.76 puntos por debajo de VGG16 con 6.5 veces menos parámetros y 8 veces menos tiempo; la mejor fase con el extractor congelado; diseñada para dispositivos móviles.</w:t>
+            </w:r>
+          </w:p>
+        </w:tc>
+        <w:tc>
+          <w:tcPr>
+            <w:tcW w:w="4383" w:type="dxa"/>
+            <w:vAlign w:val="center"/>
+          </w:tcPr>
+          <w:p>
+            <w:pPr>
+              <w:rPr>
+                <w:sz w:val="16"/>
+              </w:rPr>
+            </w:pPr>
+            <w:r>
+              <w:rPr>
+                <w:sz w:val="16"/>
+              </w:rPr>
+              <w:t>También requiere entrada de 96×96×3; el ajuste fino es sensible a la tasa de aprendizaje y a las capas de normalización; persiste el cambio de dominio respecto a ImageNet.</w:t>
+            </w:r>
+          </w:p>
+        </w:tc>
+      </w:tr>
+      <w:tr>
+        <w:trPr>
+          <w:cantSplit/>
+        </w:trPr>
+        <w:tc>
+          <w:tcPr>
+            <w:tcW w:w="1601" w:type="dxa"/>
             <w:tcBorders>
               <w:bottom w:val="single" w:sz="4" w:space="0" w:color="auto"/>
             </w:tcBorders>
@@ -8904,7 +10249,7 @@
               <w:rPr>
                 <w:sz w:val="16"/>
               </w:rPr>
-              <w:t>MobileNetV2 (transferencia)</w:t>
+              <w:t>EfficientNetV2-B0 (bono)</w:t>
             </w:r>
           </w:p>
         </w:tc>
@@ -8926,7 +10271,7 @@
               <w:rPr>
                 <w:sz w:val="16"/>
               </w:rPr>
-              <w:t>Exactitud estadísticamente empatada con VGG16 con 6.5 veces menos parámetros y 8 veces menos tiempo; la mejor fase con el extractor congelado; diseñada para dispositivos móviles.</w:t>
+              <w:t>Sin diferencia significativa con VGG16 (92.73 %, p = 0.058) con 4.5 veces menos tiempo y 0.82 millones de parámetros entrenables; trae el preprocesamiento de ImageNet dentro del modelo.</w:t>
             </w:r>
           </w:p>
         </w:tc>
@@ -8948,7 +10293,7 @@
               <w:rPr>
                 <w:sz w:val="16"/>
               </w:rPr>
-              <w:t>También requiere entrada de 96×96×3; el ajuste fino es sensible a la tasa de aprendizaje y a las capas de normalización; persiste el cambio de dominio respecto a ImageNet.</w:t>
+              <w:t>1.8 veces más lenta que MobileNetV2 sin superarla de forma significativa; congelada se estanca en 91 % y depende del ajuste fino; también requiere entrada de 96×96×3.</w:t>
             </w:r>
           </w:p>
         </w:tc>
@@ -8981,19 +10326,19 @@
         <w:rPr>
           <w:i/>
         </w:rPr>
-        <w:t>Las líneas base y los intervalos cambian la lectura de los resultados.</w:t>
-      </w:r>
-      <w:r>
-        <w:t xml:space="preserve"> Sin la regla «ayer», un MAE de 1.60 °C no dice si el modelo es bueno o malo; sin los intervalos </w:t>
+        <w:t xml:space="preserve">Las líneas base y los intervalos cambian la lectura de los resultados.</w:t>
+      </w:r>
+      <w:r>
+        <w:t xml:space="preserve"> Sin la regla «ayer», un MAE de 1.60 °C no dice si el modelo es bueno o malo. Y la forma de medir la incertidumbre también importa: con intervalos </w:t>
       </w:r>
       <w:r>
         <w:rPr>
           <w:i/>
         </w:rPr>
-        <w:t>bootstrap</w:t>
-      </w:r>
-      <w:r>
-        <w:t>, los 0.76 puntos entre VGG16 y MobileNetV2 parecerían una victoria clara.</w:t>
+        <w:t xml:space="preserve">bootstrap</w:t>
+      </w:r>
+      <w:r>
+        <w:t xml:space="preserve"> separados, VGG16 y MobileNetV2 parecían empatadas, y solo la prueba pareada, que aprovecha que ambas se evalúan sobre las mismas imágenes, mostró que su diferencia de 0.76 puntos es real.</w:t>
       </w:r>
     </w:p>
     <w:p>
@@ -9055,10 +10400,10 @@
         <w:rPr>
           <w:i/>
         </w:rPr>
-        <w:t>La transferencia necesita ajuste fino cuando cambia el dominio.</w:t>
-      </w:r>
-      <w:r>
-        <w:t xml:space="preserve"> VGG16 congelada rindió menos que la CNN propia; con el último bloque ajustado ganó cinco puntos.</w:t>
+        <w:t xml:space="preserve">La transferencia necesita ajuste fino cuando cambia el dominio.</w:t>
+      </w:r>
+      <w:r>
+        <w:t xml:space="preserve"> VGG16 congelada rindió menos que la CNN propia; con el último bloque ajustado ganó cinco puntos. EfficientNetV2-B0 repitió el patrón: congelada se estancó cerca del 91 % en validación y el ajuste fino la llevó al 93.8 %.</w:t>
       </w:r>
     </w:p>
     <w:p>
@@ -9110,10 +10455,10 @@
         <w:rPr>
           <w:i/>
         </w:rPr>
-        <w:t>Limitaciones y trabajo futuro.</w:t>
-      </w:r>
-      <w:r>
-        <w:t xml:space="preserve"> El Punto 1 usa una sola estación, una sola semilla por configuración y una prueba con poco invierno; en el Punto 2 la búsqueda cubrió diez configuraciones de 12 épocas y los modelos finales no se repitieron con varias semillas. Como trabajo futuro se propone incorporar estaciones vecinas o los pronósticos del modelo numérico AROME que también publica MeteoNet, probar convoluciones temporales o atención, repetir las corridas con varias semillas, aplicar la prueba de McNemar y extender el Punto 2 a una CNN moderna.</w:t>
+        <w:t xml:space="preserve">Limitaciones y trabajo futuro.</w:t>
+      </w:r>
+      <w:r>
+        <w:t xml:space="preserve"> El Punto 1 usa una sola estación, una sola semilla por configuración y una prueba con poco invierno; en el Punto 2 la búsqueda cubrió trece configuraciones de 12 épocas, los modelos finales no se repitieron con varias semillas y el ajuste fino de EfficientNetV2-B0 agotó sus 15 épocas sin estancarse. Como trabajo futuro se propone incorporar estaciones vecinas o los pronósticos del modelo numérico AROME que también publica MeteoNet, probar convoluciones temporales o atención, repetir las corridas con varias semillas, dar más épocas de ajuste fino y extender el bono a ConvNeXt, que el código ya deja preparado.</w:t>
       </w:r>
     </w:p>
     <w:p>
@@ -9146,7 +10491,7 @@
         <w:pStyle w:val="Text"/>
       </w:pPr>
       <w:r>
-        <w:t>En el Punto 2 se compararon tres aproximaciones en condiciones idénticas. El aprendizaje por transferencia supera con claridad a la CNN desde cero (93.19 % y 92.43 % frente a 89.04 %), pero la diferencia entre VGG16 y MobileNetV2 no es significativa y MobileNetV2 necesita ocho veces menos tiempo de entrenamiento, por lo que es la opción recomendada. La CNN propia sigue siendo valiosa cuando los recursos son muy limitados.</w:t>
+        <w:t xml:space="preserve">En el Punto 2 se compararon tres aproximaciones en condiciones idénticas y, como extensión, EfficientNetV2-B0. El aprendizaje por transferencia supera con claridad a la CNN desde cero (93.19 %, 92.73 % y 92.43 % frente a 89.04 %). La prueba pareada muestra que VGG16 supera a MobileNetV2 por 0.76 puntos, una diferencia real pero pequeña frente a un costo ocho veces mayor, y que EfficientNetV2-B0 no se distingue de VGG16 con 4.5 veces menos tiempo. Por eso EfficientNetV2-B0 es la opción recomendada cuando importa la exactitud y MobileNetV2 cuando importa el costo; la CNN propia sigue siendo valiosa cuando los recursos son muy limitados.</w:t>
       </w:r>
     </w:p>
     <w:p>
@@ -9755,6 +11100,24 @@
       </w:r>
       <w:r>
         <w:t>, 2021.</w:t>
+      </w:r>
+    </w:p>
+    <w:p>
+      <w:pPr>
+        <w:pStyle w:val="References"/>
+        <w:jc w:val="left"/>
+      </w:pPr>
+      <w:r>
+        <w:t xml:space="preserve">M. Tan and Q. V. Le, “EfficientNetV2: Smaller models and faster training,” in </w:t>
+      </w:r>
+      <w:r>
+        <w:rPr>
+          <w:i/>
+        </w:rPr>
+        <w:t xml:space="preserve">Proc. 38th Int. Conf. Mach. Learn. (ICML)</w:t>
+      </w:r>
+      <w:r>
+        <w:t xml:space="preserve">, 2021, pp. 10096–10106.</w:t>
       </w:r>
     </w:p>
     <w:sectPr>

</xml_diff>

<commit_message>
referencias cruzadas a figuras y tablas en el informe
</commit_message>
<xml_diff>
--- a/report/Informe_Taller1_IEEE.docx
+++ b/report/Informe_Taller1_IEEE.docx
@@ -17,6 +17,12 @@
           <w:szCs w:val="18"/>
         </w:rPr>
         <w:footnoteReference w:customMarkFollows="1" w:id="1"/>
+      </w:r>
+      <w:r>
+        <w:rPr>
+          <w:sz w:val="18"/>
+          <w:szCs w:val="18"/>
+        </w:rPr>
         <w:sym w:font="Symbol" w:char="F020"/>
       </w:r>
     </w:p>
@@ -192,7 +198,6 @@
         <w:t xml:space="preserve">La Sección II resume el trabajo relacionado; las Secciones III y IV presentan el diseño experimental y los resultados de cada punto; la Sección V reúne las lecciones aprendidas y la Sección VI concluye. El código, los resultados y las figuras están en el </w:t>
       </w:r>
       <w:r>
-        <w:lastRenderedPageBreak/>
         <w:t>repositorio del trabajo [10].</w:t>
       </w:r>
     </w:p>
@@ -362,7 +367,61 @@
         <w:pStyle w:val="Text"/>
       </w:pPr>
       <w:r>
-        <w:t>La Fig. 1 resume la estructura de la serie. El ciclo anual domina —la mediana mensual va de unos 5 °C en febrero a 18 °C en julio— y el ciclo diario tiene una amplitud moderada, de 2.8 °C en invierno a 5.9 °C en verano, propia de una estación costera en la que el mar amortigua los extremos. La autocorrelación (Fig. 2a) conserva picos altos en los múltiplos de 24 h: 0.90 a un día, 0.81 a tres y 0.74 a siete, lo que indica que varios días de historia contienen información útil. El error de la persistencia (Fig. 2b) muestra que la dificultad no crece de forma monótona: es de 0.56 °C a 1 h, sube a 3.36 °C a 12 h y vuelve a bajar a 2.08 °C a 24 h, porque a un día de distancia se compara la misma hora.</w:t>
+        <w:t xml:space="preserve">La </w:t>
+      </w:r>
+      <w:r>
+        <w:fldChar w:fldCharType="begin"/>
+      </w:r>
+      <w:r>
+        <w:instrText xml:space="preserve"> REF _RefFig1 \h </w:instrText>
+      </w:r>
+      <w:r>
+        <w:fldChar w:fldCharType="separate"/>
+      </w:r>
+      <w:r>
+        <w:t xml:space="preserve">Fig. 1</w:t>
+      </w:r>
+      <w:r>
+        <w:fldChar w:fldCharType="end"/>
+      </w:r>
+      <w:r>
+        <w:t xml:space="preserve"> resume la estructura de la serie. El ciclo anual domina —la mediana mensual va de unos 5 °C en febrero a 18 °C en julio— y el ciclo diario tiene una amplitud moderada, de 2.8 °C en invierno a 5.9 °C en verano, propia de una estación costera en la que el mar amortigua los extremos. La autocorrelación (</w:t>
+      </w:r>
+      <w:r>
+        <w:fldChar w:fldCharType="begin"/>
+      </w:r>
+      <w:r>
+        <w:instrText xml:space="preserve"> REF _RefFig2 \h </w:instrText>
+      </w:r>
+      <w:r>
+        <w:fldChar w:fldCharType="separate"/>
+      </w:r>
+      <w:r>
+        <w:t xml:space="preserve">Fig. 2</w:t>
+      </w:r>
+      <w:r>
+        <w:fldChar w:fldCharType="end"/>
+      </w:r>
+      <w:r>
+        <w:t xml:space="preserve">a) conserva picos altos en los múltiplos de 24 h: 0.90 a un día, 0.81 a tres y 0.74 a siete, lo que indica que varios días de historia contienen información útil. El error de la persistencia (</w:t>
+      </w:r>
+      <w:r>
+        <w:fldChar w:fldCharType="begin"/>
+      </w:r>
+      <w:r>
+        <w:instrText xml:space="preserve"> REF _RefFig2 \h </w:instrText>
+      </w:r>
+      <w:r>
+        <w:fldChar w:fldCharType="separate"/>
+      </w:r>
+      <w:r>
+        <w:t xml:space="preserve">Fig. 2</w:t>
+      </w:r>
+      <w:r>
+        <w:fldChar w:fldCharType="end"/>
+      </w:r>
+      <w:r>
+        <w:t xml:space="preserve">b) muestra que la dificultad no crece de forma monótona: es de 0.56 °C a 1 h, sube a 3.36 °C a 12 h y vuelve a bajar a 2.08 °C a 24 h, porque a un día de distancia se compara la misma hora.</w:t>
       </w:r>
     </w:p>
     <w:p>
@@ -417,8 +476,13 @@
         <w:pStyle w:val="FigureCaption"/>
         <w:spacing w:before="60" w:after="160"/>
       </w:pPr>
-      <w:r>
-        <w:t>Fig. 1. Estructura de la temperatura en la estación 62548002 (2016–2018). (a) Mediana mensual y rango intercuartil: el ciclo anual abarca unos 13 °C. (b) Temperatura media por hora del día según la estación del año; entre paréntesis, la amplitud del ciclo diario.</w:t>
+      <w:bookmarkStart w:id="101" w:name="_RefFig1"/>
+      <w:r>
+        <w:t xml:space="preserve">Fig. 1</w:t>
+      </w:r>
+      <w:bookmarkEnd w:id="101"/>
+      <w:r>
+        <w:t xml:space="preserve">. Estructura de la temperatura en la estación 62548002 (2016–2018). (a) Mediana mensual y rango intercuartil: el ciclo anual abarca unos 13 °C. (b) Temperatura media por hora del día según la estación del año; entre paréntesis, la amplitud del ciclo diario.</w:t>
       </w:r>
     </w:p>
     <w:p>
@@ -431,7 +495,6 @@
         <w:rPr>
           <w:noProof/>
         </w:rPr>
-        <w:lastRenderedPageBreak/>
         <w:drawing>
           <wp:inline distT="0" distB="0" distL="0" distR="0" wp14:anchorId="1B981635" wp14:editId="346513ED">
             <wp:extent cx="3200400" cy="3126740"/>
@@ -474,8 +537,13 @@
         <w:pStyle w:val="FigureCaption"/>
         <w:spacing w:before="60" w:after="160"/>
       </w:pPr>
-      <w:r>
-        <w:t>Fig. 2. (a) Autocorrelación de la temperatura horaria; la zona sombreada es la ventana de entrada elegida (168 h). (b) Error absoluto medio de la persistencia según el horizonte, calculado sobre toda la serie.</w:t>
+      <w:bookmarkStart w:id="102" w:name="_RefFig2"/>
+      <w:r>
+        <w:t xml:space="preserve">Fig. 2</w:t>
+      </w:r>
+      <w:bookmarkEnd w:id="102"/>
+      <w:r>
+        <w:t xml:space="preserve">. (a) Autocorrelación de la temperatura horaria; la zona sombreada es la ventana de entrada elegida (168 h). (b) Error absoluto medio de la persistencia según el horizonte, calculado sobre toda la serie.</w:t>
       </w:r>
     </w:p>
     <w:p>
@@ -1049,7 +1117,25 @@
         <w:ind w:firstLine="0"/>
       </w:pPr>
       <w:r>
-        <w:t>El horizonte de 24 h se eligió porque corresponde al uso habitual —el pronóstico del día siguiente— y porque, como muestra la Fig. 2b, no es trivial. La propuesta inicial de ventana era de 72 h, sustentada en la autocorrelación; la longitud final de 168 h salió de la búsqueda de la Sección III-F. Como referencia se entrenó también la misma arquitectura para un horizonte de 1 h.</w:t>
+        <w:t xml:space="preserve">El horizonte de 24 h se eligió porque corresponde al uso habitual —el pronóstico del día siguiente— y porque, como muestra la </w:t>
+      </w:r>
+      <w:r>
+        <w:fldChar w:fldCharType="begin"/>
+      </w:r>
+      <w:r>
+        <w:instrText xml:space="preserve"> REF _RefFig2 \h </w:instrText>
+      </w:r>
+      <w:r>
+        <w:fldChar w:fldCharType="separate"/>
+      </w:r>
+      <w:r>
+        <w:t xml:space="preserve">Fig. 2</w:t>
+      </w:r>
+      <w:r>
+        <w:fldChar w:fldCharType="end"/>
+      </w:r>
+      <w:r>
+        <w:t xml:space="preserve">b, no es trivial. La propuesta inicial de ventana era de 72 h, sustentada en la autocorrelación; la longitud final de 168 h salió de la búsqueda de la Sección III-F. Como referencia se entrenó también la misma arquitectura para un horizonte de 1 h.</w:t>
       </w:r>
     </w:p>
     <w:p>
@@ -1071,7 +1157,25 @@
         <w:pStyle w:val="Text"/>
       </w:pPr>
       <w:r>
-        <w:t xml:space="preserve">La serie se partió por fechas y sin barajar (Fig. 3): el 59.5 % para entrenamiento (enero de 2016 a octubre de 2017), el 10.5 % para validación (octubre de 2017 a febrero de 2018) y el 30 % final para prueba (febrero a diciembre de 2018), como </w:t>
+        <w:t xml:space="preserve">La serie se partió por fechas y sin barajar (</w:t>
+      </w:r>
+      <w:r>
+        <w:fldChar w:fldCharType="begin"/>
+      </w:r>
+      <w:r>
+        <w:instrText xml:space="preserve"> REF _RefFig3 \h </w:instrText>
+      </w:r>
+      <w:r>
+        <w:fldChar w:fldCharType="separate"/>
+      </w:r>
+      <w:r>
+        <w:t xml:space="preserve">Fig. 3</w:t>
+      </w:r>
+      <w:r>
+        <w:fldChar w:fldCharType="end"/>
+      </w:r>
+      <w:r>
+        <w:t xml:space="preserve">): el 59.5 % para entrenamiento (enero de 2016 a octubre de 2017), el 10.5 % para validación (octubre de 2017 a febrero de 2018) y el 30 % final para prueba (febrero a diciembre de 2018), como </w:t>
       </w:r>
       <w:r>
         <w:t xml:space="preserve">pide el enunciado. Para evitar fugas: 1) la media y la desviación estándar de la estandarización se calcularon solo con entrenamiento; 2) las ventanas se construyeron dentro de cada conjunto, de modo que ninguna muestra mezcla horas de dos conjuntos; 3) la climatología usada como línea base se calculó solo con entrenamiento, y 4) el conjunto de prueba no intervino en ninguna decisión. Con </w:t>
@@ -1138,8 +1242,13 @@
         <w:pStyle w:val="FigureCaption"/>
         <w:spacing w:before="60" w:after="160"/>
       </w:pPr>
-      <w:r>
-        <w:t>Fig. 3. Partición cronológica de la serie horaria. Las líneas punteadas marcan los cortes; el conjunto de prueba es el 30 % final.</w:t>
+      <w:bookmarkStart w:id="103" w:name="_RefFig3"/>
+      <w:r>
+        <w:t xml:space="preserve">Fig. 3</w:t>
+      </w:r>
+      <w:bookmarkEnd w:id="103"/>
+      <w:r>
+        <w:t xml:space="preserve">. Partición cronológica de la serie horaria. Las líneas punteadas marcan los cortes; el conjunto de prueba es el 30 % final.</w:t>
       </w:r>
     </w:p>
     <w:p>
@@ -1280,10 +1389,45 @@
         <w:pStyle w:val="Text"/>
       </w:pPr>
       <w:r>
-        <w:t xml:space="preserve">La Fig. 4 y la Tabla I resumen las 18 corridas. En la etapa 1, con 64 unidades y 72 h, SimpleRNN (1.523 °C) y GRU </w:t>
-      </w:r>
-      <w:r>
-        <w:lastRenderedPageBreak/>
+        <w:t xml:space="preserve">La </w:t>
+      </w:r>
+      <w:r>
+        <w:fldChar w:fldCharType="begin"/>
+      </w:r>
+      <w:r>
+        <w:instrText xml:space="preserve"> REF _RefFig4 \h </w:instrText>
+      </w:r>
+      <w:r>
+        <w:fldChar w:fldCharType="separate"/>
+      </w:r>
+      <w:r>
+        <w:t xml:space="preserve">Fig. 4</w:t>
+      </w:r>
+      <w:r>
+        <w:fldChar w:fldCharType="end"/>
+      </w:r>
+      <w:r>
+        <w:t xml:space="preserve"> y la </w:t>
+      </w:r>
+      <w:r>
+        <w:fldChar w:fldCharType="begin"/>
+      </w:r>
+      <w:r>
+        <w:instrText xml:space="preserve"> REF _RefTablaI \h </w:instrText>
+      </w:r>
+      <w:r>
+        <w:fldChar w:fldCharType="separate"/>
+      </w:r>
+      <w:r>
+        <w:t xml:space="preserve">Tabla I</w:t>
+      </w:r>
+      <w:r>
+        <w:fldChar w:fldCharType="end"/>
+      </w:r>
+      <w:r>
+        <w:t xml:space="preserve"> resumen las 18 corridas. En la etapa 1, con 64 unidades y 72 h, SimpleRNN (1.523 °C) y GRU </w:t>
+      </w:r>
+      <w:r>
         <w:t>(1.525 °C) empataron y LSTM quedó atrás (1.615 °C). Las curvas de entrenamiento explican la diferencia: LSTM y GRU alcanzaron su mejor época en la 5 y en la 6, y desde ahí el error de validación subió mientras el de entrenamiento seguía bajando; la SimpleRNN, en cambio, mejoró hasta la época 14. Con 2.5 a 3.3 veces más parámetros para las mismas 15 555 muestras, las celdas con compuertas sobreajustan antes.</w:t>
       </w:r>
     </w:p>
@@ -1293,9 +1437,11 @@
         <w:keepNext/>
         <w:spacing w:before="160"/>
       </w:pPr>
-      <w:r>
-        <w:t>Tabla I</w:t>
-      </w:r>
+      <w:bookmarkStart w:id="104" w:name="_RefTablaI"/>
+      <w:r>
+        <w:t>Tabla I</w:t>
+      </w:r>
+      <w:bookmarkEnd w:id="104"/>
     </w:p>
     <w:p>
       <w:pPr>
@@ -3909,8 +4055,13 @@
         <w:pStyle w:val="FigureCaption"/>
         <w:spacing w:before="60" w:after="160"/>
       </w:pPr>
-      <w:r>
-        <w:t>Fig. 4. Búsqueda de hiperparámetros del Punto 1. Cada fila es una corrida: el punto lleno es el MAE de validación y el hueco, el de entrenamiento; la distancia entre ambos mide el sobreajuste. En naranja, la ganadora de cada etapa.</w:t>
+      <w:bookmarkStart w:id="105" w:name="_RefFig4"/>
+      <w:r>
+        <w:t xml:space="preserve">Fig. 4</w:t>
+      </w:r>
+      <w:bookmarkEnd w:id="105"/>
+      <w:r>
+        <w:t xml:space="preserve">. Búsqueda de hiperparámetros del Punto 1. Cada fila es una corrida: el punto lleno es el MAE de validación y el hueco, el de entrenamiento; la distancia entre ambos mide el sobreajuste. En naranja, la ganadora de cada etapa.</w:t>
       </w:r>
     </w:p>
     <w:p>
@@ -3932,7 +4083,43 @@
         <w:pStyle w:val="Text"/>
       </w:pPr>
       <w:r>
-        <w:t>La Tabla II compara el modelo final con las líneas base sobre las 7 701 ventanas de prueba. La RNN obtiene un MAE de 1.602 °C y un RMSE de 2.142 °C, un 24.7 % por debajo de «ayer», la línea base más fuerte (2.128 °C); la persistencia y la climatología quedan en 2.785 y 2.871 °C. La Fig. 5 muestra que la ventaja se mantiene en los 24 horizontes: el error de la RNN crece de forma suave, de 0.54 °C a 1 h a 1.94 °C a 24 h. La mayor ganancia está entre 4 y 20 h, donde la persistencia se dispara; a 24 h la ventaja sobre «ayer» se reduce (1.94 frente a 2.13 °C), porque en ese punto el ciclo diario ya le da a esa regla casi toda la información. Con el horizonte de referencia de 1 h, la misma arquitectura logra 0.41 °C frente a 0.61 °C de la persistencia.</w:t>
+        <w:t xml:space="preserve">La </w:t>
+      </w:r>
+      <w:r>
+        <w:fldChar w:fldCharType="begin"/>
+      </w:r>
+      <w:r>
+        <w:instrText xml:space="preserve"> REF _RefTablaII \h </w:instrText>
+      </w:r>
+      <w:r>
+        <w:fldChar w:fldCharType="separate"/>
+      </w:r>
+      <w:r>
+        <w:t xml:space="preserve">Tabla II</w:t>
+      </w:r>
+      <w:r>
+        <w:fldChar w:fldCharType="end"/>
+      </w:r>
+      <w:r>
+        <w:t xml:space="preserve"> compara el modelo final con las líneas base sobre las 7 701 ventanas de prueba. La RNN obtiene un MAE de 1.602 °C y un RMSE de 2.142 °C, un 24.7 % por debajo de «ayer», la línea base más fuerte (2.128 °C); la persistencia y la climatología quedan en 2.785 y 2.871 °C. La </w:t>
+      </w:r>
+      <w:r>
+        <w:fldChar w:fldCharType="begin"/>
+      </w:r>
+      <w:r>
+        <w:instrText xml:space="preserve"> REF _RefFig5 \h </w:instrText>
+      </w:r>
+      <w:r>
+        <w:fldChar w:fldCharType="separate"/>
+      </w:r>
+      <w:r>
+        <w:t xml:space="preserve">Fig. 5</w:t>
+      </w:r>
+      <w:r>
+        <w:fldChar w:fldCharType="end"/>
+      </w:r>
+      <w:r>
+        <w:t xml:space="preserve"> muestra que la ventaja se mantiene en los 24 horizontes: el error de la RNN crece de forma suave, de 0.54 °C a 1 h a 1.94 °C a 24 h. La mayor ganancia está entre 4 y 20 h, donde la persistencia se dispara; a 24 h la ventaja sobre «ayer» se reduce (1.94 frente a 2.13 °C), porque en ese punto el ciclo diario ya le da a esa regla casi toda la información. Con el horizonte de referencia de 1 h, la misma arquitectura logra 0.41 °C frente a 0.61 °C de la persistencia.</w:t>
       </w:r>
     </w:p>
     <w:p>
@@ -3941,9 +4128,11 @@
         <w:keepNext/>
         <w:spacing w:before="160"/>
       </w:pPr>
-      <w:r>
-        <w:t>Tabla II</w:t>
-      </w:r>
+      <w:bookmarkStart w:id="106" w:name="_RefTablaII"/>
+      <w:r>
+        <w:t>Tabla II</w:t>
+      </w:r>
+      <w:bookmarkEnd w:id="106"/>
     </w:p>
     <w:p>
       <w:pPr>
@@ -4484,7 +4673,6 @@
         <w:rPr>
           <w:noProof/>
         </w:rPr>
-        <w:lastRenderedPageBreak/>
         <w:drawing>
           <wp:inline distT="0" distB="0" distL="0" distR="0" wp14:anchorId="30B5B17A" wp14:editId="55851977">
             <wp:extent cx="3200400" cy="2063115"/>
@@ -4527,8 +4715,13 @@
         <w:pStyle w:val="FigureCaption"/>
         <w:spacing w:before="60" w:after="160"/>
       </w:pPr>
-      <w:r>
-        <w:t>Fig. 5. MAE en el conjunto de prueba según el horizonte. La RNN queda por debajo de las tres líneas base en los 24 horizontes; a la derecha, los valores a 24 h.</w:t>
+      <w:bookmarkStart w:id="107" w:name="_RefFig5"/>
+      <w:r>
+        <w:t xml:space="preserve">Fig. 5</w:t>
+      </w:r>
+      <w:bookmarkEnd w:id="107"/>
+      <w:r>
+        <w:t xml:space="preserve">. MAE en el conjunto de prueba según el horizonte. La RNN queda por debajo de las tres líneas base en los 24 horizontes; a la derecha, los valores a 24 h.</w:t>
       </w:r>
     </w:p>
     <w:p>
@@ -4536,7 +4729,25 @@
         <w:pStyle w:val="Text"/>
       </w:pPr>
       <w:r>
-        <w:t xml:space="preserve">El análisis por mes y por hora de emisión (Fig. 6) muestra que la RNN le gana a «ayer» en todos los meses y que la ventaja es mayor en los meses de transición, cuando el tiempo cambia bruscamente de un día a otro: en abril el error baja de 2.71 a </w:t>
+        <w:t xml:space="preserve">El análisis por mes y por hora de emisión (</w:t>
+      </w:r>
+      <w:r>
+        <w:fldChar w:fldCharType="begin"/>
+      </w:r>
+      <w:r>
+        <w:instrText xml:space="preserve"> REF _RefFig6 \h </w:instrText>
+      </w:r>
+      <w:r>
+        <w:fldChar w:fldCharType="separate"/>
+      </w:r>
+      <w:r>
+        <w:t xml:space="preserve">Fig. 6</w:t>
+      </w:r>
+      <w:r>
+        <w:fldChar w:fldCharType="end"/>
+      </w:r>
+      <w:r>
+        <w:t xml:space="preserve">) muestra que la RNN le gana a «ayer» en todos los meses y que la ventaja es mayor en los meses de transición, cuando el tiempo cambia bruscamente de un día a otro: en abril el error baja de 2.71 a </w:t>
       </w:r>
       <w:r>
         <w:t>1.78 °C. Los meses más fáciles fueron mayo y junio (1.41 y 1.47 °C); en junio ambos modelos casi empatan porque los días se parecen mucho entre sí. Por hora de emisión, los pronósticos hechos de madrugada (3 a 5 UTC) son los peores (1.72 °C) y los emitidos hacia el mediodía, los mejores (1.50 °C): a mediodía la red ya observó cómo empezó el día, mientras que de madrugada debe anticipar el máximo de la tarde con la información del día anterior.</w:t>
@@ -4559,7 +4770,25 @@
         </w:sectPr>
       </w:pPr>
       <w:r>
-        <w:t>Los ejemplos de la Fig. 7 ilustran tres situaciones. En el mejor día (17 de mayo, MAE de 0.20 °C) el ciclo es regular y la red lo reproduce casi exactamente. En el día típico (21 de julio, 1.51 °C) la forma es correcta, pero la red suaviza el máximo de la tarde: predice cerca de 21 °C cuando se alcanzaron 23.7 °C. En el peor día (17 de marzo, 6.94 °C) entra un frente frío y la temperatura cae de 6 °C a −1 °C; ni la red ni «ayer» lo anticipan, porque nada en las 168 horas previas de esta estación lo anuncia. El sesgo medio es de +0.11 °C, los errores son simétricos y el 95 % de los errores absolutos está por debajo de 4.4 °C; las colas corresponden a cambios de masa de aire como el del ejemplo.</w:t>
+        <w:t xml:space="preserve">Los ejemplos de la </w:t>
+      </w:r>
+      <w:r>
+        <w:fldChar w:fldCharType="begin"/>
+      </w:r>
+      <w:r>
+        <w:instrText xml:space="preserve"> REF _RefFig7 \h </w:instrText>
+      </w:r>
+      <w:r>
+        <w:fldChar w:fldCharType="separate"/>
+      </w:r>
+      <w:r>
+        <w:t xml:space="preserve">Fig. 7</w:t>
+      </w:r>
+      <w:r>
+        <w:fldChar w:fldCharType="end"/>
+      </w:r>
+      <w:r>
+        <w:t xml:space="preserve"> ilustran tres situaciones. En el mejor día (17 de mayo, MAE de 0.20 °C) el ciclo es regular y la red lo reproduce casi exactamente. En el día típico (21 de julio, 1.51 °C) la forma es correcta, pero la red suaviza el máximo de la tarde: predice cerca de 21 °C cuando se alcanzaron 23.7 °C. En el peor día (17 de marzo, 6.94 °C) entra un frente frío y la temperatura cae de 6 °C a −1 °C; ni la red ni «ayer» lo anticipan, porque nada en las 168 horas previas de esta estación lo anuncia. El sesgo medio es de +0.11 °C, los errores son simétricos y el 95 % de los errores absolutos está por debajo de 4.4 °C; las colas corresponden a cambios de masa de aire como el del ejemplo.</w:t>
       </w:r>
     </w:p>
     <w:p>
@@ -4614,8 +4843,13 @@
         <w:pStyle w:val="FigureCaption"/>
         <w:spacing w:before="60" w:after="160"/>
       </w:pPr>
-      <w:r>
-        <w:t>Fig. 6. MAE de la RNN y de la línea base «ayer» en el conjunto de prueba, (izquierda) por mes de 2018 y (derecha) según la hora en que se emite el pronóstico.</w:t>
+      <w:bookmarkStart w:id="108" w:name="_RefFig6"/>
+      <w:r>
+        <w:t xml:space="preserve">Fig. 6</w:t>
+      </w:r>
+      <w:bookmarkEnd w:id="108"/>
+      <w:r>
+        <w:t xml:space="preserve">. MAE de la RNN y de la línea base «ayer» en el conjunto de prueba, (izquierda) por mes de 2018 y (derecha) según la hora en que se emite el pronóstico.</w:t>
       </w:r>
     </w:p>
     <w:p>
@@ -4676,8 +4910,13 @@
           <w:cols w:space="288"/>
         </w:sectPr>
       </w:pPr>
-      <w:r>
-        <w:t>Fig. 7. Pronósticos emitidos a medianoche para el mejor día, un día típico (mediana del error) y el peor día del conjunto de prueba: 48 h observadas, las 24 h reales y las predicciones de la RNN y de «ayer».</w:t>
+      <w:bookmarkStart w:id="109" w:name="_RefFig7"/>
+      <w:r>
+        <w:t xml:space="preserve">Fig. 7</w:t>
+      </w:r>
+      <w:bookmarkEnd w:id="109"/>
+      <w:r>
+        <w:t xml:space="preserve">. Pronósticos emitidos a medianoche para el mejor día, un día típico (mediana del error) y el peor día del conjunto de prueba: 48 h observadas, las 24 h reales y las predicciones de la RNN y de «ayer».</w:t>
       </w:r>
     </w:p>
     <w:p>
@@ -4731,7 +4970,6 @@
         <w:t xml:space="preserve"> y las celdas con </w:t>
       </w:r>
       <w:r>
-        <w:lastRenderedPageBreak/>
         <w:t>compuertas. Que la SimpleRNN supere a LSTM y GRU no contradice la literatura [12]: con 168 pasos el desvanecimiento del gradiente [11] sigue presente, pero la información más útil está en las últimas horas y en las variables de calendario, de modo que la memoria de largo plazo de las compuertas no compensa la capacidad adicional que traen. El límite del modelo está en la información: los peores días son frentes que una sola estación no puede anticipar sin datos espaciales o de un modelo numérico.</w:t>
       </w:r>
     </w:p>
@@ -4762,7 +5000,25 @@
         <w:pStyle w:val="Text"/>
       </w:pPr>
       <w:r>
-        <w:t>Fashion-MNIST tiene 60 000 imágenes de desarrollo y 10 000 de prueba, de 28 × 28 píxeles en escala de grises y diez clases balanceadas (Fig. 8). Antes de partir los datos se verificó su integridad: tipo uint8, rango de 0 a 255, diez etiquetas, ninguna imagen repetida dentro del desarrollo y ninguna imagen de prueba repetida en el desarrollo. El desarrollo se partió de forma estratificada en 54 000 imágenes de entrenamiento y 6 000 de validación (5 400 y 600 por clase); la prueba conserva sus 1 000 imágenes por clase y solo se usó en la evaluación final.</w:t>
+        <w:t xml:space="preserve">Fashion-MNIST tiene 60 000 imágenes de desarrollo y 10 000 de prueba, de 28 × 28 píxeles en escala de grises y diez clases balanceadas (</w:t>
+      </w:r>
+      <w:r>
+        <w:fldChar w:fldCharType="begin"/>
+      </w:r>
+      <w:r>
+        <w:instrText xml:space="preserve"> REF _RefFig8 \h </w:instrText>
+      </w:r>
+      <w:r>
+        <w:fldChar w:fldCharType="separate"/>
+      </w:r>
+      <w:r>
+        <w:t xml:space="preserve">Fig. 8</w:t>
+      </w:r>
+      <w:r>
+        <w:fldChar w:fldCharType="end"/>
+      </w:r>
+      <w:r>
+        <w:t xml:space="preserve">). Antes de partir los datos se verificó su integridad: tipo uint8, rango de 0 a 255, diez etiquetas, ninguna imagen repetida dentro del desarrollo y ninguna imagen de prueba repetida en el desarrollo. El desarrollo se partió de forma estratificada en 54 000 imágenes de entrenamiento y 6 000 de validación (5 400 y 600 por clase); la prueba conserva sus 1 000 imágenes por clase y solo se usó en la evaluación final.</w:t>
       </w:r>
     </w:p>
     <w:p>
@@ -4817,8 +5073,13 @@
         <w:pStyle w:val="FigureCaption"/>
         <w:spacing w:before="60" w:after="160"/>
       </w:pPr>
-      <w:r>
-        <w:t>Fig. 8. Una imagen de cada clase de Fashion-MNIST (28 × 28 píxeles).</w:t>
+      <w:bookmarkStart w:id="110" w:name="_RefFig8"/>
+      <w:r>
+        <w:t xml:space="preserve">Fig. 8</w:t>
+      </w:r>
+      <w:bookmarkEnd w:id="110"/>
+      <w:r>
+        <w:t xml:space="preserve">. Una imagen de cada clase de Fashion-MNIST (28 × 28 píxeles).</w:t>
       </w:r>
     </w:p>
     <w:p>
@@ -4857,7 +5118,25 @@
         <w:pStyle w:val="Text"/>
       </w:pPr>
       <w:r>
-        <w:t xml:space="preserve">La Tabla III resume las tres redes. La </w:t>
+        <w:t xml:space="preserve">La </w:t>
+      </w:r>
+      <w:r>
+        <w:fldChar w:fldCharType="begin"/>
+      </w:r>
+      <w:r>
+        <w:instrText xml:space="preserve"> REF _RefTablaIII \h </w:instrText>
+      </w:r>
+      <w:r>
+        <w:fldChar w:fldCharType="separate"/>
+      </w:r>
+      <w:r>
+        <w:t xml:space="preserve">Tabla III</w:t>
+      </w:r>
+      <w:r>
+        <w:fldChar w:fldCharType="end"/>
+      </w:r>
+      <w:r>
+        <w:t xml:space="preserve"> resume las tres redes. La </w:t>
       </w:r>
       <w:r>
         <w:rPr>
@@ -4963,9 +5242,11 @@
         <w:keepNext/>
         <w:spacing w:before="160"/>
       </w:pPr>
-      <w:r>
-        <w:t>Tabla III</w:t>
-      </w:r>
+      <w:bookmarkStart w:id="111" w:name="_RefTablaIII"/>
+      <w:r>
+        <w:t>Tabla III</w:t>
+      </w:r>
+      <w:bookmarkEnd w:id="111"/>
     </w:p>
     <w:p>
       <w:pPr>
@@ -5292,6 +5573,11 @@
                 <w:sz w:val="16"/>
               </w:rPr>
               <w:br/>
+            </w:r>
+            <w:r>
+              <w:rPr>
+                <w:sz w:val="16"/>
+              </w:rPr>
               <w:t>7 084 554</w:t>
             </w:r>
           </w:p>
@@ -5398,6 +5684,11 @@
                 <w:sz w:val="16"/>
               </w:rPr>
               <w:br/>
+            </w:r>
+            <w:r>
+              <w:rPr>
+                <w:sz w:val="16"/>
+              </w:rPr>
               <w:t>1 207 690</w:t>
             </w:r>
           </w:p>
@@ -5465,7 +5756,43 @@
         <w:t>−4</w:t>
       </w:r>
       <w:r>
-        <w:t>). La selección usó la mayor exactitud de validación y, como desempate, la menor pérdida. La Tabla IV y la Fig. 9 muestran las diez corridas.</w:t>
+        <w:t xml:space="preserve">). La selección usó la mayor exactitud de validación y, como desempate, la menor pérdida. La </w:t>
+      </w:r>
+      <w:r>
+        <w:fldChar w:fldCharType="begin"/>
+      </w:r>
+      <w:r>
+        <w:instrText xml:space="preserve"> REF _RefTablaIV \h </w:instrText>
+      </w:r>
+      <w:r>
+        <w:fldChar w:fldCharType="separate"/>
+      </w:r>
+      <w:r>
+        <w:t xml:space="preserve">Tabla IV</w:t>
+      </w:r>
+      <w:r>
+        <w:fldChar w:fldCharType="end"/>
+      </w:r>
+      <w:r>
+        <w:t xml:space="preserve"> y la </w:t>
+      </w:r>
+      <w:r>
+        <w:fldChar w:fldCharType="begin"/>
+      </w:r>
+      <w:r>
+        <w:instrText xml:space="preserve"> REF _RefFig9 \h </w:instrText>
+      </w:r>
+      <w:r>
+        <w:fldChar w:fldCharType="separate"/>
+      </w:r>
+      <w:r>
+        <w:t xml:space="preserve">Fig. 9</w:t>
+      </w:r>
+      <w:r>
+        <w:fldChar w:fldCharType="end"/>
+      </w:r>
+      <w:r>
+        <w:t xml:space="preserve"> muestran las diez corridas.</w:t>
       </w:r>
     </w:p>
     <w:p>
@@ -5503,8 +5830,25 @@
         <w:t xml:space="preserve"> quedó subentrenada en las tres </w:t>
       </w:r>
       <w:r>
-        <w:lastRenderedPageBreak/>
-        <w:t xml:space="preserve">familias, con curvas que seguían subiendo al final de las 12 épocas. Duplicar los filtros de la CNN (64–128) apenas cambió la validación (82.53 % frente a 82.12 %, ambas con aumentación) y triplicó los parámetros. El panel derecho de la Fig. 9 aclara un detalle: la brecha entre entrenamiento y validación es negativa en casi todas las corridas porque la exactitud de entrenamiento se mide con </w:t>
+        <w:t xml:space="preserve">familias, con curvas que seguían subiendo al final de las 12 épocas. Duplicar los filtros de la CNN (64–128) apenas cambió la validación (82.53 % frente a 82.12 %, ambas con aumentación) y triplicó los parámetros. El panel derecho de la </w:t>
+      </w:r>
+      <w:r>
+        <w:fldChar w:fldCharType="begin"/>
+      </w:r>
+      <w:r>
+        <w:instrText xml:space="preserve"> REF _RefFig9 \h </w:instrText>
+      </w:r>
+      <w:r>
+        <w:fldChar w:fldCharType="separate"/>
+      </w:r>
+      <w:r>
+        <w:t xml:space="preserve">Fig. 9</w:t>
+      </w:r>
+      <w:r>
+        <w:fldChar w:fldCharType="end"/>
+      </w:r>
+      <w:r>
+        <w:t xml:space="preserve"> aclara un detalle: la brecha entre entrenamiento y validación es negativa en casi todas las corridas porque la exactitud de entrenamiento se mide con </w:t>
       </w:r>
       <w:r>
         <w:rPr>
@@ -5522,9 +5866,11 @@
         <w:keepNext/>
         <w:spacing w:before="160"/>
       </w:pPr>
-      <w:r>
-        <w:t>Tabla IV</w:t>
-      </w:r>
+      <w:bookmarkStart w:id="112" w:name="_RefTablaIV"/>
+      <w:r>
+        <w:t>Tabla IV</w:t>
+      </w:r>
+      <w:bookmarkEnd w:id="112"/>
     </w:p>
     <w:p>
       <w:pPr>
@@ -7112,7 +7458,25 @@
         </w:sectPr>
       </w:pPr>
       <w:r>
-        <w:t>Con la mejor configuración de cada familia se entrenó sobre las 54 000 imágenes hasta 30 épocas, más 15 de ajuste fino para las preentrenadas, siempre con parada temprana (Fig. 10). La CNN usó las 30 épocas y su mejor época fue la 28, con 89.47 % en validación. VGG16 se estancó en la fase congelada (88.67 % en la época 26), por debajo de la CNN propia, y el ajuste fino le dio el mayor salto del experimento: hasta 93.65 % en validación. MobileNetV2 partió más alto con el extractor congelado (90.77 %) y el ajuste fino la llevó a 93.17 %. El contraste confirma que las características de ImageNet no se transfieren tal cual a prendas pequeñas en escala de grises [21], [22]: el cambio de dominio exige adaptar al menos el último bloque. Hay que declarar también que la CNN no tuvo fase de ajuste fino, así que las preentrenadas recibieron más épocas de entrenamiento en total.</w:t>
+        <w:t xml:space="preserve">Con la mejor configuración de cada familia se entrenó sobre las 54 000 imágenes hasta 30 épocas, más 15 de ajuste fino para las preentrenadas, siempre con parada temprana (</w:t>
+      </w:r>
+      <w:r>
+        <w:fldChar w:fldCharType="begin"/>
+      </w:r>
+      <w:r>
+        <w:instrText xml:space="preserve"> REF _RefFig10 \h </w:instrText>
+      </w:r>
+      <w:r>
+        <w:fldChar w:fldCharType="separate"/>
+      </w:r>
+      <w:r>
+        <w:t xml:space="preserve">Fig. 10</w:t>
+      </w:r>
+      <w:r>
+        <w:fldChar w:fldCharType="end"/>
+      </w:r>
+      <w:r>
+        <w:t xml:space="preserve">). La CNN usó las 30 épocas y su mejor época fue la 28, con 89.47 % en validación. VGG16 se estancó en la fase congelada (88.67 % en la época 26), por debajo de la CNN propia, y el ajuste fino le dio el mayor salto del experimento: hasta 93.65 % en validación. MobileNetV2 partió más alto con el extractor congelado (90.77 %) y el ajuste fino la llevó a 93.17 %. El contraste confirma que las características de ImageNet no se transfieren tal cual a prendas pequeñas en escala de grises [21], [22]: el cambio de dominio exige adaptar al menos el último bloque. Hay que declarar también que la CNN no tuvo fase de ajuste fino, así que las preentrenadas recibieron más épocas de entrenamiento en total.</w:t>
       </w:r>
     </w:p>
     <w:p>
@@ -7167,8 +7531,13 @@
         <w:pStyle w:val="FigureCaption"/>
         <w:spacing w:before="60" w:after="160"/>
       </w:pPr>
-      <w:r>
-        <w:t>Fig. 9. Búsqueda de hiperparámetros del Punto 2. (a) Exactitud de validación de cada configuración, agrupada por familia; se rotula la ganadora. (b) Exactitud de validación frente a la brecha entre entrenamiento y validación.</w:t>
+      <w:bookmarkStart w:id="113" w:name="_RefFig9"/>
+      <w:r>
+        <w:t xml:space="preserve">Fig. 9</w:t>
+      </w:r>
+      <w:bookmarkEnd w:id="113"/>
+      <w:r>
+        <w:t xml:space="preserve">. Búsqueda de hiperparámetros del Punto 2. (a) Exactitud de validación de cada configuración, agrupada por familia; se rotula la ganadora. (b) Exactitud de validación frente a la brecha entre entrenamiento y validación.</w:t>
       </w:r>
     </w:p>
     <w:p>
@@ -7181,7 +7550,6 @@
         <w:rPr>
           <w:noProof/>
         </w:rPr>
-        <w:lastRenderedPageBreak/>
         <w:drawing>
           <wp:inline distT="0" distB="0" distL="0" distR="0" wp14:anchorId="390F448F" wp14:editId="445C64A1">
             <wp:extent cx="5925312" cy="2815781"/>
@@ -7230,8 +7598,13 @@
           <w:cols w:space="288"/>
         </w:sectPr>
       </w:pPr>
-      <w:r>
-        <w:t>Fig. 10. Curvas del entrenamiento final. La línea gruesa es validación y la tenue, entrenamiento; el salto de VGG16 y MobileNetV2 cerca de la época 30 y la 20 corresponde al inicio del ajuste fino. Los valores de la derecha son la exactitud de validación en la última época; los pesos restaurados son los de la menor pérdida de validación.</w:t>
+      <w:bookmarkStart w:id="114" w:name="_RefFig10"/>
+      <w:r>
+        <w:t xml:space="preserve">Fig. 10</w:t>
+      </w:r>
+      <w:bookmarkEnd w:id="114"/>
+      <w:r>
+        <w:t xml:space="preserve">. Curvas del entrenamiento final. La línea gruesa es validación y la tenue, entrenamiento; el salto de VGG16 y MobileNetV2 cerca de la época 30 y la 20 corresponde al inicio del ajuste fino. Los valores de la derecha son la exactitud de validación en la última época; los pesos restaurados son los de la menor pérdida de validación.</w:t>
       </w:r>
     </w:p>
     <w:p>
@@ -7253,7 +7626,25 @@
         <w:pStyle w:val="Text"/>
       </w:pPr>
       <w:r>
-        <w:t xml:space="preserve">La Tabla V resume la evaluación única sobre las 10 000 imágenes de prueba. VGG16 obtiene una exactitud de 93.19 %, MobileNetV2 de 92.43 % y la CNN desde cero de 89.04 %, con el mismo orden en F1 macro y en </w:t>
+        <w:t xml:space="preserve">La </w:t>
+      </w:r>
+      <w:r>
+        <w:fldChar w:fldCharType="begin"/>
+      </w:r>
+      <w:r>
+        <w:instrText xml:space="preserve"> REF _RefTablaV \h </w:instrText>
+      </w:r>
+      <w:r>
+        <w:fldChar w:fldCharType="separate"/>
+      </w:r>
+      <w:r>
+        <w:t xml:space="preserve">Tabla V</w:t>
+      </w:r>
+      <w:r>
+        <w:fldChar w:fldCharType="end"/>
+      </w:r>
+      <w:r>
+        <w:t xml:space="preserve"> resume la evaluación única sobre las 10 000 imágenes de prueba. VGG16 obtiene una exactitud de 93.19 %, MobileNetV2 de 92.43 % y la CNN desde cero de 89.04 %, con el mismo orden en F1 macro y en </w:t>
       </w:r>
       <w:r>
         <w:rPr>
@@ -7272,8 +7663,30 @@
       </w:r>
       <w:r>
         <w:t xml:space="preserve"> del conjunto de prueba [30], separan con claridad a la CNN de las dos preentrenadas, pero los de VGG16 [92.69, 93.67] y MobileNetV2 [91.90, 92.95] se solapan. Esa lectura es conservadora, porque ignora que las dos redes se evalúan sobre las mismas imágenes: la comparación pareada de la Sección IV</w:t>
+      </w:r>
+      <w:r>
         <w:noBreakHyphen/>
-        <w:t xml:space="preserve">F muestra que la diferencia de 0.76 puntos sí es significativa, aunque pequeña. La Fig. 11 pone esa diferencia en contexto: VGG16 tiene 6.5 veces más parámetros, casi seis veces más parámetros entrenables durante el ajuste fino y usó ocho veces más tiempo de GPU (2 687 s frente a 340 s).</w:t>
+      </w:r>
+      <w:r>
+        <w:t xml:space="preserve">F muestra que la diferencia de 0.76 puntos sí es significativa, aunque pequeña. La </w:t>
+      </w:r>
+      <w:r>
+        <w:fldChar w:fldCharType="begin"/>
+      </w:r>
+      <w:r>
+        <w:instrText xml:space="preserve"> REF _RefFig11 \h </w:instrText>
+      </w:r>
+      <w:r>
+        <w:fldChar w:fldCharType="separate"/>
+      </w:r>
+      <w:r>
+        <w:t xml:space="preserve">Fig. 11</w:t>
+      </w:r>
+      <w:r>
+        <w:fldChar w:fldCharType="end"/>
+      </w:r>
+      <w:r>
+        <w:t xml:space="preserve"> pone esa diferencia en contexto: VGG16 tiene 6.5 veces más parámetros, casi seis veces más parámetros entrenables durante el ajuste fino y usó ocho veces más tiempo de GPU (2 687 s frente a 340 s).</w:t>
       </w:r>
     </w:p>
     <w:p>
@@ -7281,7 +7694,43 @@
         <w:pStyle w:val="Text"/>
       </w:pPr>
       <w:r>
-        <w:t xml:space="preserve">El análisis por clase (Fig. 12 y Fig. 13) muestra que las tres redes coinciden en qué es difícil. Pantalón, bolso, sandalia, </w:t>
+        <w:t xml:space="preserve">El análisis por clase (</w:t>
+      </w:r>
+      <w:r>
+        <w:fldChar w:fldCharType="begin"/>
+      </w:r>
+      <w:r>
+        <w:instrText xml:space="preserve"> REF _RefFig12 \h </w:instrText>
+      </w:r>
+      <w:r>
+        <w:fldChar w:fldCharType="separate"/>
+      </w:r>
+      <w:r>
+        <w:t xml:space="preserve">Fig. 12</w:t>
+      </w:r>
+      <w:r>
+        <w:fldChar w:fldCharType="end"/>
+      </w:r>
+      <w:r>
+        <w:t xml:space="preserve"> y </w:t>
+      </w:r>
+      <w:r>
+        <w:fldChar w:fldCharType="begin"/>
+      </w:r>
+      <w:r>
+        <w:instrText xml:space="preserve"> REF _RefFig13 \h </w:instrText>
+      </w:r>
+      <w:r>
+        <w:fldChar w:fldCharType="separate"/>
+      </w:r>
+      <w:r>
+        <w:t xml:space="preserve">Fig. 13</w:t>
+      </w:r>
+      <w:r>
+        <w:fldChar w:fldCharType="end"/>
+      </w:r>
+      <w:r>
+        <w:t xml:space="preserve">) muestra que las tres redes coinciden en qué es difícil. Pantalón, bolso, sandalia, </w:t>
       </w:r>
       <w:r>
         <w:t>botín y tenis superan 0.94 de F1 en todos los modelos, mientras que camisa (</w:t>
@@ -7307,7 +7756,25 @@
         </w:sectPr>
       </w:pPr>
       <w:r>
-        <w:t>La Fig. 14 muestra los quince errores más confiados de VGG16, todos con probabilidad cercana al 100 %. Varios parecen errores de etiquetado del conjunto de datos más que del modelo: dos imágenes rotuladas como pantalón y una como camiseta tienen forma de vestido, y una rotulada como camisa parece un bolso. Este fenómeno está documentado en otros conjuntos de referencia [32] e implica que una parte del error residual no se puede reducir con una mejor arquitectura.</w:t>
+        <w:t xml:space="preserve">La </w:t>
+      </w:r>
+      <w:r>
+        <w:fldChar w:fldCharType="begin"/>
+      </w:r>
+      <w:r>
+        <w:instrText xml:space="preserve"> REF _RefFig14 \h </w:instrText>
+      </w:r>
+      <w:r>
+        <w:fldChar w:fldCharType="separate"/>
+      </w:r>
+      <w:r>
+        <w:t xml:space="preserve">Fig. 14</w:t>
+      </w:r>
+      <w:r>
+        <w:fldChar w:fldCharType="end"/>
+      </w:r>
+      <w:r>
+        <w:t xml:space="preserve"> muestra los quince errores más confiados de VGG16, todos con probabilidad cercana al 100 %. Varios parecen errores de etiquetado del conjunto de datos más que del modelo: dos imágenes rotuladas como pantalón y una como camiseta tienen forma de vestido, y una rotulada como camisa parece un bolso. Este fenómeno está documentado en otros conjuntos de referencia [32] e implica que una parte del error residual no se puede reducir con una mejor arquitectura.</w:t>
       </w:r>
     </w:p>
     <w:p>
@@ -7316,9 +7783,11 @@
         <w:keepNext/>
         <w:spacing w:before="160"/>
       </w:pPr>
-      <w:r>
-        <w:t>Tabla V</w:t>
-      </w:r>
+      <w:bookmarkStart w:id="115" w:name="_RefTablaV"/>
+      <w:r>
+        <w:t>Tabla V</w:t>
+      </w:r>
+      <w:bookmarkEnd w:id="115"/>
     </w:p>
     <w:p>
       <w:pPr>
@@ -8389,8 +8858,13 @@
         <w:pStyle w:val="FigureCaption"/>
         <w:spacing w:before="60" w:after="160"/>
       </w:pPr>
-      <w:r>
-        <w:t>Fig. 11. Exactitud en prueba con su intervalo de confianza del 95 % frente a (a) los parámetros entrenables, en escala logarítmica, y (b) el tiempo de entrenamiento en GPU.</w:t>
+      <w:bookmarkStart w:id="116" w:name="_RefFig11"/>
+      <w:r>
+        <w:t xml:space="preserve">Fig. 11</w:t>
+      </w:r>
+      <w:bookmarkEnd w:id="116"/>
+      <w:r>
+        <w:t xml:space="preserve">. Exactitud en prueba con su intervalo de confianza del 95 % frente a (a) los parámetros entrenables, en escala logarítmica, y (b) el tiempo de entrenamiento en GPU.</w:t>
       </w:r>
     </w:p>
     <w:p>
@@ -8451,8 +8925,13 @@
           <w:cols w:space="288"/>
         </w:sectPr>
       </w:pPr>
-      <w:r>
-        <w:t>Fig. 12. Matrices de confusión normalizadas por la clase real (%). La diagonal es la exhaustividad de cada clase; la confusión dominante en los tres modelos es camisa (Shirt) con camiseta (T-shirt/top).</w:t>
+      <w:bookmarkStart w:id="117" w:name="_RefFig12"/>
+      <w:r>
+        <w:t xml:space="preserve">Fig. 12</w:t>
+      </w:r>
+      <w:bookmarkEnd w:id="117"/>
+      <w:r>
+        <w:t xml:space="preserve">. Matrices de confusión normalizadas por la clase real (%). La diagonal es la exhaustividad de cada clase; la confusión dominante en los tres modelos es camisa (Shirt) con camiseta (T-shirt/top).</w:t>
       </w:r>
     </w:p>
     <w:p>
@@ -8507,8 +8986,13 @@
         <w:pStyle w:val="FigureCaption"/>
         <w:spacing w:before="60" w:after="160"/>
       </w:pPr>
-      <w:r>
-        <w:t>Fig. 13. F1 por clase de los tres modelos, de la clase más difícil a la más fácil. La línea gris une el peor y el mejor modelo de cada clase.</w:t>
+      <w:bookmarkStart w:id="118" w:name="_RefFig13"/>
+      <w:r>
+        <w:t xml:space="preserve">Fig. 13</w:t>
+      </w:r>
+      <w:bookmarkEnd w:id="118"/>
+      <w:r>
+        <w:t xml:space="preserve">. F1 por clase de los tres modelos, de la clase más difícil a la más fácil. La línea gris une el peor y el mejor modelo de cada clase.</w:t>
       </w:r>
     </w:p>
     <w:p>
@@ -8563,8 +9047,13 @@
         <w:pStyle w:val="FigureCaption"/>
         <w:spacing w:before="60" w:after="160"/>
       </w:pPr>
-      <w:r>
-        <w:t>Fig. 14. Los quince errores más confiados de VGG16 en prueba. «es» indica la etiqueta del conjunto de datos y «dijo», la predicción con su probabilidad.</w:t>
+      <w:bookmarkStart w:id="119" w:name="_RefFig14"/>
+      <w:r>
+        <w:t xml:space="preserve">Fig. 14</w:t>
+      </w:r>
+      <w:bookmarkEnd w:id="119"/>
+      <w:r>
+        <w:t xml:space="preserve">. Los quince errores más confiados de VGG16 en prueba. «es» indica la etiqueta del conjunto de datos y «dijo», la predicción con su probabilidad.</w:t>
       </w:r>
     </w:p>
     <w:p>
@@ -8595,7 +9084,25 @@
         <w:t xml:space="preserve">callbacks</w:t>
       </w:r>
       <w:r>
-        <w:t xml:space="preserve"> y rejilla de búsqueda, ajuste fino de las últimas 20 capas con la tasa dividida por diez, float32 y la misma GPU T4—. La única diferencia es que Keras incluye el preprocesamiento de ImageNet dentro del modelo, así que la red recibe la imagen en el rango de 0 a 255 replicada en tres canales. La búsqueda repitió el patrón de la Tabla IV: ganó dropout 0.2 sin aumentación y tasa de 10</w:t>
+        <w:t xml:space="preserve"> y rejilla de búsqueda, ajuste fino de las últimas 20 capas con la tasa dividida por diez, float32 y la misma GPU T4—. La única diferencia es que Keras incluye el preprocesamiento de ImageNet dentro del modelo, así que la red recibe la imagen en el rango de 0 a 255 replicada en tres canales. La búsqueda repitió el patrón de la </w:t>
+      </w:r>
+      <w:r>
+        <w:fldChar w:fldCharType="begin"/>
+      </w:r>
+      <w:r>
+        <w:instrText xml:space="preserve"> REF _RefTablaIV \h </w:instrText>
+      </w:r>
+      <w:r>
+        <w:fldChar w:fldCharType="separate"/>
+      </w:r>
+      <w:r>
+        <w:t xml:space="preserve">Tabla IV</w:t>
+      </w:r>
+      <w:r>
+        <w:fldChar w:fldCharType="end"/>
+      </w:r>
+      <w:r>
+        <w:t xml:space="preserve">: ganó dropout 0.2 sin aumentación y tasa de 10</w:t>
       </w:r>
       <w:r>
         <w:rPr>
@@ -8630,7 +9137,25 @@
         <w:t xml:space="preserve">log-loss</w:t>
       </w:r>
       <w:r>
-        <w:t xml:space="preserve"> de 0.2158, con 603 s de entrenamiento y 0.82 millones de parámetros entrenables en la fase final. Queda entre VGG16 y MobileNetV2 tanto en exactitud como en costo (Fig. 15).</w:t>
+        <w:t xml:space="preserve"> de 0.2158, con 603 s de entrenamiento y 0.82 millones de parámetros entrenables en la fase final. Queda entre VGG16 y MobileNetV2 tanto en exactitud como en costo (</w:t>
+      </w:r>
+      <w:r>
+        <w:fldChar w:fldCharType="begin"/>
+      </w:r>
+      <w:r>
+        <w:instrText xml:space="preserve"> REF _RefFig15 \h </w:instrText>
+      </w:r>
+      <w:r>
+        <w:fldChar w:fldCharType="separate"/>
+      </w:r>
+      <w:r>
+        <w:t xml:space="preserve">Fig. 15</w:t>
+      </w:r>
+      <w:r>
+        <w:fldChar w:fldCharType="end"/>
+      </w:r>
+      <w:r>
+        <w:t xml:space="preserve">).</w:t>
       </w:r>
     </w:p>
     <w:p>
@@ -8647,7 +9172,25 @@
         <w:t xml:space="preserve">bootstrap</w:t>
       </w:r>
       <w:r>
-        <w:t xml:space="preserve"> de la diferencia de exactitud y con la prueba exacta de McNemar [31], que solo cuenta las imágenes en que un modelo acierta y el otro no. La Tabla VI resume el resultado contra VGG16, la mejor red. EfficientNetV2-B0 queda a 0.46 puntos, con un intervalo que incluye el cero y p = 0.058: es la única red que no se distingue de VGG16, y lo logra con 4.5 veces menos tiempo. En cambio, la diferencia de 0.76 puntos entre VGG16 y MobileNetV2, que los intervalos separados no permitían afirmar, sí es significativa (p = 0.0015). Entre EfficientNetV2-B0 y MobileNetV2 la diferencia, de 0.30 puntos, no lo es (p = 0.23). Por clase, EfficientNetV2-B0 repite el patrón de las otras redes: camisa sigue siendo la clase más difícil (F1 de 0.79) y obtiene el mejor F1 de las cuatro en botín (0.97) y bolso (0.99).</w:t>
+        <w:t xml:space="preserve"> de la diferencia de exactitud y con la prueba exacta de McNemar [31], que solo cuenta las imágenes en que un modelo acierta y el otro no. La </w:t>
+      </w:r>
+      <w:r>
+        <w:fldChar w:fldCharType="begin"/>
+      </w:r>
+      <w:r>
+        <w:instrText xml:space="preserve"> REF _RefTablaVI \h </w:instrText>
+      </w:r>
+      <w:r>
+        <w:fldChar w:fldCharType="separate"/>
+      </w:r>
+      <w:r>
+        <w:t xml:space="preserve">Tabla VI</w:t>
+      </w:r>
+      <w:r>
+        <w:fldChar w:fldCharType="end"/>
+      </w:r>
+      <w:r>
+        <w:t xml:space="preserve"> resume el resultado contra VGG16, la mejor red. EfficientNetV2-B0 queda a 0.46 puntos, con un intervalo que incluye el cero y p = 0.058: es la única red que no se distingue de VGG16, y lo logra con 4.5 veces menos tiempo. En cambio, la diferencia de 0.76 puntos entre VGG16 y MobileNetV2, que los intervalos separados no permitían afirmar, sí es significativa (p = 0.0015). Entre EfficientNetV2-B0 y MobileNetV2 la diferencia, de 0.30 puntos, no lo es (p = 0.23). Por clase, EfficientNetV2-B0 repite el patrón de las otras redes: camisa sigue siendo la clase más difícil (F1 de 0.79) y obtiene el mejor F1 de las cuatro en botín (0.97) y bolso (0.99).</w:t>
       </w:r>
     </w:p>
     <w:p>
@@ -8669,7 +9212,25 @@
         <w:pStyle w:val="Text"/>
       </w:pPr>
       <w:r>
-        <w:t xml:space="preserve">La Tabla VII contrasta las cuatro aproximaciones con los resultados obtenidos. Con un criterio de «mejor» que combine exactitud, incertidumbre y costo, EfficientNetV2-B0 es la opción más equilibrada; MobileNetV2 es la más barata de las preentrenadas, a cambio de 0.76 puntos frente a VGG16; VGG16 solo se justifica si cada décima de exactitud importa más que el cómputo, y la CNN propia es la elección cuando el presupuesto de memoria o de energía es muy bajo.</w:t>
+        <w:t xml:space="preserve">La </w:t>
+      </w:r>
+      <w:r>
+        <w:fldChar w:fldCharType="begin"/>
+      </w:r>
+      <w:r>
+        <w:instrText xml:space="preserve"> REF _RefTablaVII \h </w:instrText>
+      </w:r>
+      <w:r>
+        <w:fldChar w:fldCharType="separate"/>
+      </w:r>
+      <w:r>
+        <w:t xml:space="preserve">Tabla VII</w:t>
+      </w:r>
+      <w:r>
+        <w:fldChar w:fldCharType="end"/>
+      </w:r>
+      <w:r>
+        <w:t xml:space="preserve"> contrasta las cuatro aproximaciones con los resultados obtenidos. Con un criterio de «mejor» que combine exactitud, incertidumbre y costo, EfficientNetV2-B0 es la opción más equilibrada; MobileNetV2 es la más barata de las preentrenadas, a cambio de 0.76 puntos frente a VGG16; VGG16 solo se justifica si cada décima de exactitud importa más que el cómputo, y la CNN propia es la elección cuando el presupuesto de memoria o de energía es muy bajo.</w:t>
       </w:r>
     </w:p>
     <w:p>
@@ -8756,8 +9317,13 @@
         <w:pStyle w:val="FigureCaption"/>
         <w:spacing w:before="60" w:after="160"/>
       </w:pPr>
-      <w:r>
-        <w:t xml:space="preserve">Fig. 15. Extensión a EfficientNetV2-B0. Exactitud en prueba con su intervalo de confianza del 95 % frente a (a) los parámetros entrenables, en escala logarítmica, y (b) el tiempo de entrenamiento en GPU; (c) diferencia pareada de exactitud de VGG16 frente a cada red, con su intervalo </w:t>
+      <w:bookmarkStart w:id="120" w:name="_RefFig15"/>
+      <w:r>
+        <w:t xml:space="preserve">Fig. 15</w:t>
+      </w:r>
+      <w:bookmarkEnd w:id="120"/>
+      <w:r>
+        <w:t xml:space="preserve">. Extensión a EfficientNetV2-B0. Exactitud en prueba con su intervalo de confianza del 95 % frente a (a) los parámetros entrenables, en escala logarítmica, y (b) el tiempo de entrenamiento en GPU; (c) diferencia pareada de exactitud de VGG16 frente a cada red, con su intervalo </w:t>
       </w:r>
       <w:r>
         <w:rPr>
@@ -8775,9 +9341,11 @@
         <w:keepNext/>
         <w:spacing w:before="160"/>
       </w:pPr>
-      <w:r>
-        <w:t>Tabla VI</w:t>
-      </w:r>
+      <w:bookmarkStart w:id="121" w:name="_RefTablaVI"/>
+      <w:r>
+        <w:t>Tabla VI</w:t>
+      </w:r>
+      <w:bookmarkEnd w:id="121"/>
     </w:p>
     <w:p>
       <w:pPr>
@@ -9903,7 +10471,43 @@
         <w:rPr>
           <w:sz w:val="14"/>
         </w:rPr>
-        <w:t xml:space="preserve"> pareado (1 000 remuestreos). p: prueba exacta de McNemar sobre las imágenes en que solo uno de los dos modelos acierta. Tiempo y entrenables como en la Tabla V.</w:t>
+        <w:t xml:space="preserve"> pareado (1 000 remuestreos). p: prueba exacta de McNemar sobre las imágenes en que solo uno de los dos modelos acierta. Tiempo y entrenables como en la </w:t>
+      </w:r>
+      <w:r>
+        <w:rPr>
+          <w:sz w:val="14"/>
+        </w:rPr>
+        <w:fldChar w:fldCharType="begin"/>
+      </w:r>
+      <w:r>
+        <w:rPr>
+          <w:sz w:val="14"/>
+        </w:rPr>
+        <w:instrText xml:space="preserve"> REF _RefTablaV \h </w:instrText>
+      </w:r>
+      <w:r>
+        <w:rPr>
+          <w:sz w:val="14"/>
+        </w:rPr>
+        <w:fldChar w:fldCharType="separate"/>
+      </w:r>
+      <w:r>
+        <w:rPr>
+          <w:sz w:val="14"/>
+        </w:rPr>
+        <w:t xml:space="preserve">Tabla V</w:t>
+      </w:r>
+      <w:r>
+        <w:rPr>
+          <w:sz w:val="14"/>
+        </w:rPr>
+        <w:fldChar w:fldCharType="end"/>
+      </w:r>
+      <w:r>
+        <w:rPr>
+          <w:sz w:val="14"/>
+        </w:rPr>
+        <w:t xml:space="preserve">.</w:t>
       </w:r>
     </w:p>
     <w:p>
@@ -9912,9 +10516,11 @@
         <w:keepNext/>
         <w:spacing w:before="160"/>
       </w:pPr>
-      <w:r>
-        <w:t>Tabla VII</w:t>
-      </w:r>
+      <w:bookmarkStart w:id="122" w:name="_RefTablaVII"/>
+      <w:r>
+        <w:t>Tabla VII</w:t>
+      </w:r>
+      <w:bookmarkEnd w:id="122"/>
     </w:p>
     <w:p>
       <w:pPr>

</xml_diff>

<commit_message>
ajustes de formato y redacción del informe
</commit_message>
<xml_diff>
--- a/report/Informe_Taller1_IEEE.docx
+++ b/report/Informe_Taller1_IEEE.docx
@@ -16,13 +16,6 @@
           <w:sz w:val="18"/>
           <w:szCs w:val="18"/>
         </w:rPr>
-        <w:footnoteReference w:customMarkFollows="1" w:id="1"/>
-      </w:r>
-      <w:r>
-        <w:rPr>
-          <w:sz w:val="18"/>
-          <w:szCs w:val="18"/>
-        </w:rPr>
         <w:sym w:font="Symbol" w:char="F020"/>
       </w:r>
     </w:p>
@@ -39,10 +32,25 @@
       <w:pPr>
         <w:pStyle w:val="Authors"/>
         <w:framePr w:wrap="notBeside"/>
-        <w:spacing w:after="0"/>
-      </w:pPr>
-      <w:r>
-        <w:t>Daniel Sebastian Velasco Munar y Andrea Barraza</w:t>
+        <w:spacing w:after="40"/>
+      </w:pPr>
+      <w:r>
+        <w:t xml:space="preserve">Daniel Sebastian Velasco Munar</w:t>
+      </w:r>
+      <w:r>
+        <w:rPr>
+          <w:vertAlign w:val="superscript"/>
+        </w:rPr>
+        <w:t xml:space="preserve">a,c</w:t>
+      </w:r>
+      <w:r>
+        <w:t xml:space="preserve">, Andrea Barraza</w:t>
+      </w:r>
+      <w:r>
+        <w:rPr>
+          <w:vertAlign w:val="superscript"/>
+        </w:rPr>
+        <w:t xml:space="preserve">a,c</w:t>
       </w:r>
     </w:p>
     <w:p>
@@ -52,46 +60,82 @@
         <w:spacing w:after="100"/>
       </w:pPr>
       <w:r>
+        <w:t xml:space="preserve">Andrés Moreno</w:t>
+      </w:r>
+      <w:r>
+        <w:rPr>
+          <w:vertAlign w:val="superscript"/>
+        </w:rPr>
+        <w:t xml:space="preserve">b,c</w:t>
+      </w:r>
+    </w:p>
+    <w:p>
+      <w:pPr>
+        <w:pStyle w:val="Authors"/>
+        <w:framePr w:wrap="notBeside"/>
+        <w:spacing w:after="320"/>
+        <w:rPr>
+          <w:sz w:val="16"/>
+        </w:rPr>
+      </w:pPr>
+      <w:r>
+        <w:rPr>
+          <w:sz w:val="16"/>
+          <w:vertAlign w:val="superscript"/>
+        </w:rPr>
+        <w:t xml:space="preserve">a</w:t>
+      </w:r>
+      <w:r>
+        <w:rPr>
+          <w:sz w:val="16"/>
+        </w:rPr>
+        <w:t xml:space="preserve">Estudiantes de la Maestría en Inteligencia Artificial</w:t>
+      </w:r>
+      <w:r>
+        <w:br/>
+      </w:r>
+      <w:r>
+        <w:rPr>
+          <w:sz w:val="16"/>
+          <w:vertAlign w:val="superscript"/>
+        </w:rPr>
+        <w:t xml:space="preserve">b</w:t>
+      </w:r>
+      <w:r>
+        <w:rPr>
+          <w:sz w:val="16"/>
+        </w:rPr>
+        <w:t xml:space="preserve">Profesor Asistente, Departamento de Ingeniería de Sistemas</w:t>
+      </w:r>
+      <w:r>
+        <w:br/>
+      </w:r>
+      <w:r>
+        <w:rPr>
+          <w:sz w:val="16"/>
+          <w:vertAlign w:val="superscript"/>
+        </w:rPr>
+        <w:t xml:space="preserve">c</w:t>
+      </w:r>
+      <w:r>
+        <w:rPr>
+          <w:sz w:val="16"/>
+        </w:rPr>
+        <w:t xml:space="preserve">Pontificia Universidad Javeriana, Bogotá, Colombia</w:t>
+      </w:r>
+    </w:p>
+    <w:p>
+      <w:pPr>
+        <w:pStyle w:val="Abstract"/>
+      </w:pPr>
+      <w:r>
         <w:rPr>
           <w:i/>
-          <w:iCs/>
-          <w:sz w:val="18"/>
-          <w:szCs w:val="18"/>
-        </w:rPr>
-        <w:t>Maestría en Inteligencia Artificial, Pontificia Universidad Javeriana · Aprendizaje Profundo · Profesor: Andrés Moreno</w:t>
-      </w:r>
-    </w:p>
-    <w:p>
-      <w:pPr>
-        <w:pStyle w:val="Abstract"/>
-      </w:pPr>
-      <w:r>
-        <w:rPr>
-          <w:i/>
         </w:rPr>
         <w:t xml:space="preserve">Resumen</w:t>
       </w:r>
       <w:r>
-        <w:t xml:space="preserve">—Este trabajo aborda dos problemas de aprendizaje profundo con un mismo principio metodológico: seleccionar todo con un conjunto de validación, usar el conjunto de prueba una sola vez y leer cada resultado frente a una referencia sencilla. En el primero se pronostican las siguientes 24 horas de temperatura en la estación 62548002 de MeteoNet, en la costa norte de Francia, a partir de las 168 horas previas de doce variables meteorológicas y de calendario. Una búsqueda por etapas de 18 configuraciones mostró que una red recurrente simple de 32 unidades y 2 232 parámetros supera a las celdas GRU y LSTM, que sobreajustan en pocas épocas. Sobre el 30 % final de la serie el modelo obtiene un error absoluto medio de 1.60 °C, 24.7 % menos que la mejor línea base, que repite la temperatura del día anterior, y le gana en los 24 horizontes. En el segundo se clasifican las diez clases de Fashion-MNIST con tres aproximaciones entrenadas bajo la misma partición, semilla, lotes y criterios de parada: una red convolucional diseñada desde cero, VGG16 con filtros de ImageNet y MobileNetV2 con aprendizaje por transferencia. VGG16 alcanza una exactitud de 93.19 %, MobileNetV2 de 92.43 % y la red propia de 89.04 %. Una prueba pareada muestra que la ventaja de VGG16 sobre MobileNetV2 es real pero pequeña, a cambio de ocho veces más tiempo de entrenamiento. Como extensión, EfficientNetV2-B0 alcanza 92.73 % y es la única red que no se distingue estadísticamente de VGG16, con 4.5 veces menos tiempo, por lo que resulta la opción más equilibrada. En ambos problemas la capacidad adicional no se tradujo en mejor generalización, y el error remanente se explica más por la información disponible que por la arquitectura.</w:t>
-      </w:r>
-    </w:p>
-    <w:p/>
-    <w:p>
-      <w:pPr>
-        <w:pStyle w:val="Abstract"/>
-      </w:pPr>
-      <w:r>
-        <w:rPr>
-          <w:i/>
-          <w:iCs/>
-        </w:rPr>
-        <w:t>Declaración de impacto</w:t>
-      </w:r>
-      <w:r>
-        <w:rPr>
-          <w:iCs/>
-        </w:rPr>
-        <w:t>—Los pronósticos locales de temperatura a un día sirven para planear el riego, la demanda de energía y las alertas tempranas, y la clasificación automática de imágenes de productos es una tarea cotidiana del comercio electrónico. Este trabajo muestra que en ambos casos un modelo pequeño y bien evaluado puede ser suficiente: una red recurrente de algo más de dos mil parámetros reduce en una cuarta parte el error de la mejor regla empírica, y una red preentrenada moderna y compacta queda estadísticamente empatada con otra cuatro veces y media más costosa de entrenar. Documentar la partición de los datos, las líneas base y la incertidumbre de las métricas permite tomar decisiones de despliegue que consideran el costo y no solo la exactitud.</w:t>
+        <w:t xml:space="preserve">—Este trabajo aplica redes neuronales recurrentes y convolucionales a dos problemas de aprendizaje profundo. En el primero se pronostican las siguientes 24 horas de temperatura en la estación 62548002 de MeteoNet, en la costa norte de Francia, a partir de las 168 horas previas de doce variables meteorológicas y de calendario. Una búsqueda por etapas de 18 configuraciones mostró que una red recurrente simple de 32 unidades y 2,232 parámetros supera a las celdas GRU y LSTM, que sobreajustan en pocas épocas. Sobre el 30 % final de la serie el modelo obtiene un error absoluto medio de 1.60 °C, 24.7 % menos que la mejor línea base, que repite la temperatura del día anterior, y le gana en los 24 horizontes. En el segundo se clasifican las diez clases de Fashion-MNIST con tres aproximaciones entrenadas bajo la misma partición, semilla, lotes y criterios de parada: una red convolucional diseñada desde cero, VGG16 con filtros de ImageNet y MobileNetV2 con aprendizaje por transferencia. VGG16 alcanza una exactitud de 93.19 %, MobileNetV2 de 92.43 % y la red propia de 89.04 %. Una prueba pareada muestra que la ventaja de VGG16 sobre MobileNetV2 es real pero pequeña, a cambio de ocho veces más tiempo de entrenamiento. Como extensión, EfficientNetV2-B0 alcanza 92.73 % y es la única red que no se distingue estadísticamente de VGG16, con 4.5 veces menos tiempo, por lo que resulta la opción más equilibrada. En ambos problemas la capacidad adicional no se tradujo en mejor generalización, y el error remanente se explica más por la información disponible que por la arquitectura.</w:t>
       </w:r>
     </w:p>
     <w:p/>
@@ -246,7 +290,13 @@
         <w:t>et al.</w:t>
       </w:r>
       <w:r>
-        <w:t xml:space="preserve"> [15] combinan capas convolucionales y LSTM para el pronóstico horario. La guía de TensorFlow para series de tiempo [16], sugerida en el enunciado, describe la construcción de ventanas de entrada y salida que se usa aquí. Un punto común en esta literatura es que la ganancia de un modelo debe medirse frente a referencias ingenuas bien escogidas, como la persistencia o la repetición del ciclo estacional [17], porque en series con un ciclo diario marcado esas reglas ya son difíciles de superar.</w:t>
+        <w:t xml:space="preserve"> [15] combinan capas convolucionales y LSTM para el pronóstico horario. La guía de TensorFlow para series de tiempo [16]</w:t>
+      </w:r>
+      <w:r>
+        <w:t xml:space="preserve"> describe</w:t>
+      </w:r>
+      <w:r>
+        <w:t xml:space="preserve"> la construcción de ventanas de entrada y salida que se usa aquí. Un punto común en esta literatura es que la ganancia de un modelo debe medirse frente a referencias ingenuas bien escogidas, como la persistencia o la repetición del ciclo estacional [17], porque en series con un ciclo diario marcado esas reglas ya son difíciles de superar.</w:t>
       </w:r>
     </w:p>
     <w:p>
@@ -268,7 +318,7 @@
         <w:pStyle w:val="Text"/>
       </w:pPr>
       <w:r>
-        <w:t xml:space="preserve">Fashion-MNIST [6] conserva el formato de MNIST —70 000 imágenes de 28 × 28 píxeles en escala de grises y diez clases— pero es bastante más difícil. En el tablero de resultados de sus autores [18] una persona acierta el 83.5 %, una red de dos capas convolucionales ronda el 91.6 %, VGG16 con 26 millones de parámetros llega al 93.5 %, MobileNet al 95.0 % y una red residual ancha al 96.7 %. Bhatnagar </w:t>
+        <w:t xml:space="preserve">Fashion-MNIST [6] conserva el formato de MNIST —70,000 imágenes de 28 × 28 píxeles en escala de grises y diez clases— pero es bastante más difícil. En el tablero de resultados de sus autores [18] una persona acierta el 83.5 %, una red de dos capas convolucionales ronda el 91.6 %, VGG16 con 26 millones de parámetros llega al 93.5 %, MobileNet al 95.0 % y una red residual ancha al 96.7 %. Bhatnagar </w:t>
       </w:r>
       <w:r>
         <w:rPr>
@@ -316,7 +366,7 @@
         <w:pStyle w:val="Text"/>
       </w:pPr>
       <w:r>
-        <w:t xml:space="preserve">MeteoNet publica, entre otros productos, las observaciones de las estaciones terrestres del noroeste y del sureste de Francia entre 2016 y 2018, con registros cada 6 minutos de temperatura, punto de rocío, humedad, presión a nivel del mar, viento y precipitación [5]. Se descargaron los tres años de la zona noroeste (287 estaciones) y se resumió la calidad de cada una: cobertura frente a los 262 800 registros esperados, porcentaje de faltantes por variable y presencia en los tres años. Se exigió una cobertura superior al 95 %, menos del 2 % de faltantes en temperatura y menos del 5 % en presión, porque muchas </w:t>
+        <w:t xml:space="preserve">MeteoNet publica, entre otros productos, las observaciones de las estaciones terrestres del noroeste y del sureste de Francia entre 2016 y 2018, con registros cada 6 minutos de temperatura, punto de rocío, humedad, presión a nivel del mar, viento y precipitación [5]. Se descargaron los tres años de la zona noroeste (287 estaciones) y se resumió la calidad de cada una: cobertura frente a los 262,800 registros esperados, porcentaje de faltantes por variable y presencia en los tres años. Se exigió una cobertura superior al 95 %, menos del 2 % de faltantes en temperatura y menos del 5 % en presión, porque muchas </w:t>
       </w:r>
       <w:r>
         <w:t>estaciones no reportan esta variable. Cumplieron 46 estaciones y se escogió la 62548002, en la costa cerca de Calais (50.96° N, 1.96° E, 3 m sobre el nivel del mar), por ser la de mejor calidad: 99.8 % de cobertura, ningún dato de temperatura faltante en los registros de 6 minutos y las siete variables disponibles.</w:t>
@@ -327,7 +377,7 @@
         <w:pStyle w:val="Text"/>
       </w:pPr>
       <w:r>
-        <w:t xml:space="preserve">Los datos se llevaron a frecuencia horaria (26 304 horas): promedio para las variables de estado, suma para la precipitación y promedio vectorial del viento, que se representa con sus componentes zonal </w:t>
+        <w:t xml:space="preserve">Los datos se llevaron a frecuencia horaria (26,304 horas): promedio para las variables de estado, suma para la precipitación y promedio vectorial del viento, que se representa con sus componentes zonal </w:t>
       </w:r>
       <w:r>
         <w:rPr>
@@ -345,7 +395,13 @@
         <w:t>v</w:t>
       </w:r>
       <w:r>
-        <w:t xml:space="preserve"> para evitar el salto de 359° a 0° en la dirección. Tras el remuestreo quedaron 24 horas sin temperatura (0.09 %) repartidas en seis huecos. Los cinco de hasta 6 h se interpolaron linealmente y el de 9 h, del 21 y 22 de enero de 2018, se dejó vacío, de modo que las ventanas que lo contienen se descartan: interpolar casi una noche completa sería inventar el ciclo diario. Las 15 horas imputadas se marcaron y se excluyen de las métricas.</w:t>
+        <w:t xml:space="preserve"> para evitar el salto de 359° a 0° en la dirección. Tras el remuestreo quedaron 24 horas sin temperatura (0.09 %) </w:t>
+      </w:r>
+      <w:r>
+        <w:t xml:space="preserve">repartidas en seis intervalos de datos faltantes.</w:t>
+      </w:r>
+      <w:r>
+        <w:t xml:space="preserve"> Los cinco de hasta 6 h se interpolaron linealmente y el de 9 h, del 21 y 22 de enero de 2018, se dejó vacío, de modo que las ventanas que lo contienen se descartan: interpolar casi una noche completa sería inventar el ciclo diario. Las 15 horas imputadas se marcaron y se excluyen de las métricas.</w:t>
       </w:r>
     </w:p>
     <w:p>
@@ -427,7 +483,7 @@
     <w:p>
       <w:pPr>
         <w:keepNext/>
-        <w:spacing w:before="120"/>
+        <w:spacing w:before="240"/>
         <w:jc w:val="center"/>
       </w:pPr>
       <w:r>
@@ -474,7 +530,7 @@
     <w:p>
       <w:pPr>
         <w:pStyle w:val="FigureCaption"/>
-        <w:spacing w:before="60" w:after="160"/>
+        <w:spacing w:before="60" w:after="280"/>
       </w:pPr>
       <w:bookmarkStart w:id="101" w:name="_RefFig1"/>
       <w:r>
@@ -488,7 +544,7 @@
     <w:p>
       <w:pPr>
         <w:keepNext/>
-        <w:spacing w:before="120"/>
+        <w:spacing w:before="240"/>
         <w:jc w:val="center"/>
       </w:pPr>
       <w:r>
@@ -535,7 +591,7 @@
     <w:p>
       <w:pPr>
         <w:pStyle w:val="FigureCaption"/>
-        <w:spacing w:before="60" w:after="160"/>
+        <w:spacing w:before="60" w:after="280"/>
       </w:pPr>
       <w:bookmarkStart w:id="102" w:name="_RefFig2"/>
       <w:r>
@@ -1175,10 +1231,16 @@
         <w:fldChar w:fldCharType="end"/>
       </w:r>
       <w:r>
-        <w:t xml:space="preserve">): el 59.5 % para entrenamiento (enero de 2016 a octubre de 2017), el 10.5 % para validación (octubre de 2017 a febrero de 2018) y el 30 % final para prueba (febrero a diciembre de 2018), como </w:t>
-      </w:r>
-      <w:r>
-        <w:t xml:space="preserve">pide el enunciado. Para evitar fugas: 1) la media y la desviación estándar de la estandarización se calcularon solo con entrenamiento; 2) las ventanas se construyeron dentro de cada conjunto, de modo que ninguna muestra mezcla horas de dos conjuntos; 3) la climatología usada como línea base se calculó solo con entrenamiento, y 4) el conjunto de prueba no intervino en ninguna decisión. Con </w:t>
+        <w:t xml:space="preserve">): el 59.5 % para entrenamiento (enero de 2016 a octubre de 2017), el 10.5 % para validación (octubre de 2017 a febrero de 2018) y el 30 % final para prueba </w:t>
+      </w:r>
+      <w:r>
+        <w:t xml:space="preserve">(febrero a diciembre de 2018)</w:t>
+      </w:r>
+      <w:r>
+        <w:t xml:space="preserve">. Para evitar fugas</w:t>
+      </w:r>
+      <w:r>
+        <w:t xml:space="preserve">: 1) la media y la desviación estándar de la estandarización se calcularon solo con entrenamiento; 2) las ventanas se construyeron dentro de cada conjunto, de modo que ninguna muestra mezcla horas de dos conjuntos; 3) la climatología usada como línea base se calculó solo con entrenamiento, y 4) el conjunto de prueba no intervino en ninguna decisión. Con </w:t>
       </w:r>
       <w:r>
         <w:rPr>
@@ -1187,13 +1249,13 @@
         <w:t>L</w:t>
       </w:r>
       <w:r>
-        <w:t xml:space="preserve"> = 168 h resultan 15 459 ventanas de entrenamiento, 2 371 de validación y 7 701 de prueba. Una limitación de esta partición es que la prueba cubre primavera, verano y otoño, pero solo unas tres semanas de invierno.</w:t>
+        <w:t xml:space="preserve"> = 168 h resultan 15,459 ventanas de entrenamiento, 2,371 de validación y 7,701 de prueba. Una limitación de esta partición es que la prueba cubre primavera, verano y otoño, pero solo unas tres semanas de invierno.</w:t>
       </w:r>
     </w:p>
     <w:p>
       <w:pPr>
         <w:keepNext/>
-        <w:spacing w:before="120"/>
+        <w:spacing w:before="240"/>
         <w:jc w:val="center"/>
       </w:pPr>
       <w:r>
@@ -1240,7 +1302,7 @@
     <w:p>
       <w:pPr>
         <w:pStyle w:val="FigureCaption"/>
-        <w:spacing w:before="60" w:after="160"/>
+        <w:spacing w:before="60" w:after="280"/>
       </w:pPr>
       <w:bookmarkStart w:id="103" w:name="_RefFig3"/>
       <w:r>
@@ -1349,97 +1411,523 @@
         <w:pStyle w:val="Text"/>
       </w:pPr>
       <w:r>
-        <w:t xml:space="preserve">La búsqueda se hizo por etapas, variando una dimensión a la vez a partir de la mejor configuración de la etapa anterior y decidiendo siempre por el MAE de validación: 1) tipo de celda; 2) unidades {32, 64, 128} × capas {1, 2}; 3) </w:t>
-      </w:r>
-      <w:r>
-        <w:rPr>
-          <w:i/>
-        </w:rPr>
-        <w:t>dropout</w:t>
-      </w:r>
-      <w:r>
-        <w:t xml:space="preserve"> {0, 0.2, 0.4} × regularización L2 {0, 10</w:t>
-      </w:r>
-      <w:r>
-        <w:rPr>
-          <w:vertAlign w:val="superscript"/>
-        </w:rPr>
-        <w:t>−4</w:t>
-      </w:r>
-      <w:r>
-        <w:t>}, y 4) ventana de entrada {24, 48, 72, 168} h. Al final se añadió una verificación que no participa en la selección: repetir la comparación de celdas con la configuración final. En total fueron 18 corridas y unos 11 minutos en una GPU T4 de Google Colab con TensorFlow 2.20 [26].</w:t>
-      </w:r>
-    </w:p>
-    <w:p>
-      <w:pPr>
-        <w:pStyle w:val="Heading2"/>
-        <w:rPr>
-          <w:i w:val="0"/>
-        </w:rPr>
-      </w:pPr>
-      <w:r>
-        <w:rPr>
-          <w:i w:val="0"/>
-        </w:rPr>
-        <w:t>Resultados de la búsqueda</w:t>
-      </w:r>
-    </w:p>
-    <w:p>
-      <w:pPr>
-        <w:pStyle w:val="Text"/>
-      </w:pPr>
-      <w:r>
-        <w:t xml:space="preserve">La </w:t>
+        <w:t xml:space="preserve">La búsqueda se hizo por etapas (</w:t>
       </w:r>
       <w:r>
         <w:fldChar w:fldCharType="begin"/>
       </w:r>
       <w:r>
-        <w:instrText xml:space="preserve"> REF _RefFig4 \h </w:instrText>
+        <w:instrText xml:space="preserve"> REF _RefTablaI \h </w:instrText>
       </w:r>
       <w:r>
         <w:fldChar w:fldCharType="separate"/>
       </w:r>
       <w:r>
-        <w:t xml:space="preserve">Fig. 4</w:t>
+        <w:t xml:space="preserve">Tabla I</w:t>
       </w:r>
       <w:r>
         <w:fldChar w:fldCharType="end"/>
       </w:r>
       <w:r>
-        <w:t xml:space="preserve"> y la </w:t>
-      </w:r>
-      <w:r>
-        <w:fldChar w:fldCharType="begin"/>
-      </w:r>
-      <w:r>
-        <w:instrText xml:space="preserve"> REF _RefTablaI \h </w:instrText>
-      </w:r>
-      <w:r>
-        <w:fldChar w:fldCharType="separate"/>
-      </w:r>
-      <w:r>
-        <w:t xml:space="preserve">Tabla I</w:t>
-      </w:r>
-      <w:r>
-        <w:fldChar w:fldCharType="end"/>
-      </w:r>
-      <w:r>
-        <w:t xml:space="preserve"> resumen las 18 corridas. En la etapa 1, con 64 unidades y 72 h, SimpleRNN (1.523 °C) y GRU </w:t>
-      </w:r>
-      <w:r>
-        <w:t>(1.525 °C) empataron y LSTM quedó atrás (1.615 °C). Las curvas de entrenamiento explican la diferencia: LSTM y GRU alcanzaron su mejor época en la 5 y en la 6, y desde ahí el error de validación subió mientras el de entrenamiento seguía bajando; la SimpleRNN, en cambio, mejoró hasta la época 14. Con 2.5 a 3.3 veces más parámetros para las mismas 15 555 muestras, las celdas con compuertas sobreajustan antes.</w:t>
+        <w:t xml:space="preserve">), variando una dimensión a la vez a partir de la mejor configuración de la etapa anterior y decidiendo siempre por el MAE de validación. Al final se añadió una verificación que no participa en la selección: repetir la comparación de celdas con la configuración final. En total fueron 18 corridas y unos 11 minutos en una GPU T4 de Google Colab con TensorFlow 2.20 [26].</w:t>
       </w:r>
     </w:p>
     <w:p>
       <w:pPr>
         <w:pStyle w:val="TableTitle"/>
         <w:keepNext/>
-        <w:spacing w:before="160"/>
-      </w:pPr>
-      <w:bookmarkStart w:id="104" w:name="_RefTablaI"/>
+        <w:spacing w:before="280"/>
+      </w:pPr>
+      <w:bookmarkStart w:id="90" w:name="_RefTablaI"/>
       <w:r>
         <w:t>Tabla I</w:t>
+      </w:r>
+      <w:bookmarkEnd w:id="90"/>
+    </w:p>
+    <w:p>
+      <w:pPr>
+        <w:pStyle w:val="TableTitle"/>
+        <w:keepNext/>
+        <w:spacing w:after="60"/>
+      </w:pPr>
+      <w:r>
+        <w:t xml:space="preserve">Etapas de la búsqueda de hiperparámetros del Punto 1</w:t>
+      </w:r>
+    </w:p>
+    <w:tbl>
+      <w:tblPr>
+        <w:tblW w:w="5040" w:type="dxa"/>
+        <w:jc w:val="center"/>
+        <w:tblLayout w:type="fixed"/>
+        <w:tblCellMar>
+          <w:top w:w="16" w:type="dxa"/>
+          <w:left w:w="50" w:type="dxa"/>
+          <w:bottom w:w="16" w:type="dxa"/>
+          <w:right w:w="50" w:type="dxa"/>
+        </w:tblCellMar>
+        <w:tblLook w:val="0000" w:firstRow="0" w:lastRow="0" w:firstColumn="0" w:lastColumn="0" w:noHBand="0" w:noVBand="0"/>
+      </w:tblPr>
+      <w:tblGrid>
+        <w:gridCol w:w="650"/>
+        <w:gridCol w:w="2000"/>
+        <w:gridCol w:w="2390"/>
+      </w:tblGrid>
+      <w:tr>
+        <w:trPr>
+          <w:cantSplit/>
+          <w:tblHeader/>
+        </w:trPr>
+        <w:tc>
+          <w:tcPr>
+            <w:tcW w:w="650" w:type="dxa"/>
+            <w:tcBorders>
+              <w:top w:val="single" w:sz="4" w:space="0" w:color="auto"/>
+              <w:bottom w:val="single" w:sz="4" w:space="0" w:color="auto"/>
+            </w:tcBorders>
+            <w:vAlign w:val="center"/>
+          </w:tcPr>
+          <w:p>
+            <w:pPr>
+              <w:keepNext/>
+              <w:jc w:val="center"/>
+              <w:rPr>
+                <w:sz w:val="15"/>
+              </w:rPr>
+            </w:pPr>
+            <w:r>
+              <w:rPr>
+                <w:b/>
+                <w:sz w:val="15"/>
+              </w:rPr>
+              <w:t xml:space="preserve">Etapa</w:t>
+            </w:r>
+          </w:p>
+        </w:tc>
+        <w:tc>
+          <w:tcPr>
+            <w:tcW w:w="2000" w:type="dxa"/>
+            <w:tcBorders>
+              <w:top w:val="single" w:sz="4" w:space="0" w:color="auto"/>
+              <w:bottom w:val="single" w:sz="4" w:space="0" w:color="auto"/>
+            </w:tcBorders>
+            <w:vAlign w:val="center"/>
+          </w:tcPr>
+          <w:p>
+            <w:pPr>
+              <w:keepNext/>
+              <w:rPr>
+                <w:sz w:val="15"/>
+              </w:rPr>
+            </w:pPr>
+            <w:r>
+              <w:rPr>
+                <w:b/>
+                <w:sz w:val="15"/>
+              </w:rPr>
+              <w:t xml:space="preserve">Qué se varía</w:t>
+            </w:r>
+          </w:p>
+        </w:tc>
+        <w:tc>
+          <w:tcPr>
+            <w:tcW w:w="2390" w:type="dxa"/>
+            <w:tcBorders>
+              <w:top w:val="single" w:sz="4" w:space="0" w:color="auto"/>
+              <w:bottom w:val="single" w:sz="4" w:space="0" w:color="auto"/>
+            </w:tcBorders>
+            <w:vAlign w:val="center"/>
+          </w:tcPr>
+          <w:p>
+            <w:pPr>
+              <w:keepNext/>
+              <w:rPr>
+                <w:sz w:val="15"/>
+              </w:rPr>
+            </w:pPr>
+            <w:r>
+              <w:rPr>
+                <w:b/>
+                <w:sz w:val="15"/>
+              </w:rPr>
+              <w:t xml:space="preserve">Valores probados</w:t>
+            </w:r>
+          </w:p>
+        </w:tc>
+      </w:tr>
+      <w:tr>
+        <w:trPr>
+          <w:cantSplit/>
+        </w:trPr>
+        <w:tc>
+          <w:tcPr>
+            <w:tcW w:w="650" w:type="dxa"/>
+            <w:tcBorders>
+              <w:top w:val="single" w:sz="4" w:space="0" w:color="auto"/>
+            </w:tcBorders>
+            <w:vAlign w:val="center"/>
+          </w:tcPr>
+          <w:p>
+            <w:pPr>
+              <w:keepNext/>
+              <w:jc w:val="center"/>
+              <w:rPr>
+                <w:sz w:val="15"/>
+              </w:rPr>
+            </w:pPr>
+            <w:r>
+              <w:rPr>
+                <w:sz w:val="15"/>
+              </w:rPr>
+              <w:t xml:space="preserve">1</w:t>
+            </w:r>
+          </w:p>
+        </w:tc>
+        <w:tc>
+          <w:tcPr>
+            <w:tcW w:w="2000" w:type="dxa"/>
+            <w:tcBorders>
+              <w:top w:val="single" w:sz="4" w:space="0" w:color="auto"/>
+            </w:tcBorders>
+            <w:vAlign w:val="center"/>
+          </w:tcPr>
+          <w:p>
+            <w:pPr>
+              <w:keepNext/>
+              <w:rPr>
+                <w:sz w:val="15"/>
+              </w:rPr>
+            </w:pPr>
+            <w:r>
+              <w:rPr>
+                <w:sz w:val="15"/>
+              </w:rPr>
+              <w:t xml:space="preserve">Tipo de celda</w:t>
+            </w:r>
+          </w:p>
+        </w:tc>
+        <w:tc>
+          <w:tcPr>
+            <w:tcW w:w="2390" w:type="dxa"/>
+            <w:tcBorders>
+              <w:top w:val="single" w:sz="4" w:space="0" w:color="auto"/>
+            </w:tcBorders>
+            <w:vAlign w:val="center"/>
+          </w:tcPr>
+          <w:p>
+            <w:pPr>
+              <w:keepNext/>
+              <w:rPr>
+                <w:sz w:val="15"/>
+              </w:rPr>
+            </w:pPr>
+            <w:r>
+              <w:rPr>
+                <w:sz w:val="15"/>
+              </w:rPr>
+              <w:t xml:space="preserve">SimpleRNN, LSTM, GRU</w:t>
+            </w:r>
+          </w:p>
+        </w:tc>
+      </w:tr>
+      <w:tr>
+        <w:trPr>
+          <w:cantSplit/>
+        </w:trPr>
+        <w:tc>
+          <w:tcPr>
+            <w:tcW w:w="650" w:type="dxa"/>
+            <w:vAlign w:val="center"/>
+          </w:tcPr>
+          <w:p>
+            <w:pPr>
+              <w:keepNext/>
+              <w:jc w:val="center"/>
+              <w:rPr>
+                <w:sz w:val="15"/>
+              </w:rPr>
+            </w:pPr>
+            <w:r>
+              <w:rPr>
+                <w:sz w:val="15"/>
+              </w:rPr>
+              <w:t xml:space="preserve">2</w:t>
+            </w:r>
+          </w:p>
+        </w:tc>
+        <w:tc>
+          <w:tcPr>
+            <w:tcW w:w="2000" w:type="dxa"/>
+            <w:vAlign w:val="center"/>
+          </w:tcPr>
+          <w:p>
+            <w:pPr>
+              <w:keepNext/>
+              <w:rPr>
+                <w:sz w:val="15"/>
+              </w:rPr>
+            </w:pPr>
+            <w:r>
+              <w:rPr>
+                <w:sz w:val="15"/>
+              </w:rPr>
+              <w:t xml:space="preserve">Unidades × capas</w:t>
+            </w:r>
+          </w:p>
+        </w:tc>
+        <w:tc>
+          <w:tcPr>
+            <w:tcW w:w="2390" w:type="dxa"/>
+            <w:vAlign w:val="center"/>
+          </w:tcPr>
+          <w:p>
+            <w:pPr>
+              <w:keepNext/>
+              <w:rPr>
+                <w:sz w:val="15"/>
+              </w:rPr>
+            </w:pPr>
+            <w:r>
+              <w:rPr>
+                <w:sz w:val="15"/>
+              </w:rPr>
+              <w:t xml:space="preserve">{32, 64, 128} × {1, 2}</w:t>
+            </w:r>
+          </w:p>
+        </w:tc>
+      </w:tr>
+      <w:tr>
+        <w:trPr>
+          <w:cantSplit/>
+        </w:trPr>
+        <w:tc>
+          <w:tcPr>
+            <w:tcW w:w="650" w:type="dxa"/>
+            <w:vAlign w:val="center"/>
+          </w:tcPr>
+          <w:p>
+            <w:pPr>
+              <w:keepNext/>
+              <w:jc w:val="center"/>
+              <w:rPr>
+                <w:sz w:val="15"/>
+              </w:rPr>
+            </w:pPr>
+            <w:r>
+              <w:rPr>
+                <w:sz w:val="15"/>
+              </w:rPr>
+              <w:t xml:space="preserve">3</w:t>
+            </w:r>
+          </w:p>
+        </w:tc>
+        <w:tc>
+          <w:tcPr>
+            <w:tcW w:w="2000" w:type="dxa"/>
+            <w:vAlign w:val="center"/>
+          </w:tcPr>
+          <w:p>
+            <w:pPr>
+              <w:keepNext/>
+              <w:rPr>
+                <w:sz w:val="15"/>
+              </w:rPr>
+            </w:pPr>
+            <w:r>
+              <w:rPr>
+                <w:sz w:val="15"/>
+                <w:i/>
+              </w:rPr>
+              <w:t xml:space="preserve">Dropout</w:t>
+            </w:r>
+            <w:r>
+              <w:rPr>
+                <w:sz w:val="15"/>
+              </w:rPr>
+              <w:t xml:space="preserve"> × regularización L2</w:t>
+            </w:r>
+          </w:p>
+        </w:tc>
+        <w:tc>
+          <w:tcPr>
+            <w:tcW w:w="2390" w:type="dxa"/>
+            <w:vAlign w:val="center"/>
+          </w:tcPr>
+          <w:p>
+            <w:pPr>
+              <w:keepNext/>
+              <w:rPr>
+                <w:sz w:val="15"/>
+              </w:rPr>
+            </w:pPr>
+            <w:r>
+              <w:rPr>
+                <w:sz w:val="15"/>
+              </w:rPr>
+              <w:t xml:space="preserve">{0, 0.2, 0.4} × {0, 10</w:t>
+            </w:r>
+            <w:r>
+              <w:rPr>
+                <w:sz w:val="15"/>
+                <w:vertAlign w:val="superscript"/>
+              </w:rPr>
+              <w:t xml:space="preserve">−4</w:t>
+            </w:r>
+            <w:r>
+              <w:rPr>
+                <w:sz w:val="15"/>
+              </w:rPr>
+              <w:t xml:space="preserve">}</w:t>
+            </w:r>
+          </w:p>
+        </w:tc>
+      </w:tr>
+      <w:tr>
+        <w:trPr>
+          <w:cantSplit/>
+        </w:trPr>
+        <w:tc>
+          <w:tcPr>
+            <w:tcW w:w="650" w:type="dxa"/>
+            <w:tcBorders>
+              <w:bottom w:val="single" w:sz="4" w:space="0" w:color="auto"/>
+            </w:tcBorders>
+            <w:vAlign w:val="center"/>
+          </w:tcPr>
+          <w:p>
+            <w:pPr>
+              <w:keepNext/>
+              <w:jc w:val="center"/>
+              <w:rPr>
+                <w:sz w:val="15"/>
+              </w:rPr>
+            </w:pPr>
+            <w:r>
+              <w:rPr>
+                <w:sz w:val="15"/>
+              </w:rPr>
+              <w:t xml:space="preserve">4</w:t>
+            </w:r>
+          </w:p>
+        </w:tc>
+        <w:tc>
+          <w:tcPr>
+            <w:tcW w:w="2000" w:type="dxa"/>
+            <w:tcBorders>
+              <w:bottom w:val="single" w:sz="4" w:space="0" w:color="auto"/>
+            </w:tcBorders>
+            <w:vAlign w:val="center"/>
+          </w:tcPr>
+          <w:p>
+            <w:pPr>
+              <w:keepNext/>
+              <w:rPr>
+                <w:sz w:val="15"/>
+              </w:rPr>
+            </w:pPr>
+            <w:r>
+              <w:rPr>
+                <w:sz w:val="15"/>
+              </w:rPr>
+              <w:t xml:space="preserve">Ventana de entrada</w:t>
+            </w:r>
+          </w:p>
+        </w:tc>
+        <w:tc>
+          <w:tcPr>
+            <w:tcW w:w="2390" w:type="dxa"/>
+            <w:tcBorders>
+              <w:bottom w:val="single" w:sz="4" w:space="0" w:color="auto"/>
+            </w:tcBorders>
+            <w:vAlign w:val="center"/>
+          </w:tcPr>
+          <w:p>
+            <w:pPr>
+              <w:keepNext/>
+              <w:rPr>
+                <w:sz w:val="15"/>
+              </w:rPr>
+            </w:pPr>
+            <w:r>
+              <w:rPr>
+                <w:sz w:val="15"/>
+              </w:rPr>
+              <w:t xml:space="preserve">{24, 48, 72, 168} h</w:t>
+            </w:r>
+          </w:p>
+        </w:tc>
+      </w:tr>
+    </w:tbl>
+    <w:p>
+      <w:pPr>
+        <w:pStyle w:val="Heading2"/>
+        <w:spacing w:before="200"/>
+        <w:rPr>
+          <w:i w:val="0"/>
+        </w:rPr>
+      </w:pPr>
+      <w:r>
+        <w:rPr>
+          <w:i w:val="0"/>
+        </w:rPr>
+        <w:t>Resultados de la búsqueda</w:t>
+      </w:r>
+    </w:p>
+    <w:p>
+      <w:pPr>
+        <w:pStyle w:val="Text"/>
+      </w:pPr>
+      <w:r>
+        <w:t xml:space="preserve">La </w:t>
+      </w:r>
+      <w:r>
+        <w:fldChar w:fldCharType="begin"/>
+      </w:r>
+      <w:r>
+        <w:instrText xml:space="preserve"> REF _RefFig4 \h </w:instrText>
+      </w:r>
+      <w:r>
+        <w:fldChar w:fldCharType="separate"/>
+      </w:r>
+      <w:r>
+        <w:t xml:space="preserve">Fig. 4</w:t>
+      </w:r>
+      <w:r>
+        <w:fldChar w:fldCharType="end"/>
+      </w:r>
+      <w:r>
+        <w:t xml:space="preserve"> y la </w:t>
+      </w:r>
+      <w:r>
+        <w:fldChar w:fldCharType="begin"/>
+      </w:r>
+      <w:r>
+        <w:instrText xml:space="preserve"> REF _RefTablaII \h </w:instrText>
+      </w:r>
+      <w:r>
+        <w:fldChar w:fldCharType="separate"/>
+      </w:r>
+      <w:r>
+        <w:t xml:space="preserve">Tabla II</w:t>
+      </w:r>
+      <w:r>
+        <w:fldChar w:fldCharType="end"/>
+      </w:r>
+      <w:r>
+        <w:t xml:space="preserve"> resumen las 18 corridas. En la etapa 1, con 64 unidades y 72 h, SimpleRNN (1.523 °C) y GRU </w:t>
+      </w:r>
+      <w:r>
+        <w:t>(1.525 °C) empataron y LSTM quedó atrás (1.615 °C). Las curvas de entrenamiento explican la diferencia: LSTM y GRU alcanzaron su mejor época en la 5 y en la 6, y desde ahí el error de validación subió mientras el de entrenamiento seguía bajando; la SimpleRNN, en cambio, mejoró hasta la época 14. Con 2.5 a 3.3 veces más parámetros para las mismas 15,555 muestras, las celdas con compuertas sobreajustan antes.</w:t>
+      </w:r>
+    </w:p>
+    <w:p>
+      <w:pPr>
+        <w:pStyle w:val="TableTitle"/>
+        <w:keepNext/>
+        <w:spacing w:before="280"/>
+      </w:pPr>
+      <w:bookmarkStart w:id="104" w:name="_RefTablaII"/>
+      <w:r>
+        <w:t>Tabla II</w:t>
       </w:r>
       <w:bookmarkEnd w:id="104"/>
     </w:p>
@@ -1776,7 +2264,7 @@
               <w:rPr>
                 <w:sz w:val="15"/>
               </w:rPr>
-              <w:t>6 488</w:t>
+              <w:t>6,488</w:t>
             </w:r>
           </w:p>
         </w:tc>
@@ -1899,7 +2387,7 @@
               <w:rPr>
                 <w:sz w:val="15"/>
               </w:rPr>
-              <w:t>16 536</w:t>
+              <w:t>16,536</w:t>
             </w:r>
           </w:p>
         </w:tc>
@@ -2022,7 +2510,7 @@
               <w:rPr>
                 <w:sz w:val="15"/>
               </w:rPr>
-              <w:t>21 272</w:t>
+              <w:t>21,272</w:t>
             </w:r>
           </w:p>
         </w:tc>
@@ -2151,7 +2639,7 @@
               <w:rPr>
                 <w:sz w:val="15"/>
               </w:rPr>
-              <w:t>2 232</w:t>
+              <w:t>2,232</w:t>
             </w:r>
           </w:p>
         </w:tc>
@@ -2274,7 +2762,7 @@
               <w:rPr>
                 <w:sz w:val="15"/>
               </w:rPr>
-              <w:t>4 312</w:t>
+              <w:t>4,312</w:t>
             </w:r>
           </w:p>
         </w:tc>
@@ -2397,7 +2885,7 @@
               <w:rPr>
                 <w:sz w:val="15"/>
               </w:rPr>
-              <w:t>14 744</w:t>
+              <w:t>14,744</w:t>
             </w:r>
           </w:p>
         </w:tc>
@@ -2520,7 +3008,7 @@
               <w:rPr>
                 <w:sz w:val="15"/>
               </w:rPr>
-              <w:t>54 040</w:t>
+              <w:t>54,040</w:t>
             </w:r>
           </w:p>
         </w:tc>
@@ -2643,7 +3131,7 @@
               <w:rPr>
                 <w:sz w:val="15"/>
               </w:rPr>
-              <w:t>21 144</w:t>
+              <w:t>21,144</w:t>
             </w:r>
           </w:p>
         </w:tc>
@@ -2779,7 +3267,7 @@
               <w:rPr>
                 <w:sz w:val="15"/>
               </w:rPr>
-              <w:t>2 232</w:t>
+              <w:t>2,232</w:t>
             </w:r>
           </w:p>
         </w:tc>
@@ -2902,7 +3390,7 @@
               <w:rPr>
                 <w:sz w:val="15"/>
               </w:rPr>
-              <w:t>2 232</w:t>
+              <w:t>2,232</w:t>
             </w:r>
           </w:p>
         </w:tc>
@@ -3032,7 +3520,7 @@
               <w:rPr>
                 <w:sz w:val="15"/>
               </w:rPr>
-              <w:t>2 232</w:t>
+              <w:t>2,232</w:t>
             </w:r>
           </w:p>
         </w:tc>
@@ -3162,7 +3650,7 @@
               <w:rPr>
                 <w:sz w:val="15"/>
               </w:rPr>
-              <w:t>2 232</w:t>
+              <w:t>2,232</w:t>
             </w:r>
           </w:p>
         </w:tc>
@@ -3285,7 +3773,7 @@
               <w:rPr>
                 <w:sz w:val="15"/>
               </w:rPr>
-              <w:t>2 232</w:t>
+              <w:t>2,232</w:t>
             </w:r>
           </w:p>
         </w:tc>
@@ -3414,7 +3902,7 @@
               <w:rPr>
                 <w:sz w:val="15"/>
               </w:rPr>
-              <w:t>2 232</w:t>
+              <w:t>2,232</w:t>
             </w:r>
           </w:p>
         </w:tc>
@@ -3537,7 +4025,7 @@
               <w:rPr>
                 <w:sz w:val="15"/>
               </w:rPr>
-              <w:t>2 232</w:t>
+              <w:t>2,232</w:t>
             </w:r>
           </w:p>
         </w:tc>
@@ -3660,7 +4148,7 @@
               <w:rPr>
                 <w:sz w:val="15"/>
               </w:rPr>
-              <w:t>2 232</w:t>
+              <w:t>2,232</w:t>
             </w:r>
           </w:p>
         </w:tc>
@@ -3789,7 +4277,7 @@
               <w:rPr>
                 <w:sz w:val="15"/>
               </w:rPr>
-              <w:t>5 208</w:t>
+              <w:t>5,208</w:t>
             </w:r>
           </w:p>
         </w:tc>
@@ -3930,7 +4418,7 @@
               <w:rPr>
                 <w:sz w:val="15"/>
               </w:rPr>
-              <w:t>6 552</w:t>
+              <w:t>6,552</w:t>
             </w:r>
           </w:p>
         </w:tc>
@@ -3939,7 +4427,7 @@
     <w:p>
       <w:pPr>
         <w:pStyle w:val="FigureCaption"/>
-        <w:spacing w:before="40"/>
+        <w:spacing w:before="40" w:after="280"/>
         <w:rPr>
           <w:sz w:val="14"/>
         </w:rPr>
@@ -4000,13 +4488,13 @@
         <w:t>−4</w:t>
       </w:r>
       <w:r>
-        <w:t xml:space="preserve"> y ventana de 168 h, con 2 232 parámetros entrenables. Cada configuración se entrenó con una sola semilla, así que las diferencias de milésimas de grado no son significativas y la ejecución en GPU no es del todo determinista.</w:t>
+        <w:t xml:space="preserve"> y ventana de 168 h, con 2,232 parámetros entrenables. Cada configuración se entrenó con una sola semilla, así que las diferencias de milésimas de grado no son significativas y la ejecución en GPU no es del todo determinista.</w:t>
       </w:r>
     </w:p>
     <w:p>
       <w:pPr>
         <w:keepNext/>
-        <w:spacing w:before="120"/>
+        <w:spacing w:before="240"/>
         <w:jc w:val="center"/>
       </w:pPr>
       <w:r>
@@ -4053,7 +4541,7 @@
     <w:p>
       <w:pPr>
         <w:pStyle w:val="FigureCaption"/>
-        <w:spacing w:before="60" w:after="160"/>
+        <w:spacing w:before="60" w:after="280"/>
       </w:pPr>
       <w:bookmarkStart w:id="105" w:name="_RefFig4"/>
       <w:r>
@@ -4061,7 +4549,13 @@
       </w:r>
       <w:bookmarkEnd w:id="105"/>
       <w:r>
-        <w:t xml:space="preserve">. Búsqueda de hiperparámetros del Punto 1. Cada fila es una corrida: el punto lleno es el MAE de validación y el hueco, el de entrenamiento; la distancia entre ambos mide el sobreajuste. En naranja, la ganadora de cada etapa.</w:t>
+        <w:t xml:space="preserve">. Búsqueda de hiperparámetros del Punto 1. Cada fila es una corrida: </w:t>
+      </w:r>
+      <w:r>
+        <w:t xml:space="preserve">el punto relleno es el MAE de validación y el punto vacío, el de entrenamiento</w:t>
+      </w:r>
+      <w:r>
+        <w:t xml:space="preserve">; la distancia entre ambos mide el sobreajuste. En naranja, la ganadora de cada etapa.</w:t>
       </w:r>
     </w:p>
     <w:p>
@@ -4089,19 +4583,19 @@
         <w:fldChar w:fldCharType="begin"/>
       </w:r>
       <w:r>
-        <w:instrText xml:space="preserve"> REF _RefTablaII \h </w:instrText>
+        <w:instrText xml:space="preserve"> REF _RefTablaIII \h </w:instrText>
       </w:r>
       <w:r>
         <w:fldChar w:fldCharType="separate"/>
       </w:r>
       <w:r>
-        <w:t xml:space="preserve">Tabla II</w:t>
+        <w:t xml:space="preserve">Tabla III</w:t>
       </w:r>
       <w:r>
         <w:fldChar w:fldCharType="end"/>
       </w:r>
       <w:r>
-        <w:t xml:space="preserve"> compara el modelo final con las líneas base sobre las 7 701 ventanas de prueba. La RNN obtiene un MAE de 1.602 °C y un RMSE de 2.142 °C, un 24.7 % por debajo de «ayer», la línea base más fuerte (2.128 °C); la persistencia y la climatología quedan en 2.785 y 2.871 °C. La </w:t>
+        <w:t xml:space="preserve"> compara el modelo final con las líneas base sobre las 7,701 ventanas de prueba. La RNN obtiene un MAE de 1.602 °C y un RMSE de 2.142 °C, un 24.7 % por debajo de «ayer», la línea base más fuerte (2.128 °C); la persistencia y la climatología quedan en 2.785 y 2.871 °C. La </w:t>
       </w:r>
       <w:r>
         <w:fldChar w:fldCharType="begin"/>
@@ -4126,11 +4620,11 @@
       <w:pPr>
         <w:pStyle w:val="TableTitle"/>
         <w:keepNext/>
-        <w:spacing w:before="160"/>
-      </w:pPr>
-      <w:bookmarkStart w:id="106" w:name="_RefTablaII"/>
-      <w:r>
-        <w:t>Tabla II</w:t>
+        <w:spacing w:before="280"/>
+      </w:pPr>
+      <w:bookmarkStart w:id="106" w:name="_RefTablaIII"/>
+      <w:r>
+        <w:t>Tabla III</w:t>
       </w:r>
       <w:bookmarkEnd w:id="106"/>
     </w:p>
@@ -4651,7 +5145,7 @@
     <w:p>
       <w:pPr>
         <w:pStyle w:val="FigureCaption"/>
-        <w:spacing w:before="40"/>
+        <w:spacing w:before="40" w:after="280"/>
         <w:rPr>
           <w:sz w:val="14"/>
         </w:rPr>
@@ -4660,13 +5154,13 @@
         <w:rPr>
           <w:sz w:val="14"/>
         </w:rPr>
-        <w:t>Promedios sobre 7 701 ventanas y 24 horizontes, sin las horas imputadas.</w:t>
+        <w:t>Promedios sobre 7,701 ventanas y 24 horizontes, sin las horas imputadas.</w:t>
       </w:r>
     </w:p>
     <w:p>
       <w:pPr>
         <w:keepNext/>
-        <w:spacing w:before="120"/>
+        <w:spacing w:before="240"/>
         <w:jc w:val="center"/>
       </w:pPr>
       <w:r>
@@ -4713,7 +5207,7 @@
     <w:p>
       <w:pPr>
         <w:pStyle w:val="FigureCaption"/>
-        <w:spacing w:before="60" w:after="160"/>
+        <w:spacing w:before="60" w:after="280"/>
       </w:pPr>
       <w:bookmarkStart w:id="107" w:name="_RefFig5"/>
       <w:r>
@@ -4751,6 +5245,73 @@
       </w:r>
       <w:r>
         <w:t>1.78 °C. Los meses más fáciles fueron mayo y junio (1.41 y 1.47 °C); en junio ambos modelos casi empatan porque los días se parecen mucho entre sí. Por hora de emisión, los pronósticos hechos de madrugada (3 a 5 UTC) son los peores (1.72 °C) y los emitidos hacia el mediodía, los mejores (1.50 °C): a mediodía la red ya observó cómo empezó el día, mientras que de madrugada debe anticipar el máximo de la tarde con la información del día anterior.</w:t>
+      </w:r>
+    </w:p>
+    <w:p>
+      <w:pPr>
+        <w:keepNext/>
+        <w:spacing w:before="240"/>
+        <w:jc w:val="center"/>
+      </w:pPr>
+      <w:r>
+        <w:rPr>
+          <w:noProof/>
+        </w:rPr>
+        <w:drawing>
+          <wp:inline distT="0" distB="0" distL="0" distR="0" wp14:anchorId="1D74DC91" wp14:editId="21C3BD80">
+            <wp:extent cx="3017520" cy="3956507"/>
+            <wp:effectExtent l="0" t="0" r="1270" b="4445"/>
+            <wp:docPr id="862538757" name="Picture 8"/>
+            <wp:cNvGraphicFramePr>
+              <a:graphicFrameLocks xmlns:a="http://schemas.openxmlformats.org/drawingml/2006/main" noChangeAspect="1"/>
+            </wp:cNvGraphicFramePr>
+            <a:graphic xmlns:a="http://schemas.openxmlformats.org/drawingml/2006/main">
+              <a:graphicData uri="http://schemas.openxmlformats.org/drawingml/2006/picture">
+                <pic:pic xmlns:pic="http://schemas.openxmlformats.org/drawingml/2006/picture">
+                  <pic:nvPicPr>
+                    <pic:cNvPr id="862538757" name=""/>
+                    <pic:cNvPicPr/>
+                  </pic:nvPicPr>
+                  <pic:blipFill>
+                    <a:blip r:embed="rId31"/>
+                    <a:stretch>
+                      <a:fillRect/>
+                    </a:stretch>
+                  </pic:blipFill>
+                  <pic:spPr>
+                    <a:xfrm>
+                      <a:off x="0" y="0"/>
+                      <a:ext cx="3017520" cy="3956507"/>
+                    </a:xfrm>
+                    <a:prstGeom prst="rect">
+                      <a:avLst/>
+                    </a:prstGeom>
+                  </pic:spPr>
+                </pic:pic>
+              </a:graphicData>
+            </a:graphic>
+          </wp:inline>
+        </w:drawing>
+      </w:r>
+    </w:p>
+    <w:p>
+      <w:pPr>
+        <w:pStyle w:val="FigureCaption"/>
+        <w:spacing w:before="60" w:after="280"/>
+      </w:pPr>
+      <w:bookmarkStart w:id="108" w:name="_RefFig6"/>
+      <w:r>
+        <w:t xml:space="preserve">Fig. 6</w:t>
+      </w:r>
+      <w:bookmarkEnd w:id="108"/>
+      <w:r>
+        <w:t xml:space="preserve">. MAE de la RNN y de la línea base «ayer» en el conjunto de prueba, </w:t>
+      </w:r>
+      <w:r>
+        <w:t xml:space="preserve">(arriba) por mes de 2018 y (abajo) según la hora</w:t>
+      </w:r>
+      <w:r>
+        <w:t xml:space="preserve"> en que se emite el pronóstico.</w:t>
       </w:r>
     </w:p>
     <w:p>
@@ -4794,68 +5355,7 @@
     <w:p>
       <w:pPr>
         <w:keepNext/>
-        <w:spacing w:before="120"/>
-        <w:jc w:val="center"/>
-      </w:pPr>
-      <w:r>
-        <w:rPr>
-          <w:noProof/>
-        </w:rPr>
-        <w:drawing>
-          <wp:inline distT="0" distB="0" distL="0" distR="0" wp14:anchorId="1D74DC91" wp14:editId="21C3BD80">
-            <wp:extent cx="6056986" cy="1881708"/>
-            <wp:effectExtent l="0" t="0" r="1270" b="4445"/>
-            <wp:docPr id="862538757" name="Picture 8"/>
-            <wp:cNvGraphicFramePr>
-              <a:graphicFrameLocks xmlns:a="http://schemas.openxmlformats.org/drawingml/2006/main" noChangeAspect="1"/>
-            </wp:cNvGraphicFramePr>
-            <a:graphic xmlns:a="http://schemas.openxmlformats.org/drawingml/2006/main">
-              <a:graphicData uri="http://schemas.openxmlformats.org/drawingml/2006/picture">
-                <pic:pic xmlns:pic="http://schemas.openxmlformats.org/drawingml/2006/picture">
-                  <pic:nvPicPr>
-                    <pic:cNvPr id="862538757" name=""/>
-                    <pic:cNvPicPr/>
-                  </pic:nvPicPr>
-                  <pic:blipFill>
-                    <a:blip r:embed="rId19"/>
-                    <a:stretch>
-                      <a:fillRect/>
-                    </a:stretch>
-                  </pic:blipFill>
-                  <pic:spPr>
-                    <a:xfrm>
-                      <a:off x="0" y="0"/>
-                      <a:ext cx="6056986" cy="1881708"/>
-                    </a:xfrm>
-                    <a:prstGeom prst="rect">
-                      <a:avLst/>
-                    </a:prstGeom>
-                  </pic:spPr>
-                </pic:pic>
-              </a:graphicData>
-            </a:graphic>
-          </wp:inline>
-        </w:drawing>
-      </w:r>
-    </w:p>
-    <w:p>
-      <w:pPr>
-        <w:pStyle w:val="FigureCaption"/>
-        <w:spacing w:before="60" w:after="160"/>
-      </w:pPr>
-      <w:bookmarkStart w:id="108" w:name="_RefFig6"/>
-      <w:r>
-        <w:t xml:space="preserve">Fig. 6</w:t>
-      </w:r>
-      <w:bookmarkEnd w:id="108"/>
-      <w:r>
-        <w:t xml:space="preserve">. MAE de la RNN y de la línea base «ayer» en el conjunto de prueba, (izquierda) por mes de 2018 y (derecha) según la hora en que se emite el pronóstico.</w:t>
-      </w:r>
-    </w:p>
-    <w:p>
-      <w:pPr>
-        <w:keepNext/>
-        <w:spacing w:before="120"/>
+        <w:spacing w:before="240"/>
         <w:jc w:val="center"/>
       </w:pPr>
       <w:r>
@@ -4902,7 +5402,7 @@
     <w:p>
       <w:pPr>
         <w:pStyle w:val="FigureCaption"/>
-        <w:spacing w:before="60" w:after="160"/>
+        <w:spacing w:before="60" w:after="280"/>
         <w:sectPr>
           <w:type w:val="continuous"/>
           <w:pgSz w:w="12240" w:h="15840" w:code="1"/>
@@ -5000,7 +5500,7 @@
         <w:pStyle w:val="Text"/>
       </w:pPr>
       <w:r>
-        <w:t xml:space="preserve">Fashion-MNIST tiene 60 000 imágenes de desarrollo y 10 000 de prueba, de 28 × 28 píxeles en escala de grises y diez clases balanceadas (</w:t>
+        <w:t xml:space="preserve">Fashion-MNIST tiene 60,000 imágenes de desarrollo y 10,000 de prueba, de 28 × 28 píxeles en escala de grises y diez clases balanceadas (</w:t>
       </w:r>
       <w:r>
         <w:fldChar w:fldCharType="begin"/>
@@ -5018,13 +5518,13 @@
         <w:fldChar w:fldCharType="end"/>
       </w:r>
       <w:r>
-        <w:t xml:space="preserve">). Antes de partir los datos se verificó su integridad: tipo uint8, rango de 0 a 255, diez etiquetas, ninguna imagen repetida dentro del desarrollo y ninguna imagen de prueba repetida en el desarrollo. El desarrollo se partió de forma estratificada en 54 000 imágenes de entrenamiento y 6 000 de validación (5 400 y 600 por clase); la prueba conserva sus 1 000 imágenes por clase y solo se usó en la evaluación final.</w:t>
+        <w:t xml:space="preserve">). Antes de partir los datos se verificó su integridad: tipo uint8, rango de 0 a 255, diez etiquetas, ninguna imagen repetida dentro del desarrollo y ninguna imagen de prueba repetida en el desarrollo. El desarrollo se partió de forma estratificada en 54,000 imágenes de entrenamiento y 6,000 de validación (5,400 y 600 por clase); la prueba conserva sus 1,000 imágenes por clase y solo se usó en la evaluación final.</w:t>
       </w:r>
     </w:p>
     <w:p>
       <w:pPr>
         <w:keepNext/>
-        <w:spacing w:before="120"/>
+        <w:spacing w:before="240"/>
         <w:jc w:val="center"/>
       </w:pPr>
       <w:r>
@@ -5071,7 +5571,7 @@
     <w:p>
       <w:pPr>
         <w:pStyle w:val="FigureCaption"/>
-        <w:spacing w:before="60" w:after="160"/>
+        <w:spacing w:before="60" w:after="280"/>
       </w:pPr>
       <w:bookmarkStart w:id="110" w:name="_RefFig8"/>
       <w:r>
@@ -5124,13 +5624,13 @@
         <w:fldChar w:fldCharType="begin"/>
       </w:r>
       <w:r>
-        <w:instrText xml:space="preserve"> REF _RefTablaIII \h </w:instrText>
+        <w:instrText xml:space="preserve"> REF _RefTablaIV \h </w:instrText>
       </w:r>
       <w:r>
         <w:fldChar w:fldCharType="separate"/>
       </w:r>
       <w:r>
-        <w:t xml:space="preserve">Tabla III</w:t>
+        <w:t xml:space="preserve">Tabla IV</w:t>
       </w:r>
       <w:r>
         <w:fldChar w:fldCharType="end"/>
@@ -5172,7 +5672,7 @@
         <w:t>softmax</w:t>
       </w:r>
       <w:r>
-        <w:t xml:space="preserve">. Trabaja en la resolución nativa y tiene 28 714 parámetros. El diseño es compacto a propósito: imágenes de 28 × 28 con fondo uniforme no </w:t>
+        <w:t xml:space="preserve">. Trabaja en la resolución nativa y tiene 28,714 parámetros. El diseño es compacto a propósito: imágenes de 28 × 28 con fondo uniforme no </w:t>
       </w:r>
       <w:r>
         <w:t>necesitan una jerarquía profunda, y el agrupamiento global evita la gran capa densa de las arquitecturas clásicas.</w:t>
@@ -5186,16 +5686,16 @@
         <w:rPr>
           <w:i/>
         </w:rPr>
-        <w:t>VGG16 con filtros de ImageNet</w:t>
-      </w:r>
-      <w:r>
-        <w:t xml:space="preserve"> es la red «grande» que pide el enunciado: se reutilizan sus trece capas convolucionales [7] con los pesos de ImageNet y se reemplaza la parte clasificadora por GAP, </w:t>
+        <w:t xml:space="preserve">VGG16 con filtros de ImageNet</w:t>
+      </w:r>
+      <w:r>
+        <w:t xml:space="preserve"> reutiliza las trece capas convolucionales de VGG16 [7] con los pesos de ImageNet y reemplaza la parte clasificadora por GAP, </w:t>
       </w:r>
       <w:r>
         <w:rPr>
           <w:i/>
         </w:rPr>
-        <w:t>dropout</w:t>
+        <w:t xml:space="preserve">dropout</w:t>
       </w:r>
       <w:r>
         <w:t xml:space="preserve"> y </w:t>
@@ -5204,7 +5704,7 @@
         <w:rPr>
           <w:i/>
         </w:rPr>
-        <w:t>softmax</w:t>
+        <w:t xml:space="preserve">softmax</w:t>
       </w:r>
       <w:r>
         <w:t xml:space="preserve">. La imagen se redimensiona a 96 × 96 y el gris se replica en los tres canales, centrado con las medias de ImageNet. </w:t>
@@ -5213,7 +5713,7 @@
         <w:rPr>
           <w:i/>
         </w:rPr>
-        <w:t>MobileNetV2</w:t>
+        <w:t xml:space="preserve">MobileNetV2</w:t>
       </w:r>
       <w:r>
         <w:t xml:space="preserve"> se usa con multiplicador de ancho 1.0 y pesos de ImageNet para entradas de 96 × 96 [9]; reemplaza las convoluciones estándar por bloques residuales invertidos con convoluciones separables en profundidad, la entrada se escala a [−1, 1] y la cabeza es igual a la de VGG16. La resolución de 96 × 96 equilibra el costo con un tamaño razonable para los filtros de ImageNet; Keras exige al menos 32 × 32 y, a esa resolución, los mapas de la última capa serían de 1 × 1.</w:t>
@@ -5224,27 +5724,54 @@
         <w:pStyle w:val="Text"/>
       </w:pPr>
       <w:r>
-        <w:t>Las dos redes preentrenadas siguen el esquema de dos fases recomendado para la transferencia [29]: primero se entrena solo la cabeza con el extractor congelado y luego se hace ajuste fino (</w:t>
+        <w:t xml:space="preserve">Las dos redes preentrenadas siguen el esquema de dos fases recomendado para la transferencia [29]: primero se entrena solo la cabeza </w:t>
+      </w:r>
+      <w:r>
+        <w:t xml:space="preserve">con la red base (</w:t>
       </w:r>
       <w:r>
         <w:rPr>
           <w:i/>
         </w:rPr>
+        <w:t xml:space="preserve">backbone</w:t>
+      </w:r>
+      <w:r>
+        <w:t xml:space="preserve">) congelada y luego</w:t>
+      </w:r>
+      <w:r>
+        <w:t xml:space="preserve"> se hace ajuste fino (</w:t>
+      </w:r>
+      <w:r>
+        <w:rPr>
+          <w:i/>
+        </w:rPr>
         <w:t>fine-tuning</w:t>
       </w:r>
       <w:r>
-        <w:t>) de las últimas capas del extractor —el último bloque convolucional de VGG16 y los dos últimos bloques residuales de MobileNetV2 con su convolución final— con una tasa de aprendizaje diez veces menor y con las capas de normalización por lotes congeladas.</w:t>
+        <w:t xml:space="preserve">) de </w:t>
+      </w:r>
+      <w:r>
+        <w:t xml:space="preserve">las últimas capas del </w:t>
+      </w:r>
+      <w:r>
+        <w:rPr>
+          <w:i/>
+        </w:rPr>
+        <w:t xml:space="preserve">backbone</w:t>
+      </w:r>
+      <w:r>
+        <w:t xml:space="preserve"> —el último bloque convolucional de VGG16 y los dos últimos bloques residuales de MobileNetV2 con su convolución final— con una tasa de aprendizaje diez veces menor y con las capas de normalización por lotes congeladas.</w:t>
       </w:r>
     </w:p>
     <w:p>
       <w:pPr>
         <w:pStyle w:val="TableTitle"/>
         <w:keepNext/>
-        <w:spacing w:before="160"/>
-      </w:pPr>
-      <w:bookmarkStart w:id="111" w:name="_RefTablaIII"/>
-      <w:r>
-        <w:t>Tabla III</w:t>
+        <w:spacing w:before="280"/>
+      </w:pPr>
+      <w:bookmarkStart w:id="111" w:name="_RefTablaIV"/>
+      <w:r>
+        <w:t>Tabla IV</w:t>
       </w:r>
       <w:bookmarkEnd w:id="111"/>
     </w:p>
@@ -5455,7 +5982,7 @@
               <w:rPr>
                 <w:sz w:val="16"/>
               </w:rPr>
-              <w:t>28 714</w:t>
+              <w:t>28,714</w:t>
             </w:r>
           </w:p>
         </w:tc>
@@ -5479,7 +6006,7 @@
               <w:rPr>
                 <w:sz w:val="16"/>
               </w:rPr>
-              <w:t>28 522</w:t>
+              <w:t>28,522</w:t>
             </w:r>
           </w:p>
         </w:tc>
@@ -5545,7 +6072,7 @@
               <w:rPr>
                 <w:sz w:val="16"/>
               </w:rPr>
-              <w:t>14 719 818</w:t>
+              <w:t>14,719,818</w:t>
             </w:r>
           </w:p>
         </w:tc>
@@ -5566,7 +6093,7 @@
               <w:rPr>
                 <w:sz w:val="16"/>
               </w:rPr>
-              <w:t>5 130</w:t>
+              <w:t>5,130</w:t>
             </w:r>
             <w:r>
               <w:rPr>
@@ -5578,7 +6105,7 @@
               <w:rPr>
                 <w:sz w:val="16"/>
               </w:rPr>
-              <w:t>7 084 554</w:t>
+              <w:t>7,084,554</w:t>
             </w:r>
           </w:p>
         </w:tc>
@@ -5653,7 +6180,7 @@
               <w:rPr>
                 <w:sz w:val="16"/>
               </w:rPr>
-              <w:t>2 270 794</w:t>
+              <w:t>2,270,794</w:t>
             </w:r>
           </w:p>
         </w:tc>
@@ -5677,7 +6204,7 @@
               <w:rPr>
                 <w:sz w:val="16"/>
               </w:rPr>
-              <w:t>12 810</w:t>
+              <w:t>12,810</w:t>
             </w:r>
             <w:r>
               <w:rPr>
@@ -5689,7 +6216,7 @@
               <w:rPr>
                 <w:sz w:val="16"/>
               </w:rPr>
-              <w:t>1 207 690</w:t>
+              <w:t>1,207,690</w:t>
             </w:r>
           </w:p>
         </w:tc>
@@ -5698,7 +6225,7 @@
     <w:p>
       <w:pPr>
         <w:pStyle w:val="FigureCaption"/>
-        <w:spacing w:before="40"/>
+        <w:spacing w:before="40" w:after="280"/>
         <w:rPr>
           <w:sz w:val="14"/>
         </w:rPr>
@@ -5707,7 +6234,32 @@
         <w:rPr>
           <w:sz w:val="14"/>
         </w:rPr>
-        <w:t>Entrenables de las preentrenadas: con el extractor congelado (arriba) y durante el ajuste fino (abajo). BN: normalización por lotes; GAP: agrupamiento promedio global.</w:t>
+        <w:t xml:space="preserve">Entrenables de las preentrenadas: </w:t>
+      </w:r>
+      <w:r>
+        <w:rPr>
+          <w:sz w:val="14"/>
+        </w:rPr>
+        <w:t xml:space="preserve">con el </w:t>
+      </w:r>
+      <w:r>
+        <w:rPr>
+          <w:sz w:val="14"/>
+          <w:i/>
+        </w:rPr>
+        <w:t xml:space="preserve">backbone</w:t>
+      </w:r>
+      <w:r>
+        <w:rPr>
+          <w:sz w:val="14"/>
+        </w:rPr>
+        <w:t xml:space="preserve"> congelado (arriba)</w:t>
+      </w:r>
+      <w:r>
+        <w:rPr>
+          <w:sz w:val="14"/>
+        </w:rPr>
+        <w:t xml:space="preserve"> y durante el ajuste fino (abajo). BN: normalización por lotes; GAP: agrupamiento promedio global.</w:t>
       </w:r>
     </w:p>
     <w:p>
@@ -5729,7 +6281,7 @@
         <w:pStyle w:val="Text"/>
       </w:pPr>
       <w:r>
-        <w:t xml:space="preserve">La búsqueda fue manual y estructurada, con el mismo presupuesto para las tres familias: las 54 000 imágenes de entrenamiento, 12 épocas por corrida y pesos nuevos en cada una. Se variaron la capacidad (solo en la CNN: 32–64 frente a 64–128 filtros), el </w:t>
+        <w:t xml:space="preserve">La búsqueda fue manual y estructurada, con el mismo presupuesto para las tres familias: las 54,000 imágenes de entrenamiento, 12 épocas por corrida y pesos nuevos en cada una. Se variaron la capacidad (solo en la CNN: 32–64 frente a 64–128 filtros), el </w:t>
       </w:r>
       <w:r>
         <w:rPr>
@@ -5762,13 +6314,13 @@
         <w:fldChar w:fldCharType="begin"/>
       </w:r>
       <w:r>
-        <w:instrText xml:space="preserve"> REF _RefTablaIV \h </w:instrText>
+        <w:instrText xml:space="preserve"> REF _RefTablaV \h </w:instrText>
       </w:r>
       <w:r>
         <w:fldChar w:fldCharType="separate"/>
       </w:r>
       <w:r>
-        <w:t xml:space="preserve">Tabla IV</w:t>
+        <w:t xml:space="preserve">Tabla V</w:t>
       </w:r>
       <w:r>
         <w:fldChar w:fldCharType="end"/>
@@ -5864,11 +6416,11 @@
       <w:pPr>
         <w:pStyle w:val="TableTitle"/>
         <w:keepNext/>
-        <w:spacing w:before="160"/>
-      </w:pPr>
-      <w:bookmarkStart w:id="112" w:name="_RefTablaIV"/>
-      <w:r>
-        <w:t>Tabla IV</w:t>
+        <w:spacing w:before="280"/>
+      </w:pPr>
+      <w:bookmarkStart w:id="112" w:name="_RefTablaV"/>
+      <w:r>
+        <w:t>Tabla V</w:t>
       </w:r>
       <w:bookmarkEnd w:id="112"/>
     </w:p>
@@ -7421,7 +7973,7 @@
     <w:p>
       <w:pPr>
         <w:pStyle w:val="FigureCaption"/>
-        <w:spacing w:before="40"/>
+        <w:spacing w:before="40" w:after="280"/>
         <w:rPr>
           <w:sz w:val="14"/>
         </w:rPr>
@@ -7430,7 +7982,7 @@
         <w:rPr>
           <w:sz w:val="14"/>
         </w:rPr>
-        <w:t>Doce épocas por corrida sobre las 54 000 imágenes de entrenamiento; aum.: aumentación de datos.</w:t>
+        <w:t>Doce épocas por corrida sobre las 54,000 imágenes de entrenamiento; aum.: aumentación de datos.</w:t>
       </w:r>
     </w:p>
     <w:p>
@@ -7458,7 +8010,7 @@
         </w:sectPr>
       </w:pPr>
       <w:r>
-        <w:t xml:space="preserve">Con la mejor configuración de cada familia se entrenó sobre las 54 000 imágenes hasta 30 épocas, más 15 de ajuste fino para las preentrenadas, siempre con parada temprana (</w:t>
+        <w:t xml:space="preserve">Con la mejor configuración de cada familia se entrenó sobre las 54,000 imágenes hasta 30 épocas, más 15 de ajuste fino para las preentrenadas, siempre con parada temprana (</w:t>
       </w:r>
       <w:r>
         <w:fldChar w:fldCharType="begin"/>
@@ -7476,13 +8028,28 @@
         <w:fldChar w:fldCharType="end"/>
       </w:r>
       <w:r>
-        <w:t xml:space="preserve">). La CNN usó las 30 épocas y su mejor época fue la 28, con 89.47 % en validación. VGG16 se estancó en la fase congelada (88.67 % en la época 26), por debajo de la CNN propia, y el ajuste fino le dio el mayor salto del experimento: hasta 93.65 % en validación. MobileNetV2 partió más alto con el extractor congelado (90.77 %) y el ajuste fino la llevó a 93.17 %. El contraste confirma que las características de ImageNet no se transfieren tal cual a prendas pequeñas en escala de grises [21], [22]: el cambio de dominio exige adaptar al menos el último bloque. Hay que declarar también que la CNN no tuvo fase de ajuste fino, así que las preentrenadas recibieron más épocas de entrenamiento en total.</w:t>
+        <w:t xml:space="preserve">). La CNN usó las 30 épocas y su mejor época fue la 28, con 89.47 % en validación. VGG16 se estancó en la fase congelada (88.67 % en la época 26), por debajo de la CNN propia, y el ajuste fino le dio el mayor salto del experimento: hasta 93.65 % en validación. MobileNetV2 </w:t>
+      </w:r>
+      <w:r>
+        <w:t xml:space="preserve">partió más alto con el </w:t>
+      </w:r>
+      <w:r>
+        <w:rPr>
+          <w:i/>
+        </w:rPr>
+        <w:t xml:space="preserve">backbone</w:t>
+      </w:r>
+      <w:r>
+        <w:t xml:space="preserve"> congelado</w:t>
+      </w:r>
+      <w:r>
+        <w:t xml:space="preserve"> (90.77 %) y el ajuste fino la llevó a 93.17 %. El contraste confirma que las características de ImageNet no se transfieren tal cual a prendas pequeñas en escala de grises [21], [22]: el cambio de dominio exige adaptar al menos el último bloque. Hay que declarar también que la CNN no tuvo fase de ajuste fino, así que las preentrenadas recibieron más épocas de entrenamiento en total.</w:t>
       </w:r>
     </w:p>
     <w:p>
       <w:pPr>
         <w:keepNext/>
-        <w:spacing w:before="120"/>
+        <w:spacing w:before="240"/>
         <w:jc w:val="center"/>
       </w:pPr>
       <w:r>
@@ -7491,7 +8058,7 @@
         </w:rPr>
         <w:drawing>
           <wp:inline distT="0" distB="0" distL="0" distR="0" wp14:anchorId="3B464E75" wp14:editId="504AC7D5">
-            <wp:extent cx="5925312" cy="2883218"/>
+            <wp:extent cx="4846320" cy="2358188"/>
             <wp:effectExtent l="0" t="0" r="0" b="0"/>
             <wp:docPr id="1979166323" name="Picture 11"/>
             <wp:cNvGraphicFramePr>
@@ -7513,7 +8080,7 @@
                   <pic:spPr>
                     <a:xfrm>
                       <a:off x="0" y="0"/>
-                      <a:ext cx="5925312" cy="2883218"/>
+                      <a:ext cx="4846320" cy="2358188"/>
                     </a:xfrm>
                     <a:prstGeom prst="rect">
                       <a:avLst/>
@@ -7529,7 +8096,7 @@
     <w:p>
       <w:pPr>
         <w:pStyle w:val="FigureCaption"/>
-        <w:spacing w:before="60" w:after="160"/>
+        <w:spacing w:before="60" w:after="280"/>
       </w:pPr>
       <w:bookmarkStart w:id="113" w:name="_RefFig9"/>
       <w:r>
@@ -7543,7 +8110,7 @@
     <w:p>
       <w:pPr>
         <w:keepNext/>
-        <w:spacing w:before="120"/>
+        <w:spacing w:before="240"/>
         <w:jc w:val="center"/>
       </w:pPr>
       <w:r>
@@ -7552,7 +8119,7 @@
         </w:rPr>
         <w:drawing>
           <wp:inline distT="0" distB="0" distL="0" distR="0" wp14:anchorId="390F448F" wp14:editId="445C64A1">
-            <wp:extent cx="5925312" cy="2815781"/>
+            <wp:extent cx="4846320" cy="2303031"/>
             <wp:effectExtent l="0" t="0" r="0" b="3810"/>
             <wp:docPr id="731234947" name="Picture 12"/>
             <wp:cNvGraphicFramePr>
@@ -7574,7 +8141,7 @@
                   <pic:spPr>
                     <a:xfrm>
                       <a:off x="0" y="0"/>
-                      <a:ext cx="5925312" cy="2815781"/>
+                      <a:ext cx="4846320" cy="2303031"/>
                     </a:xfrm>
                     <a:prstGeom prst="rect">
                       <a:avLst/>
@@ -7590,7 +8157,7 @@
     <w:p>
       <w:pPr>
         <w:pStyle w:val="FigureCaption"/>
-        <w:spacing w:before="60" w:after="160"/>
+        <w:spacing w:before="60" w:after="280"/>
         <w:sectPr>
           <w:type w:val="continuous"/>
           <w:pgSz w:w="12240" w:h="15840" w:code="1"/>
@@ -7632,19 +8199,19 @@
         <w:fldChar w:fldCharType="begin"/>
       </w:r>
       <w:r>
-        <w:instrText xml:space="preserve"> REF _RefTablaV \h </w:instrText>
+        <w:instrText xml:space="preserve"> REF _RefTablaVI \h </w:instrText>
       </w:r>
       <w:r>
         <w:fldChar w:fldCharType="separate"/>
       </w:r>
       <w:r>
-        <w:t xml:space="preserve">Tabla V</w:t>
+        <w:t xml:space="preserve">Tabla VI</w:t>
       </w:r>
       <w:r>
         <w:fldChar w:fldCharType="end"/>
       </w:r>
       <w:r>
-        <w:t xml:space="preserve"> resume la evaluación única sobre las 10 000 imágenes de prueba. VGG16 obtiene una exactitud de 93.19 %, MobileNetV2 de 92.43 % y la CNN desde cero de 89.04 %, con el mismo orden en F1 macro y en </w:t>
+        <w:t xml:space="preserve"> resume la evaluación única sobre las 10,000 imágenes de prueba. VGG16 obtiene una exactitud de 93.19 %, MobileNetV2 de 92.43 % y la CNN desde cero de 89.04 %, con el mismo orden en F1 macro y en </w:t>
       </w:r>
       <w:r>
         <w:rPr>
@@ -7653,7 +8220,7 @@
         <w:t xml:space="preserve">log-loss</w:t>
       </w:r>
       <w:r>
-        <w:t xml:space="preserve">. Los intervalos de confianza del 95 %, calculados con 1 000 remuestreos </w:t>
+        <w:t xml:space="preserve">. Los intervalos de confianza del 95 %, calculados con 1,000 remuestreos </w:t>
       </w:r>
       <w:r>
         <w:rPr>
@@ -7686,7 +8253,7 @@
         <w:fldChar w:fldCharType="end"/>
       </w:r>
       <w:r>
-        <w:t xml:space="preserve"> pone esa diferencia en contexto: VGG16 tiene 6.5 veces más parámetros, casi seis veces más parámetros entrenables durante el ajuste fino y usó ocho veces más tiempo de GPU (2 687 s frente a 340 s).</w:t>
+        <w:t xml:space="preserve"> pone esa diferencia en contexto: VGG16 tiene 6.5 veces más parámetros, casi seis veces más parámetros entrenables durante el ajuste fino y usó ocho veces más tiempo de GPU (2,687 s frente a 340 s).</w:t>
       </w:r>
     </w:p>
     <w:p>
@@ -7781,11 +8348,11 @@
       <w:pPr>
         <w:pStyle w:val="TableTitle"/>
         <w:keepNext/>
-        <w:spacing w:before="160"/>
-      </w:pPr>
-      <w:bookmarkStart w:id="115" w:name="_RefTablaV"/>
-      <w:r>
-        <w:t>Tabla V</w:t>
+        <w:spacing w:before="280"/>
+      </w:pPr>
+      <w:bookmarkStart w:id="115" w:name="_RefTablaVI"/>
+      <w:r>
+        <w:t>Tabla VI</w:t>
       </w:r>
       <w:bookmarkEnd w:id="115"/>
     </w:p>
@@ -7796,7 +8363,7 @@
         <w:spacing w:after="60"/>
       </w:pPr>
       <w:r>
-        <w:t>Comparación de las tres aproximaciones en el conjunto de prueba (10 000 imágenes)</w:t>
+        <w:t>Comparación de las tres aproximaciones en el conjunto de prueba (10,000 imágenes)</w:t>
       </w:r>
     </w:p>
     <w:tbl>
@@ -8279,7 +8846,7 @@
               <w:rPr>
                 <w:sz w:val="15"/>
               </w:rPr>
-              <w:t>14 719 818</w:t>
+              <w:t>14,719,818</w:t>
             </w:r>
           </w:p>
         </w:tc>
@@ -8303,7 +8870,7 @@
               <w:rPr>
                 <w:sz w:val="15"/>
               </w:rPr>
-              <w:t>7 084 554</w:t>
+              <w:t>7,084,554</w:t>
             </w:r>
           </w:p>
         </w:tc>
@@ -8327,7 +8894,7 @@
               <w:rPr>
                 <w:sz w:val="15"/>
               </w:rPr>
-              <w:t>2 687</w:t>
+              <w:t>2,687</w:t>
             </w:r>
           </w:p>
         </w:tc>
@@ -8499,7 +9066,7 @@
               <w:rPr>
                 <w:sz w:val="15"/>
               </w:rPr>
-              <w:t>2 270 794</w:t>
+              <w:t>2,270,794</w:t>
             </w:r>
           </w:p>
         </w:tc>
@@ -8520,7 +9087,7 @@
               <w:rPr>
                 <w:sz w:val="15"/>
               </w:rPr>
-              <w:t>1 207 690</w:t>
+              <w:t>1,207,690</w:t>
             </w:r>
           </w:p>
         </w:tc>
@@ -8737,7 +9304,7 @@
               <w:rPr>
                 <w:sz w:val="15"/>
               </w:rPr>
-              <w:t>28 714</w:t>
+              <w:t>28,714</w:t>
             </w:r>
           </w:p>
         </w:tc>
@@ -8761,7 +9328,7 @@
               <w:rPr>
                 <w:sz w:val="15"/>
               </w:rPr>
-              <w:t>28 522</w:t>
+              <w:t>28,522</w:t>
             </w:r>
           </w:p>
         </w:tc>
@@ -8794,7 +9361,7 @@
     <w:p>
       <w:pPr>
         <w:pStyle w:val="FigureCaption"/>
-        <w:spacing w:before="40"/>
+        <w:spacing w:before="40" w:after="280"/>
         <w:rPr>
           <w:sz w:val="14"/>
         </w:rPr>
@@ -8803,13 +9370,13 @@
         <w:rPr>
           <w:sz w:val="14"/>
         </w:rPr>
-        <w:t>IC 95 %: intervalo de confianza de la exactitud por bootstrap (1 000 remuestreos). Entrenables: en la fase final. Tiempo: entrenamiento total en una GPU T4, incluido el ajuste fino.</w:t>
+        <w:t>IC 95 %: intervalo de confianza de la exactitud por bootstrap (1,000 remuestreos). Entrenables: en la fase final. Tiempo: entrenamiento total en una GPU T4, incluido el ajuste fino.</w:t>
       </w:r>
     </w:p>
     <w:p>
       <w:pPr>
         <w:keepNext/>
-        <w:spacing w:before="120"/>
+        <w:spacing w:before="240"/>
         <w:jc w:val="center"/>
       </w:pPr>
       <w:r>
@@ -8856,7 +9423,7 @@
     <w:p>
       <w:pPr>
         <w:pStyle w:val="FigureCaption"/>
-        <w:spacing w:before="60" w:after="160"/>
+        <w:spacing w:before="60" w:after="280"/>
       </w:pPr>
       <w:bookmarkStart w:id="116" w:name="_RefFig11"/>
       <w:r>
@@ -8870,7 +9437,7 @@
     <w:p>
       <w:pPr>
         <w:keepNext/>
-        <w:spacing w:before="120"/>
+        <w:spacing w:before="240"/>
         <w:jc w:val="center"/>
       </w:pPr>
       <w:r>
@@ -8917,7 +9484,7 @@
     <w:p>
       <w:pPr>
         <w:pStyle w:val="FigureCaption"/>
-        <w:spacing w:before="60" w:after="160"/>
+        <w:spacing w:before="60" w:after="280"/>
         <w:sectPr>
           <w:type w:val="continuous"/>
           <w:pgSz w:w="12240" w:h="15840" w:code="1"/>
@@ -8937,7 +9504,7 @@
     <w:p>
       <w:pPr>
         <w:keepNext/>
-        <w:spacing w:before="120"/>
+        <w:spacing w:before="240"/>
         <w:jc w:val="center"/>
       </w:pPr>
       <w:r>
@@ -8984,7 +9551,7 @@
     <w:p>
       <w:pPr>
         <w:pStyle w:val="FigureCaption"/>
-        <w:spacing w:before="60" w:after="160"/>
+        <w:spacing w:before="60" w:after="280"/>
       </w:pPr>
       <w:bookmarkStart w:id="118" w:name="_RefFig13"/>
       <w:r>
@@ -8998,7 +9565,7 @@
     <w:p>
       <w:pPr>
         <w:keepNext/>
-        <w:spacing w:before="120"/>
+        <w:spacing w:before="240"/>
         <w:jc w:val="center"/>
       </w:pPr>
       <w:r>
@@ -9045,7 +9612,7 @@
     <w:p>
       <w:pPr>
         <w:pStyle w:val="FigureCaption"/>
-        <w:spacing w:before="60" w:after="160"/>
+        <w:spacing w:before="60" w:after="280"/>
       </w:pPr>
       <w:bookmarkStart w:id="119" w:name="_RefFig14"/>
       <w:r>
@@ -9090,13 +9657,13 @@
         <w:fldChar w:fldCharType="begin"/>
       </w:r>
       <w:r>
-        <w:instrText xml:space="preserve"> REF _RefTablaIV \h </w:instrText>
+        <w:instrText xml:space="preserve"> REF _RefTablaV \h </w:instrText>
       </w:r>
       <w:r>
         <w:fldChar w:fldCharType="separate"/>
       </w:r>
       <w:r>
-        <w:t xml:space="preserve">Tabla IV</w:t>
+        <w:t xml:space="preserve">Tabla V</w:t>
       </w:r>
       <w:r>
         <w:fldChar w:fldCharType="end"/>
@@ -9128,12 +9695,24 @@
         <w:pStyle w:val="Text"/>
       </w:pPr>
       <w:r>
-        <w:t xml:space="preserve">El extractor congelado se estancó cerca del 91 % de exactitud en validación y el ajuste fino la llevó al 93.8 %; las 15 épocas de esa fase corrieron completas sin que se activara la parada temprana, así que con más presupuesto probablemente ganaría algo más. En prueba obtuvo 92.73 % de exactitud (IC 95 % [92.18, 93.24]), F1 macro de 0.9275 y </w:t>
+        <w:t xml:space="preserve">Con el </w:t>
       </w:r>
       <w:r>
         <w:rPr>
           <w:i/>
         </w:rPr>
+        <w:t xml:space="preserve">backbone</w:t>
+      </w:r>
+      <w:r>
+        <w:t xml:space="preserve"> congelado, la exactitud de validación se estancó cerca del 91 %</w:t>
+      </w:r>
+      <w:r>
+        <w:t xml:space="preserve"> y el ajuste fino la llevó al 93.8 %; las 15 épocas de esa fase corrieron completas sin que se activara la parada temprana, así que con más presupuesto probablemente ganaría algo más. En prueba obtuvo 92.73 % de exactitud (IC 95 % [92.18, 93.24]), F1 macro de 0.9275 y </w:t>
+      </w:r>
+      <w:r>
+        <w:rPr>
+          <w:i/>
+        </w:rPr>
         <w:t xml:space="preserve">log-loss</w:t>
       </w:r>
       <w:r>
@@ -9163,7 +9742,7 @@
         <w:pStyle w:val="Text"/>
       </w:pPr>
       <w:r>
-        <w:t xml:space="preserve">Como los intervalos por separado son conservadores, las redes se compararon además de forma pareada sobre las mismas 10 000 imágenes: con el intervalo </w:t>
+        <w:t xml:space="preserve">Como los intervalos por separado son conservadores, las redes se compararon además de forma pareada sobre las mismas 10,000 imágenes: con el intervalo </w:t>
       </w:r>
       <w:r>
         <w:rPr>
@@ -9178,13 +9757,13 @@
         <w:fldChar w:fldCharType="begin"/>
       </w:r>
       <w:r>
-        <w:instrText xml:space="preserve"> REF _RefTablaVI \h </w:instrText>
+        <w:instrText xml:space="preserve"> REF _RefTablaVII \h </w:instrText>
       </w:r>
       <w:r>
         <w:fldChar w:fldCharType="separate"/>
       </w:r>
       <w:r>
-        <w:t xml:space="preserve">Tabla VI</w:t>
+        <w:t xml:space="preserve">Tabla VII</w:t>
       </w:r>
       <w:r>
         <w:fldChar w:fldCharType="end"/>
@@ -9218,13 +9797,13 @@
         <w:fldChar w:fldCharType="begin"/>
       </w:r>
       <w:r>
-        <w:instrText xml:space="preserve"> REF _RefTablaVII \h </w:instrText>
+        <w:instrText xml:space="preserve"> REF _RefTablaVIII \h </w:instrText>
       </w:r>
       <w:r>
         <w:fldChar w:fldCharType="separate"/>
       </w:r>
       <w:r>
-        <w:t xml:space="preserve">Tabla VII</w:t>
+        <w:t xml:space="preserve">Tabla VIII</w:t>
       </w:r>
       <w:r>
         <w:fldChar w:fldCharType="end"/>
@@ -9268,7 +9847,7 @@
     <w:p>
       <w:pPr>
         <w:keepNext/>
-        <w:spacing w:before="120"/>
+        <w:spacing w:before="240"/>
         <w:jc w:val="center"/>
       </w:pPr>
       <w:r>
@@ -9315,7 +9894,7 @@
     <w:p>
       <w:pPr>
         <w:pStyle w:val="FigureCaption"/>
-        <w:spacing w:before="60" w:after="160"/>
+        <w:spacing w:before="60" w:after="280"/>
       </w:pPr>
       <w:bookmarkStart w:id="120" w:name="_RefFig15"/>
       <w:r>
@@ -9339,11 +9918,11 @@
       <w:pPr>
         <w:pStyle w:val="TableTitle"/>
         <w:keepNext/>
-        <w:spacing w:before="160"/>
-      </w:pPr>
-      <w:bookmarkStart w:id="121" w:name="_RefTablaVI"/>
-      <w:r>
-        <w:t>Tabla VI</w:t>
+        <w:spacing w:before="280"/>
+      </w:pPr>
+      <w:bookmarkStart w:id="121" w:name="_RefTablaVII"/>
+      <w:r>
+        <w:t>Tabla VII</w:t>
       </w:r>
       <w:bookmarkEnd w:id="121"/>
     </w:p>
@@ -9690,7 +10269,7 @@
               <w:rPr>
                 <w:sz w:val="15"/>
               </w:rPr>
-              <w:t xml:space="preserve">2 687</w:t>
+              <w:t xml:space="preserve">2,687</w:t>
             </w:r>
           </w:p>
         </w:tc>
@@ -9714,7 +10293,7 @@
               <w:rPr>
                 <w:sz w:val="15"/>
               </w:rPr>
-              <w:t xml:space="preserve">7 084 554</w:t>
+              <w:t xml:space="preserve">7,084,554</w:t>
             </w:r>
           </w:p>
         </w:tc>
@@ -9922,7 +10501,7 @@
               <w:rPr>
                 <w:sz w:val="15"/>
               </w:rPr>
-              <w:t xml:space="preserve">823 098</w:t>
+              <w:t xml:space="preserve">823,098</w:t>
             </w:r>
           </w:p>
         </w:tc>
@@ -10115,7 +10694,7 @@
               <w:rPr>
                 <w:sz w:val="15"/>
               </w:rPr>
-              <w:t xml:space="preserve">1 207 690</w:t>
+              <w:t xml:space="preserve">1,207,690</w:t>
             </w:r>
           </w:p>
         </w:tc>
@@ -10320,7 +10899,7 @@
               <w:rPr>
                 <w:sz w:val="15"/>
               </w:rPr>
-              <w:t xml:space="preserve">28 522</w:t>
+              <w:t xml:space="preserve">28,522</w:t>
             </w:r>
           </w:p>
         </w:tc>
@@ -10449,7 +11028,7 @@
     <w:p>
       <w:pPr>
         <w:pStyle w:val="FigureCaption"/>
-        <w:spacing w:before="40" w:after="160"/>
+        <w:spacing w:before="40" w:after="280"/>
         <w:rPr>
           <w:sz w:val="14"/>
         </w:rPr>
@@ -10471,7 +11050,7 @@
         <w:rPr>
           <w:sz w:val="14"/>
         </w:rPr>
-        <w:t xml:space="preserve"> pareado (1 000 remuestreos). p: prueba exacta de McNemar sobre las imágenes en que solo uno de los dos modelos acierta. Tiempo y entrenables como en la </w:t>
+        <w:t xml:space="preserve"> pareado (1,000 remuestreos). p: prueba exacta de McNemar sobre las imágenes en que solo uno de los dos modelos acierta. Tiempo y entrenables como en la </w:t>
       </w:r>
       <w:r>
         <w:rPr>
@@ -10483,7 +11062,7 @@
         <w:rPr>
           <w:sz w:val="14"/>
         </w:rPr>
-        <w:instrText xml:space="preserve"> REF _RefTablaV \h </w:instrText>
+        <w:instrText xml:space="preserve"> REF _RefTablaVI \h </w:instrText>
       </w:r>
       <w:r>
         <w:rPr>
@@ -10495,7 +11074,7 @@
         <w:rPr>
           <w:sz w:val="14"/>
         </w:rPr>
-        <w:t xml:space="preserve">Tabla V</w:t>
+        <w:t xml:space="preserve">Tabla VI</w:t>
       </w:r>
       <w:r>
         <w:rPr>
@@ -10514,11 +11093,11 @@
       <w:pPr>
         <w:pStyle w:val="TableTitle"/>
         <w:keepNext/>
-        <w:spacing w:before="160"/>
-      </w:pPr>
-      <w:bookmarkStart w:id="122" w:name="_RefTablaVII"/>
-      <w:r>
-        <w:t>Tabla VII</w:t>
+        <w:spacing w:before="280"/>
+      </w:pPr>
+      <w:bookmarkStart w:id="122" w:name="_RefTablaVIII"/>
+      <w:r>
+        <w:t>Tabla VIII</w:t>
       </w:r>
       <w:bookmarkEnd w:id="122"/>
     </w:p>
@@ -10678,7 +11257,7 @@
               <w:rPr>
                 <w:sz w:val="16"/>
               </w:rPr>
-              <w:t>Trabaja en la resolución nativa; 28 714 parámetros y 79 s de entrenamiento; control total del diseño; fácil de desplegar en dispositivos con poca memoria o energía.</w:t>
+              <w:t>Trabaja en la resolución nativa; 28,714 parámetros y 79 s de entrenamiento; control total del diseño; fácil de desplegar en dispositivos con poca memoria o energía.</w:t>
             </w:r>
           </w:p>
         </w:tc>
@@ -10809,7 +11388,32 @@
               <w:rPr>
                 <w:sz w:val="16"/>
               </w:rPr>
-              <w:t>Solo 0.76 puntos por debajo de VGG16 con 6.5 veces menos parámetros y 8 veces menos tiempo; la mejor fase con el extractor congelado; diseñada para dispositivos móviles.</w:t>
+              <w:t xml:space="preserve">Solo 0.76 puntos por debajo de VGG16 con 6.5 veces menos parámetros y 8 veces menos tiempo; </w:t>
+            </w:r>
+            <w:r>
+              <w:rPr>
+                <w:sz w:val="16"/>
+              </w:rPr>
+              <w:t xml:space="preserve">la mejor fase con el </w:t>
+            </w:r>
+            <w:r>
+              <w:rPr>
+                <w:sz w:val="16"/>
+                <w:i/>
+              </w:rPr>
+              <w:t xml:space="preserve">backbone</w:t>
+            </w:r>
+            <w:r>
+              <w:rPr>
+                <w:sz w:val="16"/>
+              </w:rPr>
+              <w:t xml:space="preserve"> congelado</w:t>
+            </w:r>
+            <w:r>
+              <w:rPr>
+                <w:sz w:val="16"/>
+              </w:rPr>
+              <w:t xml:space="preserve">; diseñada para dispositivos móviles.</w:t>
             </w:r>
           </w:p>
         </w:tc>
@@ -10907,7 +11511,7 @@
     </w:tbl>
     <w:p>
       <w:pPr>
-        <w:spacing w:after="80"/>
+        <w:spacing w:after="80" w:before="200"/>
         <w:sectPr>
           <w:type w:val="continuous"/>
           <w:pgSz w:w="12240" w:h="15840" w:code="1"/>
@@ -10958,7 +11562,7 @@
         <w:t>Más capacidad no es mejor por defecto.</w:t>
       </w:r>
       <w:r>
-        <w:t xml:space="preserve"> El modelo ganador del Punto 1 tiene 2 232 parámetros, y en el Punto 2 duplicar los filtros no mejoró la CNN. Con datos limitados o señales regulares, la capacidad sobrante se convierte en sobreajuste que la parada temprana delata en pocas épocas.</w:t>
+        <w:t xml:space="preserve"> El modelo ganador del Punto 1 tiene 2,232 parámetros, y en el Punto 2 duplicar los filtros no mejoró la CNN. Con datos limitados o señales regulares, la capacidad sobrante se convierte en sobreajuste que la parada temprana delata en pocas épocas.</w:t>
       </w:r>
     </w:p>
     <w:p>
@@ -11020,37 +11624,10 @@
         <w:rPr>
           <w:i/>
         </w:rPr>
-        <w:t>La reproducibilidad es parte del diseño experimental.</w:t>
-      </w:r>
-      <w:r>
-        <w:t xml:space="preserve"> Registrar cada corrida, fijar semillas, guardar las predicciones y separar el entrenamiento de la generación de figuras permitió rehacer tablas y gráficas sin volver a entrenar. Dos detalles técnicos lo confirmaron: la precisión mixta prevista para el Punto 2 no se aplicó —Keras reinicia la política global de tipos en cada </w:t>
-      </w:r>
-      <w:r>
-        <w:rPr>
-          <w:i/>
-        </w:rPr>
-        <w:t>clear_session</w:t>
-      </w:r>
-      <w:r>
-        <w:t xml:space="preserve">, y la corrida terminó en float32—, y una capa </w:t>
-      </w:r>
-      <w:r>
-        <w:rPr>
-          <w:i/>
-        </w:rPr>
-        <w:t>Lambda</w:t>
-      </w:r>
-      <w:r>
-        <w:t xml:space="preserve"> impedía recargar los modelos en modo seguro, por lo que se reemplazó por capas </w:t>
-      </w:r>
-      <w:r>
-        <w:rPr>
-          <w:i/>
-        </w:rPr>
-        <w:t>Rescaling</w:t>
-      </w:r>
-      <w:r>
-        <w:t xml:space="preserve"> equivalentes.</w:t>
+        <w:t xml:space="preserve">La reproducibilidad es parte del diseño experimental.</w:t>
+      </w:r>
+      <w:r>
+        <w:t xml:space="preserve"> Registrar cada corrida, fijar semillas, guardar las predicciones y separar el entrenamiento de la generación de figuras permitió rehacer tablas y gráficas sin volver a entrenar.</w:t>
       </w:r>
     </w:p>
     <w:p>
@@ -11794,30 +12371,6 @@
     <w:p>
       <w:r>
         <w:continuationSeparator/>
-      </w:r>
-    </w:p>
-  </w:footnote>
-  <w:footnote w:id="1">
-    <w:p>
-      <w:pPr>
-        <w:pStyle w:val="FootnoteText"/>
-      </w:pPr>
-      <w:r>
-        <w:t>T</w:t>
-      </w:r>
-      <w:r>
-        <w:t>rabajo presentado el 26 de septiembre de 2026 como entrega del Taller 1 del curso Aprendizaje Profundo (periodo 202630) de la Maestría en Inteligencia Artificial de la Pontificia Universidad Javeriana. Profesor: Andrés Moreno.</w:t>
-      </w:r>
-    </w:p>
-    <w:p>
-      <w:pPr>
-        <w:pStyle w:val="FootnoteText"/>
-        <w:rPr>
-          <w:color w:val="FF0000"/>
-        </w:rPr>
-      </w:pPr>
-      <w:r>
-        <w:t>D. S. Velasco Munar desarrolló el Punto 1 y A. Barraza el Punto 2; la integración, la evaluación final y la redacción del informe fueron conjuntas. Ambos son estudiantes de la Maestría en Inteligencia Artificial de la Pontificia Universidad Javeriana.</w:t>
       </w:r>
     </w:p>
   </w:footnote>

</xml_diff>